<commit_message>
adiçao de novos gráficos e summarie
</commit_message>
<xml_diff>
--- a/docs/TCC/doc_tcc1.docx
+++ b/docs/TCC/doc_tcc1.docx
@@ -1071,35 +1071,30 @@
     <w:p>
       <w:pPr>
         <w:spacing w:line="360" w:lineRule="auto"/>
-        <w:ind w:firstLine="709"/>
+        <w:ind w:firstLine="720"/>
         <w:jc w:val="both"/>
       </w:pPr>
       <w:r>
-        <w:t xml:space="preserve">Essa dissertação tem como objetivo auditar o desempenho dos modelos de Inteligência Artificial e Aprendizado de Máquina da plataforma Spotify, por meio da utilização de personas sintéticas, a fim de avaliar o impacto das lógicas de curadoria automatizada na diversidade das sugestões e </w:t>
-      </w:r>
-      <w:proofErr w:type="gramStart"/>
-      <w:r>
-        <w:t>na potencial</w:t>
-      </w:r>
-      <w:proofErr w:type="gramEnd"/>
-      <w:r>
-        <w:t xml:space="preserve"> formação de bolhas de filtro (</w:t>
-      </w:r>
-      <w:proofErr w:type="spellStart"/>
+        <w:t xml:space="preserve">Esta dissertação tem como objetivo geral auditar o comportamento dos sistemas de recomendação algorítmica da plataforma Spotify, utilizando a metodologia de </w:t>
+      </w:r>
       <w:r>
         <w:rPr>
           <w:i/>
           <w:iCs/>
         </w:rPr>
-        <w:t>filter</w:t>
-      </w:r>
-      <w:proofErr w:type="spellEnd"/>
+        <w:t xml:space="preserve">Black-Box </w:t>
+      </w:r>
+      <w:proofErr w:type="spellStart"/>
       <w:r>
         <w:rPr>
           <w:i/>
           <w:iCs/>
         </w:rPr>
-        <w:t xml:space="preserve"> </w:t>
+        <w:t>Auditing</w:t>
+      </w:r>
+      <w:proofErr w:type="spellEnd"/>
+      <w:r>
+        <w:t xml:space="preserve"> com personas sintéticas, a fim de mensurar quantitativamente o impacto das lógicas de curadoria automatizada na diversidade cultural, na concentração de popularidade e na formação de bolhas de filtro (</w:t>
       </w:r>
       <w:proofErr w:type="spellStart"/>
       <w:r>
@@ -1107,6 +1102,22 @@
           <w:i/>
           <w:iCs/>
         </w:rPr>
+        <w:t>filter</w:t>
+      </w:r>
+      <w:proofErr w:type="spellEnd"/>
+      <w:r>
+        <w:rPr>
+          <w:i/>
+          <w:iCs/>
+        </w:rPr>
+        <w:t xml:space="preserve"> </w:t>
+      </w:r>
+      <w:proofErr w:type="spellStart"/>
+      <w:r>
+        <w:rPr>
+          <w:i/>
+          <w:iCs/>
+        </w:rPr>
         <w:t>bubbles</w:t>
       </w:r>
       <w:proofErr w:type="spellEnd"/>
@@ -1117,8 +1128,11 @@
     <w:p>
       <w:pPr>
         <w:spacing w:line="360" w:lineRule="auto"/>
-        <w:ind w:firstLine="709"/>
         <w:jc w:val="both"/>
+        <w:rPr>
+          <w:b/>
+          <w:bCs/>
+        </w:rPr>
       </w:pPr>
     </w:p>
     <w:p>
@@ -1153,67 +1167,56 @@
         <w:pStyle w:val="PargrafodaLista"/>
         <w:numPr>
           <w:ilvl w:val="0"/>
-          <w:numId w:val="9"/>
+          <w:numId w:val="23"/>
         </w:numPr>
         <w:spacing w:line="360" w:lineRule="auto"/>
         <w:jc w:val="both"/>
-        <w:rPr>
-          <w:rFonts w:ascii="Times New Roman" w:hAnsi="Times New Roman" w:cs="Times New Roman"/>
-        </w:rPr>
-      </w:pPr>
-      <w:r>
-        <w:rPr>
-          <w:rFonts w:ascii="Times New Roman" w:hAnsi="Times New Roman" w:cs="Times New Roman"/>
-        </w:rPr>
-        <w:t>Identificar</w:t>
-      </w:r>
-      <w:r>
-        <w:rPr>
-          <w:rFonts w:ascii="Times New Roman" w:hAnsi="Times New Roman" w:cs="Times New Roman"/>
-        </w:rPr>
-        <w:t xml:space="preserve"> arquétipos de consumo musical contrastantes (</w:t>
+      </w:pPr>
+      <w:r>
+        <w:rPr>
+          <w:b/>
+          <w:bCs/>
+        </w:rPr>
+        <w:t>Modelar e Implementar</w:t>
+      </w:r>
+      <w:r>
+        <w:t xml:space="preserve"> quatro arquétipos de consumo musical contrastantes (</w:t>
       </w:r>
       <w:proofErr w:type="spellStart"/>
       <w:r>
-        <w:rPr>
-          <w:rFonts w:ascii="Times New Roman" w:hAnsi="Times New Roman" w:cs="Times New Roman"/>
-        </w:rPr>
         <w:t>Mainstream</w:t>
       </w:r>
       <w:proofErr w:type="spellEnd"/>
       <w:r>
-        <w:rPr>
-          <w:rFonts w:ascii="Times New Roman" w:hAnsi="Times New Roman" w:cs="Times New Roman"/>
-        </w:rPr>
-        <w:t xml:space="preserve">, </w:t>
+        <w:t xml:space="preserve">, Funcional, Nostálgico e </w:t>
+      </w:r>
+      <w:r>
+        <w:rPr>
+          <w:i/>
+          <w:iCs/>
+        </w:rPr>
+        <w:t>Underground</w:t>
+      </w:r>
+      <w:r>
+        <w:t xml:space="preserve">), traduzindo perfis psicográficos em </w:t>
+      </w:r>
+      <w:r>
+        <w:rPr>
+          <w:i/>
+          <w:iCs/>
+        </w:rPr>
+        <w:t>scripts</w:t>
+      </w:r>
+      <w:r>
+        <w:t xml:space="preserve"> de automação para a geração de </w:t>
       </w:r>
       <w:proofErr w:type="spellStart"/>
       <w:r>
-        <w:rPr>
-          <w:rFonts w:ascii="Times New Roman" w:hAnsi="Times New Roman" w:cs="Times New Roman"/>
-        </w:rPr>
-        <w:t>Lo-fi</w:t>
+        <w:t>datasets</w:t>
       </w:r>
       <w:proofErr w:type="spellEnd"/>
       <w:r>
-        <w:rPr>
-          <w:rFonts w:ascii="Times New Roman" w:hAnsi="Times New Roman" w:cs="Times New Roman"/>
-        </w:rPr>
-        <w:t xml:space="preserve">, </w:t>
-      </w:r>
-      <w:proofErr w:type="gramStart"/>
-      <w:r>
-        <w:rPr>
-          <w:rFonts w:ascii="Times New Roman" w:hAnsi="Times New Roman" w:cs="Times New Roman"/>
-        </w:rPr>
-        <w:t>Nostálgico</w:t>
-      </w:r>
-      <w:proofErr w:type="gramEnd"/>
-      <w:r>
-        <w:rPr>
-          <w:rFonts w:ascii="Times New Roman" w:hAnsi="Times New Roman" w:cs="Times New Roman"/>
-        </w:rPr>
-        <w:t xml:space="preserve"> e Nicho Experimental) para a fundamentação das quatro personas sintéticas do estudo.</w:t>
+        <w:t xml:space="preserve"> controlados.</w:t>
       </w:r>
     </w:p>
     <w:p>
@@ -1221,43 +1224,48 @@
         <w:pStyle w:val="PargrafodaLista"/>
         <w:numPr>
           <w:ilvl w:val="0"/>
-          <w:numId w:val="9"/>
+          <w:numId w:val="23"/>
         </w:numPr>
         <w:spacing w:line="360" w:lineRule="auto"/>
         <w:jc w:val="both"/>
-        <w:rPr>
-          <w:rFonts w:ascii="Times New Roman" w:hAnsi="Times New Roman" w:cs="Times New Roman"/>
-        </w:rPr>
-      </w:pPr>
-      <w:proofErr w:type="gramStart"/>
-      <w:r>
-        <w:rPr>
-          <w:rFonts w:ascii="Times New Roman" w:hAnsi="Times New Roman" w:cs="Times New Roman"/>
-        </w:rPr>
-        <w:t>Levantar</w:t>
-      </w:r>
-      <w:proofErr w:type="gramEnd"/>
-      <w:r>
-        <w:rPr>
-          <w:rFonts w:ascii="Times New Roman" w:hAnsi="Times New Roman" w:cs="Times New Roman"/>
-        </w:rPr>
-        <w:t xml:space="preserve">, via API do Spotify, os metadados técnicos de artistas e faixas (índices de popularidade, gêneros e datas de lançamento) necessários para a construção dos </w:t>
-      </w:r>
-      <w:proofErr w:type="spellStart"/>
-      <w:r>
-        <w:rPr>
-          <w:rFonts w:ascii="Times New Roman" w:hAnsi="Times New Roman" w:cs="Times New Roman"/>
+      </w:pPr>
+      <w:r>
+        <w:rPr>
+          <w:b/>
+          <w:bCs/>
+        </w:rPr>
+        <w:t>Validar estatisticamente</w:t>
+      </w:r>
+      <w:r>
+        <w:t xml:space="preserve"> a heterogeneidade e o isolamento dos perfis iniciais (</w:t>
+      </w:r>
+      <w:r>
+        <w:rPr>
           <w:i/>
           <w:iCs/>
         </w:rPr>
-        <w:t>datasets</w:t>
+        <w:t>inputs</w:t>
+      </w:r>
+      <w:r>
+        <w:t xml:space="preserve">), utilizando métricas de similaridade de conjuntos (Índice de </w:t>
+      </w:r>
+      <w:proofErr w:type="spellStart"/>
+      <w:r>
+        <w:t>Jaccard</w:t>
       </w:r>
       <w:proofErr w:type="spellEnd"/>
       <w:r>
-        <w:rPr>
-          <w:rFonts w:ascii="Times New Roman" w:hAnsi="Times New Roman" w:cs="Times New Roman"/>
-        </w:rPr>
-        <w:t xml:space="preserve"> de entrada de cada perfil.</w:t>
+        <w:t>) e dispersão de popularidade para estabelecer uma linha de base neutra (</w:t>
+      </w:r>
+      <w:r>
+        <w:rPr>
+          <w:i/>
+          <w:iCs/>
+        </w:rPr>
+        <w:t>cold start</w:t>
+      </w:r>
+      <w:r>
+        <w:t>).</w:t>
       </w:r>
     </w:p>
     <w:p>
@@ -1265,57 +1273,20 @@
         <w:pStyle w:val="PargrafodaLista"/>
         <w:numPr>
           <w:ilvl w:val="0"/>
-          <w:numId w:val="9"/>
+          <w:numId w:val="23"/>
         </w:numPr>
         <w:spacing w:line="360" w:lineRule="auto"/>
         <w:jc w:val="both"/>
-        <w:rPr>
-          <w:rFonts w:ascii="Times New Roman" w:hAnsi="Times New Roman" w:cs="Times New Roman"/>
-        </w:rPr>
-      </w:pPr>
-      <w:r>
-        <w:rPr>
-          <w:rFonts w:ascii="Times New Roman" w:hAnsi="Times New Roman" w:cs="Times New Roman"/>
-        </w:rPr>
-        <w:t>Caracterizar o comportamento dos modelos de Aprendizado Profundo (</w:t>
-      </w:r>
-      <w:proofErr w:type="spellStart"/>
-      <w:r>
-        <w:rPr>
-          <w:rFonts w:ascii="Times New Roman" w:hAnsi="Times New Roman" w:cs="Times New Roman"/>
-          <w:i/>
-          <w:iCs/>
-        </w:rPr>
-        <w:t>Deep</w:t>
-      </w:r>
-      <w:proofErr w:type="spellEnd"/>
-      <w:r>
-        <w:rPr>
-          <w:rFonts w:ascii="Times New Roman" w:hAnsi="Times New Roman" w:cs="Times New Roman"/>
-          <w:i/>
-          <w:iCs/>
-        </w:rPr>
-        <w:t xml:space="preserve"> Learning</w:t>
-      </w:r>
-      <w:r>
-        <w:rPr>
-          <w:rFonts w:ascii="Times New Roman" w:hAnsi="Times New Roman" w:cs="Times New Roman"/>
-        </w:rPr>
-        <w:t xml:space="preserve">) da plataforma ao processar o histórico de escuta, mapeando a composição das </w:t>
-      </w:r>
-      <w:proofErr w:type="gramStart"/>
-      <w:r>
-        <w:rPr>
-          <w:rFonts w:ascii="Times New Roman" w:hAnsi="Times New Roman" w:cs="Times New Roman"/>
-        </w:rPr>
-        <w:t>playlists</w:t>
-      </w:r>
-      <w:proofErr w:type="gramEnd"/>
-      <w:r>
-        <w:rPr>
-          <w:rFonts w:ascii="Times New Roman" w:hAnsi="Times New Roman" w:cs="Times New Roman"/>
-        </w:rPr>
-        <w:t xml:space="preserve"> e recomendações geradas (como "Descobertas da Semana") para cada persona.</w:t>
+      </w:pPr>
+      <w:r>
+        <w:rPr>
+          <w:b/>
+          <w:bCs/>
+        </w:rPr>
+        <w:t>Coletar e Processar</w:t>
+      </w:r>
+      <w:r>
+        <w:t>, via API do Spotify, os metadados técnicos e socioeconômicos das recomendações geradas (como "Descobertas da Semana"), estruturando um corpus de dados comparável entre os diferentes perfis.</w:t>
       </w:r>
     </w:p>
     <w:p>
@@ -1323,53 +1294,20 @@
         <w:pStyle w:val="PargrafodaLista"/>
         <w:numPr>
           <w:ilvl w:val="0"/>
-          <w:numId w:val="9"/>
+          <w:numId w:val="23"/>
         </w:numPr>
         <w:spacing w:line="360" w:lineRule="auto"/>
         <w:jc w:val="both"/>
-        <w:rPr>
-          <w:rFonts w:ascii="Times New Roman" w:hAnsi="Times New Roman" w:cs="Times New Roman"/>
-        </w:rPr>
-      </w:pPr>
-      <w:r>
-        <w:rPr>
-          <w:rFonts w:ascii="Times New Roman" w:hAnsi="Times New Roman" w:cs="Times New Roman"/>
-        </w:rPr>
-        <w:t>Descrever</w:t>
-      </w:r>
-      <w:r>
-        <w:rPr>
-          <w:rFonts w:ascii="Times New Roman" w:hAnsi="Times New Roman" w:cs="Times New Roman"/>
-        </w:rPr>
-        <w:t xml:space="preserve"> os padrões de distanciamento ou aproximação entre o perfil de gosto programado (</w:t>
-      </w:r>
-      <w:r>
-        <w:rPr>
-          <w:rFonts w:ascii="Times New Roman" w:hAnsi="Times New Roman" w:cs="Times New Roman"/>
-          <w:i/>
-          <w:iCs/>
-        </w:rPr>
-        <w:t>input</w:t>
-      </w:r>
-      <w:r>
-        <w:rPr>
-          <w:rFonts w:ascii="Times New Roman" w:hAnsi="Times New Roman" w:cs="Times New Roman"/>
-        </w:rPr>
-        <w:t>) e a sugestão algorítmica recebida (</w:t>
-      </w:r>
-      <w:r>
-        <w:rPr>
-          <w:rFonts w:ascii="Times New Roman" w:hAnsi="Times New Roman" w:cs="Times New Roman"/>
-          <w:i/>
-          <w:iCs/>
-        </w:rPr>
-        <w:t>output</w:t>
-      </w:r>
-      <w:r>
-        <w:rPr>
-          <w:rFonts w:ascii="Times New Roman" w:hAnsi="Times New Roman" w:cs="Times New Roman"/>
-        </w:rPr>
-        <w:t>), traçando o perfil de precisão do sistema para diferentes nichos.</w:t>
+      </w:pPr>
+      <w:r>
+        <w:rPr>
+          <w:b/>
+          <w:bCs/>
+        </w:rPr>
+        <w:t>Mensurar a diversidade e a concentração</w:t>
+      </w:r>
+      <w:r>
+        <w:t xml:space="preserve"> das sugestões algorítmicas, aplicando indicadores matemáticos como a Entropia de Shannon (variedade informacional), o Coeficiente de Gini (desigualdade de distribuição) e o Índice HHI (concentração de mercado/gênero).</w:t>
       </w:r>
     </w:p>
     <w:p>
@@ -1377,49 +1315,28 @@
         <w:pStyle w:val="PargrafodaLista"/>
         <w:numPr>
           <w:ilvl w:val="0"/>
-          <w:numId w:val="9"/>
+          <w:numId w:val="23"/>
         </w:numPr>
         <w:spacing w:line="360" w:lineRule="auto"/>
         <w:jc w:val="both"/>
-        <w:rPr>
-          <w:rFonts w:ascii="Times New Roman" w:hAnsi="Times New Roman" w:cs="Times New Roman"/>
-        </w:rPr>
-      </w:pPr>
-      <w:r>
-        <w:rPr>
-          <w:rFonts w:ascii="Times New Roman" w:hAnsi="Times New Roman" w:cs="Times New Roman"/>
-        </w:rPr>
-        <w:t>Analisar</w:t>
-      </w:r>
-      <w:r>
-        <w:rPr>
-          <w:rFonts w:ascii="Times New Roman" w:hAnsi="Times New Roman" w:cs="Times New Roman"/>
-        </w:rPr>
-        <w:t xml:space="preserve"> a ocorrência de vieses de popularidade (</w:t>
+      </w:pPr>
+      <w:r>
+        <w:rPr>
+          <w:b/>
+          <w:bCs/>
+        </w:rPr>
+        <w:t>Analisar o viés de popularidade e econômico</w:t>
+      </w:r>
+      <w:r>
+        <w:t>, verificando se o sistema promove a "gentrificação" de gostos de nicho ao recomendar desproporcionalmente artistas "</w:t>
       </w:r>
       <w:proofErr w:type="spellStart"/>
       <w:r>
-        <w:rPr>
-          <w:rFonts w:ascii="Times New Roman" w:hAnsi="Times New Roman" w:cs="Times New Roman"/>
-          <w:i/>
-          <w:iCs/>
-        </w:rPr>
-        <w:t>popularity</w:t>
+        <w:t>Superstars</w:t>
       </w:r>
       <w:proofErr w:type="spellEnd"/>
       <w:r>
-        <w:rPr>
-          <w:rFonts w:ascii="Times New Roman" w:hAnsi="Times New Roman" w:cs="Times New Roman"/>
-          <w:i/>
-          <w:iCs/>
-        </w:rPr>
-        <w:t xml:space="preserve"> bias</w:t>
-      </w:r>
-      <w:r>
-        <w:rPr>
-          <w:rFonts w:ascii="Times New Roman" w:hAnsi="Times New Roman" w:cs="Times New Roman"/>
-        </w:rPr>
-        <w:t>) e de recência no direcionamento do consumo das diferentes personas, verificando se o sistema privilegia conteúdos massivos em detrimento de nichos.</w:t>
+        <w:t>" (Cauda Curta) em detrimento de artistas independentes (Cauda Longa).</w:t>
       </w:r>
     </w:p>
     <w:p>
@@ -1427,19 +1344,20 @@
         <w:pStyle w:val="PargrafodaLista"/>
         <w:numPr>
           <w:ilvl w:val="0"/>
-          <w:numId w:val="9"/>
+          <w:numId w:val="23"/>
         </w:numPr>
         <w:spacing w:line="360" w:lineRule="auto"/>
         <w:jc w:val="both"/>
-        <w:rPr>
-          <w:rFonts w:ascii="Times New Roman" w:hAnsi="Times New Roman" w:cs="Times New Roman"/>
-        </w:rPr>
-      </w:pPr>
-      <w:r>
-        <w:rPr>
-          <w:rFonts w:ascii="Times New Roman" w:hAnsi="Times New Roman" w:cs="Times New Roman"/>
-        </w:rPr>
-        <w:t>Avaliar a eficácia das funcionalidades de descoberta da plataforma (serendipidade) frente ao risco de homogeneização do gosto musical, confrontando a promessa de diversidade da plataforma com os resultados empíricos observados.</w:t>
+      </w:pPr>
+      <w:r>
+        <w:rPr>
+          <w:b/>
+          <w:bCs/>
+        </w:rPr>
+        <w:t>Avaliar o fenômeno de Colapso de Contexto</w:t>
+      </w:r>
+      <w:r>
+        <w:t>, observando se, ao longo do tempo, as recomendações para perfis distintos convergem para um padrão homogêneo, reduzindo a distância vetorial entre as personas.</w:t>
       </w:r>
     </w:p>
     <w:p>
@@ -1447,19 +1365,21 @@
         <w:pStyle w:val="PargrafodaLista"/>
         <w:numPr>
           <w:ilvl w:val="0"/>
-          <w:numId w:val="9"/>
+          <w:numId w:val="23"/>
         </w:numPr>
         <w:spacing w:line="360" w:lineRule="auto"/>
         <w:jc w:val="both"/>
-        <w:rPr>
-          <w:rFonts w:ascii="Times New Roman" w:hAnsi="Times New Roman" w:cs="Times New Roman"/>
-        </w:rPr>
-      </w:pPr>
-      <w:r>
-        <w:rPr>
-          <w:rFonts w:ascii="Times New Roman" w:hAnsi="Times New Roman" w:cs="Times New Roman"/>
-        </w:rPr>
-        <w:t>Verificar em que medida o sistema de recomendação atua como um reforçador de bolhas informacionais ou como um facilitador de novas descobertas para perfis de baixa popularidade estatística.</w:t>
+      </w:pPr>
+      <w:r>
+        <w:rPr>
+          <w:b/>
+          <w:bCs/>
+        </w:rPr>
+        <w:lastRenderedPageBreak/>
+        <w:t>Confrontar a promessa de serendipidade</w:t>
+      </w:r>
+      <w:r>
+        <w:t xml:space="preserve"> (descoberta do novo) com a realidade empírica, determinando se o algoritmo atua como um facilitador de exploração cultural ou como um reforçador de bolhas informacionais pré-existentes.</w:t>
       </w:r>
     </w:p>
     <w:p>
@@ -1493,7 +1413,6 @@
           <w:sz w:val="28"/>
           <w:szCs w:val="28"/>
         </w:rPr>
-        <w:lastRenderedPageBreak/>
         <w:t xml:space="preserve">3 - REVISÃO TEÓRICA                  </w:t>
       </w:r>
     </w:p>
@@ -2073,6 +1992,7 @@
                 <w:sz w:val="22"/>
                 <w:szCs w:val="22"/>
               </w:rPr>
+              <w:lastRenderedPageBreak/>
               <w:t>(CASTRO et al., 2020)</w:t>
             </w:r>
           </w:p>
@@ -2191,7 +2111,6 @@
                 <w:sz w:val="22"/>
                 <w:szCs w:val="22"/>
               </w:rPr>
-              <w:lastRenderedPageBreak/>
               <w:t>(BRAVO FUENTES, 2023)</w:t>
             </w:r>
           </w:p>
@@ -2452,27 +2371,7 @@
                 <w:sz w:val="22"/>
                 <w:szCs w:val="22"/>
               </w:rPr>
-              <w:t xml:space="preserve">, demonstrando como a IA </w:t>
-            </w:r>
-            <w:proofErr w:type="gramStart"/>
-            <w:r>
-              <w:rPr>
-                <w:rFonts w:ascii="Calibri" w:hAnsi="Calibri" w:cs="Calibri"/>
-                <w:color w:val="000000"/>
-                <w:sz w:val="22"/>
-                <w:szCs w:val="22"/>
-              </w:rPr>
-              <w:t>está</w:t>
-            </w:r>
-            <w:proofErr w:type="gramEnd"/>
-            <w:r>
-              <w:rPr>
-                <w:rFonts w:ascii="Calibri" w:hAnsi="Calibri" w:cs="Calibri"/>
-                <w:color w:val="000000"/>
-                <w:sz w:val="22"/>
-                <w:szCs w:val="22"/>
-              </w:rPr>
-              <w:t xml:space="preserve"> reformulando práticas de criação e consumo musical, transformando o papel do artista e do ouvinte na era digital.</w:t>
+              <w:t>, demonstrando como a IA está reformulando práticas de criação e consumo musical, transformando o papel do artista e do ouvinte na era digital.</w:t>
             </w:r>
           </w:p>
         </w:tc>
@@ -2704,6 +2603,7 @@
                 <w:sz w:val="22"/>
                 <w:szCs w:val="22"/>
               </w:rPr>
+              <w:lastRenderedPageBreak/>
               <w:t>(SILVA, 2023)</w:t>
             </w:r>
           </w:p>
@@ -2834,7 +2734,6 @@
           <w:sz w:val="28"/>
           <w:szCs w:val="28"/>
         </w:rPr>
-        <w:lastRenderedPageBreak/>
         <w:t>4</w:t>
       </w:r>
       <w:r>
@@ -2854,10 +2753,21 @@
         <w:jc w:val="both"/>
       </w:pPr>
       <w:r>
-        <w:t xml:space="preserve">A presente investigação adota uma abordagem de natureza experimental e descritiva, fundamentada na estratégia de Auditoria Algorítmica de Caixa-Preta (Black-Box </w:t>
+        <w:t>A presente investigação adota uma abordagem de natureza experimental e descritiva, fundamentada na estratégia de Auditoria Algorítmica de Caixa-Preta (</w:t>
+      </w:r>
+      <w:r>
+        <w:rPr>
+          <w:i/>
+          <w:iCs/>
+        </w:rPr>
+        <w:t xml:space="preserve">Black-Box </w:t>
       </w:r>
       <w:proofErr w:type="spellStart"/>
       <w:r>
+        <w:rPr>
+          <w:i/>
+          <w:iCs/>
+        </w:rPr>
         <w:t>Auditing</w:t>
       </w:r>
       <w:proofErr w:type="spellEnd"/>
@@ -2880,16 +2790,7 @@
         <w:jc w:val="both"/>
       </w:pPr>
       <w:r>
-        <w:t>Paralelamente, a pesquisa recorre ao método bibliográfico, com o objetivo de sustentar teoricamente a análise dos fenômenos observados. Essa revisão, conforme orientações de Gil (1991), abrange estudos sobre a evolução da música</w:t>
-      </w:r>
-      <w:r>
-        <w:t xml:space="preserve"> e </w:t>
-      </w:r>
-      <w:r>
-        <w:t>o papel das tecnologias digitais</w:t>
-      </w:r>
-      <w:r>
-        <w:t>.</w:t>
+        <w:t>Paralelamente, a pesquisa recorre ao método bibliográfico com o objetivo de sustentar teoricamente a análise dos fenômenos observados. Essa revisão, conforme orientações de Gil (1991), abrange estudos sobre a evolução da música e o papel das tecnologias digitais. A articulação entre a auditoria algorítmica e a revisão bibliográfica permite uma compreensão abrangente do impacto da Inteligência Artificial na música contemporânea, contemplando tanto a perspectiva empírica quanto a análise teórica dos processos sociotécnicos envolvidos.</w:t>
       </w:r>
     </w:p>
     <w:p>
@@ -2898,20 +2799,28 @@
         <w:ind w:firstLine="720"/>
         <w:jc w:val="both"/>
       </w:pPr>
-      <w:r>
-        <w:t>A articulação entre a auditoria algorítmica e a revisão bibliográfica permite uma compreensão abrangente e aprofundada do impacto da Inteligência Artificial na música contemporânea, contemplando tanto a perspectiva empíric</w:t>
-      </w:r>
-      <w:r>
-        <w:t xml:space="preserve">a, </w:t>
-      </w:r>
-      <w:r>
-        <w:t>baseada nos dados observacionais</w:t>
-      </w:r>
-      <w:r>
-        <w:t xml:space="preserve">, </w:t>
-      </w:r>
-      <w:r>
-        <w:t>quanto a análise teórica dos processos sociotécnicos envolvidos.</w:t>
+    </w:p>
+    <w:p>
+      <w:pPr>
+        <w:spacing w:line="480" w:lineRule="auto"/>
+        <w:rPr>
+          <w:b/>
+          <w:bCs/>
+        </w:rPr>
+      </w:pPr>
+      <w:r>
+        <w:rPr>
+          <w:b/>
+          <w:bCs/>
+        </w:rPr>
+        <w:t>4</w:t>
+      </w:r>
+      <w:r>
+        <w:rPr>
+          <w:b/>
+          <w:bCs/>
+        </w:rPr>
+        <w:t>.1 Procedimento de Coleta e Preparação Técnica</w:t>
       </w:r>
     </w:p>
     <w:p>
@@ -2920,28 +2829,8 @@
         <w:ind w:firstLine="720"/>
         <w:jc w:val="both"/>
       </w:pPr>
-    </w:p>
-    <w:p>
-      <w:pPr>
-        <w:spacing w:line="480" w:lineRule="auto"/>
-        <w:rPr>
-          <w:b/>
-          <w:bCs/>
-        </w:rPr>
-      </w:pPr>
-      <w:r>
-        <w:rPr>
-          <w:b/>
-          <w:bCs/>
-        </w:rPr>
-        <w:t>4</w:t>
-      </w:r>
-      <w:r>
-        <w:rPr>
-          <w:b/>
-          <w:bCs/>
-        </w:rPr>
-        <w:t>.1 Procedimento de Coleta e Preparação Técnica</w:t>
+      <w:r>
+        <w:t>O procedimento experimental foi dividido em fases sequenciais de configuração e desenvolvimento técnico. Inicialmente, foram criadas quatro contas de utilizador distintas na plataforma Spotify, garantindo que cada perfil partisse de um estado "neutro" (cold start), sem histórico prévio de escuta que pudesse enviesar os resultados iniciais.</w:t>
       </w:r>
     </w:p>
     <w:p>
@@ -2951,13 +2840,43 @@
         <w:jc w:val="both"/>
       </w:pPr>
       <w:r>
-        <w:t>O procedimento experimental foi dividido em fases sequenciais de configuração e</w:t>
-      </w:r>
+        <w:t xml:space="preserve">Para a automação da interação com estas contas, utilizou-se o portal Spotify for </w:t>
+      </w:r>
+      <w:proofErr w:type="spellStart"/>
+      <w:r>
+        <w:t>Developers</w:t>
+      </w:r>
+      <w:proofErr w:type="spellEnd"/>
+      <w:r>
+        <w:t xml:space="preserve"> para obtenção das credenciais de autenticação. O motor da pesquisa foi construído em linguagem </w:t>
+      </w:r>
+      <w:r>
+        <w:lastRenderedPageBreak/>
+        <w:t xml:space="preserve">Python, utilizando a biblioteca </w:t>
+      </w:r>
+      <w:proofErr w:type="spellStart"/>
+      <w:r>
+        <w:t>Spotipy</w:t>
+      </w:r>
+      <w:proofErr w:type="spellEnd"/>
+      <w:r>
+        <w:t xml:space="preserve"> como interface para as chamadas à API (</w:t>
+      </w:r>
+      <w:proofErr w:type="spellStart"/>
+      <w:r>
+        <w:t>Application</w:t>
+      </w:r>
+      <w:proofErr w:type="spellEnd"/>
       <w:r>
         <w:t xml:space="preserve"> </w:t>
       </w:r>
-      <w:r>
-        <w:t>desenvolvimento técnico. Inicialmente, foram criadas quatro contas de utilizador distintas na plataforma Spotify, garantindo que cada perfil partisse de um estado "neutro" (cold start), sem histórico prévio de escuta que pudesse enviesar os resultados iniciais.</w:t>
+      <w:proofErr w:type="spellStart"/>
+      <w:r>
+        <w:t>Programming</w:t>
+      </w:r>
+      <w:proofErr w:type="spellEnd"/>
+      <w:r>
+        <w:t xml:space="preserve"> Interface) do serviço. Os códigos desenvolvidos foram responsáveis por automatizar a extração de metadados das faixas e a construção das bibliotecas personalizadas (playlists), garantindo que a base de dados musical de cada persona fosse estruturada de forma isolada e sistemática.</w:t>
       </w:r>
     </w:p>
     <w:p>
@@ -2967,51 +2886,31 @@
         <w:jc w:val="both"/>
       </w:pPr>
       <w:r>
-        <w:t xml:space="preserve">Para a automação da interação com estas contas, utilizou-se o portal Spotify for </w:t>
+        <w:t xml:space="preserve">Complementarmente à automação da curadoria, foi desenvolvida uma arquitetura de análise de dados robusta para processar e auditar os resultados. O sistema integrou ferramentas de ciência de dados, como pandas para a estruturação tabular, e </w:t>
       </w:r>
       <w:proofErr w:type="spellStart"/>
       <w:r>
-        <w:t>Developers</w:t>
+        <w:t>matplotlib</w:t>
       </w:r>
       <w:proofErr w:type="spellEnd"/>
       <w:r>
-        <w:t xml:space="preserve">, onde foi registada uma aplicação para a obtenção das credenciais de </w:t>
-      </w:r>
-      <w:r>
-        <w:t>autenticação, permitindo</w:t>
-      </w:r>
-      <w:r>
-        <w:t xml:space="preserve"> a comunicação entre o ambiente de desenvolvimento e os servidores do Spotify</w:t>
-      </w:r>
-      <w:r>
-        <w:t xml:space="preserve">. </w:t>
-      </w:r>
-      <w:r>
-        <w:t xml:space="preserve">O motor da pesquisa foi construído em linguagem Python, utilizando a biblioteca </w:t>
+        <w:t xml:space="preserve"> e </w:t>
       </w:r>
       <w:proofErr w:type="spellStart"/>
       <w:r>
-        <w:t>Spotipy</w:t>
+        <w:t>seaborn</w:t>
       </w:r>
       <w:proofErr w:type="spellEnd"/>
       <w:r>
-        <w:t>, que serviu de interface para realizar chamadas à API (</w:t>
+        <w:t xml:space="preserve"> para a visualização gráfica. Mais do que apenas recolher listas de reprodução, o código foi programado para calcular métricas complexas de diversidade e concentração — incluindo a Entropia de Shannon, o Coeficiente de Gini e o Índice de </w:t>
       </w:r>
       <w:proofErr w:type="spellStart"/>
       <w:r>
-        <w:t>Application</w:t>
+        <w:t>Jaccard</w:t>
       </w:r>
       <w:proofErr w:type="spellEnd"/>
       <w:r>
-        <w:t xml:space="preserve"> </w:t>
-      </w:r>
-      <w:proofErr w:type="spellStart"/>
-      <w:r>
-        <w:t>Programming</w:t>
-      </w:r>
-      <w:proofErr w:type="spellEnd"/>
-      <w:r>
-        <w:t xml:space="preserve"> Interface) do serviço. Os códigos desenvolvidos foram responsáveis por automatizar a extração de metadados das faixas, a criação de bibliotecas personalizadas e a simulação de consumo diário, garantindo que cada persona interagisse com o sistema de forma isolada e sistemática.</w:t>
+        <w:t>. Tais métricas permitem transformar a percepção subjetiva de gosto musical em dados quantitativos auditáveis, essenciais para a verificação de vieses algorítmicos.</w:t>
       </w:r>
     </w:p>
     <w:p>
@@ -3039,7 +2938,14 @@
           <w:b/>
           <w:bCs/>
         </w:rPr>
-        <w:t>.2 Personas Sintéticas: Caracterização e Lógica Algorítmica</w:t>
+        <w:t xml:space="preserve">.2 </w:t>
+      </w:r>
+      <w:r>
+        <w:rPr>
+          <w:b/>
+          <w:bCs/>
+        </w:rPr>
+        <w:t>Arquitetura dos Agentes de Teste: Caracterização das Personas Sintéticas</w:t>
       </w:r>
     </w:p>
     <w:p>
@@ -3049,11 +2955,13 @@
         <w:jc w:val="both"/>
       </w:pPr>
       <w:r>
-        <w:lastRenderedPageBreak/>
-        <w:t>O objeto central da auditoria é o uso de Personas Sintéticas, perfis simulados que representam arquétipos de consumo específicos. Abaixo, detalham-se as quatro personas que compõem o estudo</w:t>
-      </w:r>
-      <w:r>
-        <w:t>:</w:t>
+        <w:t>O núcleo experimental desta auditoria reside na implementação de Personas Sintéticas. Estes agentes digitais constituem construções metodológicas desenhadas para representar arquétipos de comportamento musical distintos e polarizados, fundamentais para isolar variáveis específicas do sistema de recomendação</w:t>
+      </w:r>
+      <w:r>
+        <w:t xml:space="preserve">, </w:t>
+      </w:r>
+      <w:r>
+        <w:t>como a popularidade, a recência e a funcionalidade sonora.</w:t>
       </w:r>
     </w:p>
     <w:p>
@@ -3062,44 +2970,34 @@
         <w:ind w:firstLine="720"/>
         <w:jc w:val="both"/>
       </w:pPr>
-    </w:p>
-    <w:p>
-      <w:pPr>
-        <w:spacing w:line="480" w:lineRule="auto"/>
-        <w:rPr>
-          <w:b/>
-          <w:bCs/>
-        </w:rPr>
-      </w:pPr>
-      <w:r>
-        <w:rPr>
-          <w:b/>
-          <w:bCs/>
-        </w:rPr>
-        <w:t xml:space="preserve">4.2.1 </w:t>
-      </w:r>
-      <w:r>
-        <w:rPr>
-          <w:b/>
-          <w:bCs/>
-        </w:rPr>
-        <w:t xml:space="preserve">Beatriz (A Consumidora </w:t>
-      </w:r>
-      <w:proofErr w:type="spellStart"/>
-      <w:r>
-        <w:rPr>
-          <w:b/>
-          <w:bCs/>
-        </w:rPr>
-        <w:t>Mainstream</w:t>
-      </w:r>
-      <w:proofErr w:type="spellEnd"/>
-      <w:r>
-        <w:rPr>
-          <w:b/>
-          <w:bCs/>
-        </w:rPr>
-        <w:t>)</w:t>
+      <w:r>
+        <w:t xml:space="preserve">Para cobrir um espectro abrangente de hábitos de consumo, foram modelados quatro perfis que operam em extremos opostos da economia da atenção musical: do consumo passivo de sucessos globais à exploração ativa de nichos </w:t>
+      </w:r>
+      <w:r>
+        <w:rPr>
+          <w:i/>
+          <w:iCs/>
+        </w:rPr>
+        <w:t>underground</w:t>
+      </w:r>
+      <w:r>
+        <w:t>. Nas seções subsequentes, cada persona é apresentada através de uma estrutura analítica:</w:t>
+      </w:r>
+      <w:r>
+        <w:t xml:space="preserve"> </w:t>
+      </w:r>
+      <w:r>
+        <w:t xml:space="preserve">perfil psicográfico, que contextualiza a narrativa e humaniza o comportamento simulado; e a motivação científica, que define explicitamente qual hipótese de viés algorítmico está sendo testada. Imediatamente após a caracterização teórica, apresenta-se a validação quantitativa do </w:t>
+      </w:r>
+      <w:r>
+        <w:rPr>
+          <w:i/>
+          <w:iCs/>
+        </w:rPr>
+        <w:t>input</w:t>
+      </w:r>
+      <w:r>
+        <w:t>, onde métricas de popularidade, diversidade e dispersão gráfica confirmam estatisticamente a consolidação de cada arquétipo antes do início da interação com o algoritmo.</w:t>
       </w:r>
     </w:p>
     <w:p>
@@ -3108,22 +3006,38 @@
         <w:ind w:firstLine="720"/>
         <w:jc w:val="both"/>
       </w:pPr>
-      <w:r>
-        <w:t>“</w:t>
-      </w:r>
-      <w:r>
-        <w:t xml:space="preserve">Bia é uma verdadeira nativa digital; ela não se lembra de um mundo sem internet ou smartphones. Nascida em Uberlândia, sua infância foi marcada pelo YouTube, e sua adolescência, pelo auge do Instagram e a explosão do TikTok. A música, para ela, nunca veio do rádio, mas sim dos </w:t>
+    </w:p>
+    <w:p>
+      <w:pPr>
+        <w:spacing w:line="480" w:lineRule="auto"/>
+        <w:rPr>
+          <w:b/>
+          <w:bCs/>
+        </w:rPr>
+      </w:pPr>
+      <w:r>
+        <w:rPr>
+          <w:b/>
+          <w:bCs/>
+        </w:rPr>
+        <w:lastRenderedPageBreak/>
+        <w:t xml:space="preserve">4.2.1 Beatriz (A Consumidora </w:t>
       </w:r>
       <w:proofErr w:type="spellStart"/>
       <w:r>
-        <w:t>challenges</w:t>
+        <w:rPr>
+          <w:b/>
+          <w:bCs/>
+        </w:rPr>
+        <w:t>Mainstream</w:t>
       </w:r>
       <w:proofErr w:type="spellEnd"/>
       <w:r>
-        <w:t xml:space="preserve"> de dança e das trilhas sonoras virais. Atualmente, com 19 anos, ela é estudante de Relações Internacionais na UFU e personifica o espírito "conectado". Para Bia, a música é um evento social, um catalisador de interações. É ela quem geralmente conecta o celular na caixa de som nas reuniões com amigos, e estar por dentro dos últimos hits brasileiros é essencial para se sentir parte do grupo. Sua relação com a música é imediata e efêmera, focada no presente e no que é compartilhado coletivamente.</w:t>
-      </w:r>
-      <w:r>
-        <w:t>”</w:t>
+        <w:rPr>
+          <w:b/>
+          <w:bCs/>
+        </w:rPr>
+        <w:t>)</w:t>
       </w:r>
     </w:p>
     <w:p>
@@ -3137,10 +3051,21 @@
           <w:b/>
           <w:bCs/>
         </w:rPr>
-        <w:t>Motivação:</w:t>
-      </w:r>
-      <w:r>
-        <w:t xml:space="preserve"> Testar o viés de popularidade do algoritmo e se ele reforça o consumo de hits.</w:t>
+        <w:t>Perfil Psicográfico:</w:t>
+      </w:r>
+      <w:r>
+        <w:t xml:space="preserve"> </w:t>
+      </w:r>
+      <w:r>
+        <w:t xml:space="preserve">Bia é uma verdadeira nativa digital; ela não se lembra de um mundo sem internet ou smartphones. Nascida em Uberlândia, sua infância foi marcada pelo YouTube, e sua adolescência, pelo auge do Instagram e a explosão do TikTok. A música, para ela, nunca veio do rádio, mas sim dos </w:t>
+      </w:r>
+      <w:proofErr w:type="spellStart"/>
+      <w:r>
+        <w:t>challenges</w:t>
+      </w:r>
+      <w:proofErr w:type="spellEnd"/>
+      <w:r>
+        <w:t xml:space="preserve"> de dança e das trilhas sonoras virais. Atualmente, com 19 anos, ela é estudante de Relações Internacionais na UFU e personifica o espírito "conectado". Para Bia, a música é um evento social, um catalisador de interações. É ela quem geralmente conecta o celular na caixa de som nas reuniões com amigos, e estar por dentro dos últimos hits brasileiros é essencial para se sentir parte do grupo. Sua relação com a música é imediata e efêmera, focada no presente e no que é compartilhado coletivamente.</w:t>
       </w:r>
     </w:p>
     <w:p>
@@ -3154,19 +3079,496 @@
           <w:b/>
           <w:bCs/>
         </w:rPr>
-        <w:t>Lógica do Código:</w:t>
-      </w:r>
-      <w:r>
-        <w:t xml:space="preserve"> O script seleciona faixas com Índice de Popularidade &gt; 80 (via API). A lista de reprodução é montada com base nos </w:t>
+        <w:t>Motivação:</w:t>
+      </w:r>
+      <w:r>
+        <w:t xml:space="preserve"> </w:t>
+      </w:r>
+      <w:r>
+        <w:t xml:space="preserve">Esta persona atua como o Grupo de Controle (Baseline) do experimento. Beatriz representa o comportamento padrão "ideal" para modelos de negócio baseados em economia da atenção: consumo rápido, alta retenção e foco em sucessos globais. O objetivo é verificar a existência de um ciclo de </w:t>
+      </w:r>
+      <w:r>
+        <w:rPr>
+          <w:i/>
+          <w:iCs/>
+        </w:rPr>
+        <w:t>feedback</w:t>
+      </w:r>
+      <w:r>
+        <w:t xml:space="preserve"> positivo (</w:t>
+      </w:r>
+      <w:r>
+        <w:rPr>
+          <w:i/>
+          <w:iCs/>
+        </w:rPr>
+        <w:t>feedback loop</w:t>
+      </w:r>
+      <w:r>
+        <w:t xml:space="preserve">), testando a hipótese de que o sistema de recomendação tende a blindar usuários </w:t>
       </w:r>
       <w:proofErr w:type="spellStart"/>
       <w:r>
+        <w:rPr>
+          <w:i/>
+          <w:iCs/>
+        </w:rPr>
+        <w:t>mainstream</w:t>
+      </w:r>
+      <w:proofErr w:type="spellEnd"/>
+      <w:r>
+        <w:t xml:space="preserve"> contra conteúdos de nicho, reforçando uma bolha de alta popularidade e dificultando a serendipidade (descoberta do inesperado).</w:t>
+      </w:r>
+    </w:p>
+    <w:p>
+      <w:pPr>
+        <w:spacing w:line="360" w:lineRule="auto"/>
+        <w:ind w:firstLine="720"/>
+        <w:jc w:val="both"/>
+      </w:pPr>
+      <w:r>
+        <w:rPr>
+          <w:b/>
+          <w:bCs/>
+        </w:rPr>
+        <w:t>Validação Quantitativa do Input (Linha de Base):</w:t>
+      </w:r>
+      <w:r>
+        <w:rPr>
+          <w:b/>
+          <w:bCs/>
+        </w:rPr>
+        <w:t xml:space="preserve"> </w:t>
+      </w:r>
+      <w:r>
+        <w:t xml:space="preserve">A análise estatística dos dados de entrada confirma a aderência do perfil Beatriz ao arquétipo </w:t>
+      </w:r>
+      <w:proofErr w:type="spellStart"/>
+      <w:r>
+        <w:rPr>
+          <w:i/>
+          <w:iCs/>
+        </w:rPr>
+        <w:t>Mainstream</w:t>
+      </w:r>
+      <w:proofErr w:type="spellEnd"/>
+      <w:r>
+        <w:t xml:space="preserve"> brasileiro contemporâneo. A biblioteca gerada apresenta uma Popularidade Média de Faixas de 75.41 e uma Mediana de 74, com um desvio padrão baixo (+/- 4.42), evidenciando uma consistência rigorosa no consumo de faixas de alta performance comercial. O viés de recência é extremo: 84.9% das faixas pertencem à década de 2020, resultando em um Ano Médio de Lançamento de 2023, o que corrobora o perfil de consumo imediatista e focado em novidades virais.</w:t>
+      </w:r>
+    </w:p>
+    <w:p>
+      <w:pPr>
+        <w:spacing w:line="360" w:lineRule="auto"/>
+        <w:ind w:firstLine="720"/>
+        <w:jc w:val="both"/>
+      </w:pPr>
+      <w:r>
+        <w:t xml:space="preserve">O caráter de "validação social" desta persona é reforçado pelas métricas de alcance econômico. A Média de Seguidores dos artistas selecionados ultrapassa 8 milhões, acumulando um alcance total superior a 1.6 bilhão de seguidores somados. A diversidade aparente de gêneros (HHI 0.08) revela-se, na prática, uma concentração temática em estilos de apelo massivo no Brasil: o Sertanejo e suas vertentes (Universitário, </w:t>
+      </w:r>
+      <w:proofErr w:type="spellStart"/>
+      <w:r>
+        <w:t>Agronejo</w:t>
+      </w:r>
+      <w:proofErr w:type="spellEnd"/>
+      <w:r>
+        <w:t xml:space="preserve">) dominam a lista com mais de 200 ocorrências combinadas, seguidos pelo Funk Brasileiro e suas variações (Trap Funk, Consciente), refletindo fielmente os </w:t>
+      </w:r>
+      <w:proofErr w:type="spellStart"/>
+      <w:r>
         <w:t>charts</w:t>
       </w:r>
       <w:proofErr w:type="spellEnd"/>
       <w:r>
-        <w:t xml:space="preserve"> "Top 50" globais e nacionais.</w:t>
-      </w:r>
+        <w:t xml:space="preserve"> nacionais atuais.</w:t>
+      </w:r>
+    </w:p>
+    <w:tbl>
+      <w:tblPr>
+        <w:tblStyle w:val="Tabelacomgrade"/>
+        <w:tblW w:w="0" w:type="auto"/>
+        <w:tblLook w:val="04A0" w:firstRow="1" w:lastRow="0" w:firstColumn="1" w:lastColumn="0" w:noHBand="0" w:noVBand="1"/>
+      </w:tblPr>
+      <w:tblGrid>
+        <w:gridCol w:w="3131"/>
+        <w:gridCol w:w="3132"/>
+        <w:gridCol w:w="3132"/>
+      </w:tblGrid>
+      <w:tr>
+        <w:tc>
+          <w:tcPr>
+            <w:tcW w:w="3131" w:type="dxa"/>
+          </w:tcPr>
+          <w:p>
+            <w:pPr>
+              <w:spacing w:line="360" w:lineRule="auto"/>
+              <w:jc w:val="both"/>
+              <w:rPr>
+                <w:b/>
+                <w:bCs/>
+              </w:rPr>
+            </w:pPr>
+            <w:r>
+              <w:rPr>
+                <w:b/>
+                <w:bCs/>
+              </w:rPr>
+              <w:lastRenderedPageBreak/>
+              <w:t>Indicador</w:t>
+            </w:r>
+          </w:p>
+        </w:tc>
+        <w:tc>
+          <w:tcPr>
+            <w:tcW w:w="3132" w:type="dxa"/>
+          </w:tcPr>
+          <w:p>
+            <w:pPr>
+              <w:spacing w:line="360" w:lineRule="auto"/>
+              <w:jc w:val="both"/>
+              <w:rPr>
+                <w:b/>
+                <w:bCs/>
+              </w:rPr>
+            </w:pPr>
+            <w:r>
+              <w:rPr>
+                <w:b/>
+                <w:bCs/>
+              </w:rPr>
+              <w:t>Valor Obtido</w:t>
+            </w:r>
+          </w:p>
+        </w:tc>
+        <w:tc>
+          <w:tcPr>
+            <w:tcW w:w="3132" w:type="dxa"/>
+          </w:tcPr>
+          <w:p>
+            <w:pPr>
+              <w:spacing w:line="360" w:lineRule="auto"/>
+              <w:jc w:val="both"/>
+              <w:rPr>
+                <w:b/>
+                <w:bCs/>
+              </w:rPr>
+            </w:pPr>
+            <w:r>
+              <w:rPr>
+                <w:b/>
+                <w:bCs/>
+              </w:rPr>
+              <w:t>Interpretação</w:t>
+            </w:r>
+          </w:p>
+        </w:tc>
+      </w:tr>
+      <w:tr>
+        <w:tc>
+          <w:tcPr>
+            <w:tcW w:w="3131" w:type="dxa"/>
+          </w:tcPr>
+          <w:p>
+            <w:pPr>
+              <w:spacing w:line="360" w:lineRule="auto"/>
+              <w:jc w:val="both"/>
+            </w:pPr>
+            <w:r>
+              <w:t>Popularidade Média (Faixas)</w:t>
+            </w:r>
+          </w:p>
+        </w:tc>
+        <w:tc>
+          <w:tcPr>
+            <w:tcW w:w="3132" w:type="dxa"/>
+          </w:tcPr>
+          <w:p>
+            <w:pPr>
+              <w:spacing w:line="360" w:lineRule="auto"/>
+              <w:jc w:val="both"/>
+            </w:pPr>
+            <w:r>
+              <w:t>75.41 / 100</w:t>
+            </w:r>
+          </w:p>
+        </w:tc>
+        <w:tc>
+          <w:tcPr>
+            <w:tcW w:w="3132" w:type="dxa"/>
+          </w:tcPr>
+          <w:p>
+            <w:pPr>
+              <w:spacing w:line="360" w:lineRule="auto"/>
+              <w:jc w:val="both"/>
+            </w:pPr>
+            <w:r>
+              <w:t>Evidência de Viés de Popularidade positivo; o perfil situa-se na zona de "segurança algorítmica" (baixo risco de rejeição).</w:t>
+            </w:r>
+          </w:p>
+        </w:tc>
+      </w:tr>
+      <w:tr>
+        <w:tc>
+          <w:tcPr>
+            <w:tcW w:w="3131" w:type="dxa"/>
+          </w:tcPr>
+          <w:p>
+            <w:pPr>
+              <w:spacing w:line="360" w:lineRule="auto"/>
+              <w:jc w:val="both"/>
+            </w:pPr>
+            <w:r>
+              <w:t>Entropia de Artistas</w:t>
+            </w:r>
+          </w:p>
+        </w:tc>
+        <w:tc>
+          <w:tcPr>
+            <w:tcW w:w="3132" w:type="dxa"/>
+          </w:tcPr>
+          <w:p>
+            <w:pPr>
+              <w:spacing w:line="360" w:lineRule="auto"/>
+              <w:jc w:val="both"/>
+            </w:pPr>
+            <w:r>
+              <w:t>Alta (94 únicos)</w:t>
+            </w:r>
+          </w:p>
+        </w:tc>
+        <w:tc>
+          <w:tcPr>
+            <w:tcW w:w="3132" w:type="dxa"/>
+          </w:tcPr>
+          <w:p>
+            <w:pPr>
+              <w:spacing w:line="360" w:lineRule="auto"/>
+              <w:jc w:val="both"/>
+            </w:pPr>
+            <w:r>
+              <w:t>Padrão de escuta passiva ou "tipo rádio" (</w:t>
+            </w:r>
+            <w:proofErr w:type="spellStart"/>
+            <w:r>
+              <w:rPr>
+                <w:i/>
+                <w:iCs/>
+              </w:rPr>
+              <w:t>Grazing</w:t>
+            </w:r>
+            <w:proofErr w:type="spellEnd"/>
+            <w:r>
+              <w:t>), com baixa fidelidade a artistas específicos e alta rotatividade.</w:t>
+            </w:r>
+          </w:p>
+        </w:tc>
+      </w:tr>
+      <w:tr>
+        <w:tc>
+          <w:tcPr>
+            <w:tcW w:w="3131" w:type="dxa"/>
+          </w:tcPr>
+          <w:p>
+            <w:pPr>
+              <w:spacing w:line="360" w:lineRule="auto"/>
+              <w:jc w:val="both"/>
+            </w:pPr>
+            <w:r>
+              <w:t>Recência Temporal</w:t>
+            </w:r>
+          </w:p>
+        </w:tc>
+        <w:tc>
+          <w:tcPr>
+            <w:tcW w:w="3132" w:type="dxa"/>
+          </w:tcPr>
+          <w:p>
+            <w:pPr>
+              <w:spacing w:line="360" w:lineRule="auto"/>
+              <w:jc w:val="both"/>
+            </w:pPr>
+            <w:r>
+              <w:t>84.9% (Anos 2020)</w:t>
+            </w:r>
+          </w:p>
+        </w:tc>
+        <w:tc>
+          <w:tcPr>
+            <w:tcW w:w="3132" w:type="dxa"/>
+          </w:tcPr>
+          <w:p>
+            <w:pPr>
+              <w:spacing w:line="360" w:lineRule="auto"/>
+              <w:jc w:val="both"/>
+            </w:pPr>
+            <w:r>
+              <w:t>Viés de Imediatismo extremo; rejeição ao "catálogo profundo" (</w:t>
+            </w:r>
+            <w:proofErr w:type="spellStart"/>
+            <w:r>
+              <w:rPr>
+                <w:i/>
+                <w:iCs/>
+              </w:rPr>
+              <w:t>back</w:t>
+            </w:r>
+            <w:proofErr w:type="spellEnd"/>
+            <w:r>
+              <w:rPr>
+                <w:i/>
+                <w:iCs/>
+              </w:rPr>
+              <w:t xml:space="preserve"> catalogue</w:t>
+            </w:r>
+            <w:r>
+              <w:t>) em favor de novidades virais.</w:t>
+            </w:r>
+          </w:p>
+        </w:tc>
+      </w:tr>
+      <w:tr>
+        <w:tc>
+          <w:tcPr>
+            <w:tcW w:w="3131" w:type="dxa"/>
+          </w:tcPr>
+          <w:p>
+            <w:pPr>
+              <w:spacing w:line="360" w:lineRule="auto"/>
+              <w:jc w:val="both"/>
+            </w:pPr>
+            <w:r>
+              <w:t>Alcance Médio (Seguidores)</w:t>
+            </w:r>
+          </w:p>
+        </w:tc>
+        <w:tc>
+          <w:tcPr>
+            <w:tcW w:w="3132" w:type="dxa"/>
+          </w:tcPr>
+          <w:p>
+            <w:pPr>
+              <w:spacing w:line="360" w:lineRule="auto"/>
+              <w:jc w:val="both"/>
+            </w:pPr>
+            <w:r>
+              <w:t>~8.2 Milhões</w:t>
+            </w:r>
+          </w:p>
+        </w:tc>
+        <w:tc>
+          <w:tcPr>
+            <w:tcW w:w="3132" w:type="dxa"/>
+          </w:tcPr>
+          <w:p>
+            <w:pPr>
+              <w:spacing w:line="360" w:lineRule="auto"/>
+              <w:jc w:val="both"/>
+            </w:pPr>
+            <w:r>
+              <w:t>Consumo concentrado na "Cabeça" (</w:t>
+            </w:r>
+            <w:r>
+              <w:rPr>
+                <w:i/>
+                <w:iCs/>
+              </w:rPr>
+              <w:t>Head</w:t>
+            </w:r>
+            <w:r>
+              <w:t>) da Cauda Longa; validação baseada em prova social massiva.</w:t>
+            </w:r>
+          </w:p>
+        </w:tc>
+      </w:tr>
+      <w:tr>
+        <w:tc>
+          <w:tcPr>
+            <w:tcW w:w="3131" w:type="dxa"/>
+          </w:tcPr>
+          <w:p>
+            <w:pPr>
+              <w:spacing w:line="360" w:lineRule="auto"/>
+              <w:jc w:val="both"/>
+            </w:pPr>
+            <w:r>
+              <w:t>Gêneros Dominantes</w:t>
+            </w:r>
+          </w:p>
+        </w:tc>
+        <w:tc>
+          <w:tcPr>
+            <w:tcW w:w="3132" w:type="dxa"/>
+          </w:tcPr>
+          <w:p>
+            <w:pPr>
+              <w:spacing w:line="360" w:lineRule="auto"/>
+              <w:jc w:val="both"/>
+            </w:pPr>
+            <w:r>
+              <w:t>Sertanejo / Funk</w:t>
+            </w:r>
+          </w:p>
+        </w:tc>
+        <w:tc>
+          <w:tcPr>
+            <w:tcW w:w="3132" w:type="dxa"/>
+          </w:tcPr>
+          <w:p>
+            <w:pPr>
+              <w:spacing w:line="360" w:lineRule="auto"/>
+              <w:jc w:val="both"/>
+            </w:pPr>
+            <w:r>
+              <w:t xml:space="preserve">Bolha de Filtro </w:t>
+            </w:r>
+            <w:proofErr w:type="spellStart"/>
+            <w:r>
+              <w:t>Geocultural</w:t>
+            </w:r>
+            <w:proofErr w:type="spellEnd"/>
+            <w:r>
+              <w:t xml:space="preserve">; espelhamento direto dos </w:t>
+            </w:r>
+            <w:proofErr w:type="spellStart"/>
+            <w:r>
+              <w:rPr>
+                <w:i/>
+                <w:iCs/>
+              </w:rPr>
+              <w:t>charts</w:t>
+            </w:r>
+            <w:proofErr w:type="spellEnd"/>
+            <w:r>
+              <w:t xml:space="preserve"> locais, indicando comportamento de "efeito manada" (</w:t>
+            </w:r>
+            <w:proofErr w:type="spellStart"/>
+            <w:r>
+              <w:rPr>
+                <w:i/>
+                <w:iCs/>
+              </w:rPr>
+              <w:t>herding</w:t>
+            </w:r>
+            <w:proofErr w:type="spellEnd"/>
+            <w:r>
+              <w:t>).</w:t>
+            </w:r>
+          </w:p>
+        </w:tc>
+      </w:tr>
+    </w:tbl>
+    <w:p>
+      <w:pPr>
+        <w:spacing w:line="360" w:lineRule="auto"/>
+        <w:ind w:firstLine="720"/>
+        <w:jc w:val="both"/>
+      </w:pPr>
+    </w:p>
+    <w:p>
+      <w:pPr>
+        <w:spacing w:line="360" w:lineRule="auto"/>
+        <w:ind w:firstLine="720"/>
+        <w:jc w:val="both"/>
+      </w:pPr>
     </w:p>
     <w:p>
       <w:pPr>
@@ -3233,7 +3635,11 @@
         <w:t>“</w:t>
       </w:r>
       <w:r>
-        <w:t>Sempre pragmático e focado, Daniel nunca viu a música como uma parte central de sua identidade. Foi na faculdade de Ciência da Computação que ele descobriu o poder do som como uma ferramenta de produtividade. Ele percebeu que paisagens sonoras instrumentais o ajudavam a programar por horas a fio sem distração. Hoje, aos 2</w:t>
+        <w:t xml:space="preserve">Sempre pragmático e focado, Daniel nunca viu a música como uma parte central de sua identidade. Foi na faculdade de Ciência da Computação que ele descobriu o poder do som como uma ferramenta de produtividade. Ele percebeu que paisagens sonoras instrumentais o ajudavam a </w:t>
+      </w:r>
+      <w:r>
+        <w:lastRenderedPageBreak/>
+        <w:t>programar por horas a fio sem distração. Hoje, aos 2</w:t>
       </w:r>
       <w:r>
         <w:t>8</w:t>
@@ -3273,7 +3679,6 @@
           <w:b/>
           <w:bCs/>
         </w:rPr>
-        <w:lastRenderedPageBreak/>
         <w:t>Lógica do Código:</w:t>
       </w:r>
       <w:r>
@@ -3345,10 +3750,7 @@
         <w:t>“</w:t>
       </w:r>
       <w:r>
-        <w:t>Ricardo</w:t>
-      </w:r>
-      <w:r>
-        <w:t xml:space="preserve"> viveu o auge da cultura do rock e da MPB nos anos 90. Sua adolescência foi moldada por fitas K7 gravadas do rádio, pela espera ansiosa de um clipe na MTV Brasil e pela economia de meses para comprar o LP do Legião Urbana ou o CD importado do Queen. Para ele, um álbum é uma obra completa, com narrativa e arte. Engenheiro civil, casado e com dois filhos, ele acabou cedendo à praticidade dos serviços de música digital, mas sua biblioteca musical continua sendo um reflexo fiel de sua juventude. Ele desconfia de sugestões feitas por sistemas automáticos, acreditando que o gosto musical genuíno é forjado pela experiência e não por algoritmos. Nos churrascos de fim de semana, ele faz questão de ser o DJ, mostrando aos mais jovens o que é "música de verdade".</w:t>
+        <w:t>Ricardo viveu o auge da cultura do rock e da MPB nos anos 90. Sua adolescência foi moldada por fitas K7 gravadas do rádio, pela espera ansiosa de um clipe na MTV Brasil e pela economia de meses para comprar o LP do Legião Urbana ou o CD importado do Queen. Para ele, um álbum é uma obra completa, com narrativa e arte. Engenheiro civil, casado e com dois filhos, ele acabou cedendo à praticidade dos serviços de música digital, mas sua biblioteca musical continua sendo um reflexo fiel de sua juventude. Ele desconfia de sugestões feitas por sistemas automáticos, acreditando que o gosto musical genuíno é forjado pela experiência e não por algoritmos. Nos churrascos de fim de semana, ele faz questão de ser o DJ, mostrando aos mais jovens o que é "música de verdade".</w:t>
       </w:r>
       <w:r>
         <w:t>”</w:t>
@@ -3432,7 +3834,11 @@
         <w:jc w:val="both"/>
       </w:pPr>
       <w:r>
-        <w:t>Sofia cresceu na fronteira entre o mundo físico e o digital. Seus irmãos mais velhos a apresentaram aos clássicos, mas foi na internet, em blogs e fóruns de meados dos anos 2010, que ela forjou sua identidade. Descobrir uma banda que ninguém conhecia se tornou sua paixão e uma forma de se diferenciar. Recém-formada em Design Gráfico, ela vê a música como uma extensão de sua estética pessoal. Sua biblioteca musical é meticulosamente organizada, refletindo seus humores e interesses. Ela valoriza a melancolia poética do indie e busca artistas que transmitam uma sensação de autenticidade e vulnerabilidade. Sofia tem uma relação de amor e receio com as ferramentas de descoberta musical: aprecia a capacidade de garimpar raridades, mas teme o dia em que elas se tornem previsíveis.</w:t>
+        <w:t xml:space="preserve">Sofia cresceu na fronteira entre o mundo físico e o digital. Seus irmãos mais velhos a apresentaram aos clássicos, mas foi na internet, em blogs e fóruns de meados dos anos 2010, que ela forjou sua identidade. Descobrir uma banda que ninguém conhecia se tornou sua paixão e uma forma de se diferenciar. Recém-formada em Design Gráfico, ela vê a música como uma extensão </w:t>
+      </w:r>
+      <w:r>
+        <w:lastRenderedPageBreak/>
+        <w:t>de sua estética pessoal. Sua biblioteca musical é meticulosamente organizada, refletindo seus humores e interesses. Ela valoriza a melancolia poética do indie e busca artistas que transmitam uma sensação de autenticidade e vulnerabilidade. Sofia tem uma relação de amor e receio com as ferramentas de descoberta musical: aprecia a capacidade de garimpar raridades, mas teme o dia em que elas se tornem previsíveis.</w:t>
       </w:r>
     </w:p>
     <w:p>
@@ -3463,7 +3869,6 @@
           <w:b/>
           <w:bCs/>
         </w:rPr>
-        <w:lastRenderedPageBreak/>
         <w:t>Lógica do Código:</w:t>
       </w:r>
       <w:r>
@@ -3489,110 +3894,7 @@
     </w:p>
     <w:p>
       <w:pPr>
-        <w:spacing w:line="480" w:lineRule="auto"/>
-        <w:rPr>
-          <w:b/>
-          <w:bCs/>
-        </w:rPr>
-      </w:pPr>
-      <w:r>
-        <w:rPr>
-          <w:b/>
-          <w:bCs/>
-        </w:rPr>
-        <w:t>3.3 Procedimentos de Testagem e Observação</w:t>
-      </w:r>
-    </w:p>
-    <w:p>
-      <w:pPr>
         <w:spacing w:line="360" w:lineRule="auto"/>
-        <w:ind w:firstLine="720"/>
-        <w:jc w:val="both"/>
-      </w:pPr>
-      <w:r>
-        <w:t>Para a pesquisa experimental, o procedimento de testagem consiste num ciclo de Input-Processamento-Output:</w:t>
-      </w:r>
-    </w:p>
-    <w:p>
-      <w:pPr>
-        <w:pStyle w:val="PargrafodaLista"/>
-        <w:numPr>
-          <w:ilvl w:val="0"/>
-          <w:numId w:val="21"/>
-        </w:numPr>
-        <w:spacing w:line="360" w:lineRule="auto"/>
-        <w:jc w:val="both"/>
-      </w:pPr>
-      <w:r>
-        <w:t>Input: Injeção de 50 faixas específicas (</w:t>
-      </w:r>
-      <w:proofErr w:type="spellStart"/>
-      <w:r>
-        <w:t>seeds</w:t>
-      </w:r>
-      <w:proofErr w:type="spellEnd"/>
-      <w:r>
-        <w:t>) na biblioteca de cada persona.</w:t>
-      </w:r>
-    </w:p>
-    <w:p>
-      <w:pPr>
-        <w:pStyle w:val="PargrafodaLista"/>
-        <w:numPr>
-          <w:ilvl w:val="0"/>
-          <w:numId w:val="21"/>
-        </w:numPr>
-        <w:spacing w:line="360" w:lineRule="auto"/>
-        <w:jc w:val="both"/>
-      </w:pPr>
-      <w:r>
-        <w:t>Processamento: Simulação de reprodução em ciclo (via script) durante um período controlado para permitir que a IA processe o feedback implícito.</w:t>
-      </w:r>
-    </w:p>
-    <w:p>
-      <w:pPr>
-        <w:pStyle w:val="PargrafodaLista"/>
-        <w:numPr>
-          <w:ilvl w:val="0"/>
-          <w:numId w:val="21"/>
-        </w:numPr>
-        <w:spacing w:line="360" w:lineRule="auto"/>
-        <w:jc w:val="both"/>
-      </w:pPr>
-      <w:r>
-        <w:t xml:space="preserve">Output: Captura e armazenamento dos metadados das </w:t>
-      </w:r>
-      <w:proofErr w:type="gramStart"/>
-      <w:r>
-        <w:t>playlists</w:t>
-      </w:r>
-      <w:proofErr w:type="gramEnd"/>
-      <w:r>
-        <w:t xml:space="preserve"> geradas automaticamente pelo Spotify (como o "Descobertas da Semana").</w:t>
-      </w:r>
-    </w:p>
-    <w:p>
-      <w:pPr>
-        <w:spacing w:line="360" w:lineRule="auto"/>
-        <w:ind w:firstLine="720"/>
-        <w:jc w:val="both"/>
-      </w:pPr>
-      <w:r>
-        <w:t xml:space="preserve">A análise é analítica e comparativa, confrontando os metadados das músicas recomendadas com o perfil original da persona para </w:t>
-      </w:r>
-      <w:proofErr w:type="spellStart"/>
-      <w:r>
-        <w:t>detetar</w:t>
-      </w:r>
-      <w:proofErr w:type="spellEnd"/>
-      <w:r>
-        <w:t xml:space="preserve"> desvios, repetições ou descobertas autênticas.</w:t>
-      </w:r>
-    </w:p>
-    <w:p>
-      <w:pPr>
-        <w:spacing w:line="360" w:lineRule="auto"/>
-        <w:ind w:firstLine="720"/>
         <w:jc w:val="both"/>
       </w:pPr>
     </w:p>
@@ -3736,6 +4038,7 @@
           <w:b/>
           <w:sz w:val="28"/>
           <w:szCs w:val="28"/>
+          <w:lang w:val="en-US"/>
         </w:rPr>
       </w:pPr>
       <w:r>
@@ -3744,8 +4047,8 @@
           <w:b/>
           <w:sz w:val="28"/>
           <w:szCs w:val="28"/>
-        </w:rPr>
-        <w:lastRenderedPageBreak/>
+          <w:lang w:val="en-US"/>
+        </w:rPr>
         <w:t xml:space="preserve">5 - REFERÊNCIAS  </w:t>
       </w:r>
     </w:p>
@@ -3760,24 +4063,19 @@
       <w:r>
         <w:rPr>
           <w:rFonts w:ascii="Arial" w:eastAsia="Arial" w:hAnsi="Arial" w:cs="Arial"/>
-        </w:rPr>
-        <w:t>CRESWELL, John W</w:t>
-      </w:r>
-      <w:r>
-        <w:rPr>
-          <w:rFonts w:ascii="Arial" w:eastAsia="Arial" w:hAnsi="Arial" w:cs="Arial"/>
-        </w:rPr>
-        <w:t>.</w:t>
+          <w:lang w:val="en-US"/>
+        </w:rPr>
+        <w:t>CRESWELL, John W.</w:t>
       </w:r>
       <w:r>
         <w:rPr>
           <w:rFonts w:ascii="Arial" w:eastAsia="Arial" w:hAnsi="Arial" w:cs="Arial"/>
           <w:b/>
           <w:bCs/>
+          <w:lang w:val="en-US"/>
         </w:rPr>
         <w:t xml:space="preserve"> </w:t>
       </w:r>
-      <w:proofErr w:type="spellStart"/>
       <w:r>
         <w:rPr>
           <w:rFonts w:ascii="Arial" w:eastAsia="Arial" w:hAnsi="Arial" w:cs="Arial"/>
@@ -3785,10 +4083,11 @@
           <w:bCs/>
           <w:i/>
           <w:iCs/>
-        </w:rPr>
-        <w:t>Research</w:t>
-      </w:r>
-      <w:proofErr w:type="spellEnd"/>
+          <w:lang w:val="en-US"/>
+        </w:rPr>
+        <w:t xml:space="preserve">Research design: qualitative, quantitative, and mixed methods </w:t>
+      </w:r>
+      <w:proofErr w:type="gramStart"/>
       <w:r>
         <w:rPr>
           <w:rFonts w:ascii="Arial" w:eastAsia="Arial" w:hAnsi="Arial" w:cs="Arial"/>
@@ -3796,10 +4095,112 @@
           <w:bCs/>
           <w:i/>
           <w:iCs/>
-        </w:rPr>
-        <w:t xml:space="preserve"> design: </w:t>
+          <w:lang w:val="en-US"/>
+        </w:rPr>
+        <w:t>approaches</w:t>
+      </w:r>
+      <w:proofErr w:type="gramEnd"/>
+      <w:r>
+        <w:rPr>
+          <w:rFonts w:ascii="Arial" w:eastAsia="Arial" w:hAnsi="Arial" w:cs="Arial"/>
+          <w:lang w:val="en-US"/>
+        </w:rPr>
+        <w:t xml:space="preserve">. </w:t>
+      </w:r>
+      <w:r>
+        <w:rPr>
+          <w:rFonts w:ascii="Arial" w:eastAsia="Arial" w:hAnsi="Arial" w:cs="Arial"/>
+        </w:rPr>
+        <w:t xml:space="preserve">4th ed. Thousand Oaks: SAGE </w:t>
       </w:r>
       <w:proofErr w:type="spellStart"/>
+      <w:r>
+        <w:rPr>
+          <w:rFonts w:ascii="Arial" w:eastAsia="Arial" w:hAnsi="Arial" w:cs="Arial"/>
+        </w:rPr>
+        <w:t>Publications</w:t>
+      </w:r>
+      <w:proofErr w:type="spellEnd"/>
+      <w:r>
+        <w:rPr>
+          <w:rFonts w:ascii="Arial" w:eastAsia="Arial" w:hAnsi="Arial" w:cs="Arial"/>
+        </w:rPr>
+        <w:t>, 2014.</w:t>
+      </w:r>
+    </w:p>
+    <w:p>
+      <w:pPr>
+        <w:spacing w:before="100" w:beforeAutospacing="1" w:line="360" w:lineRule="auto"/>
+        <w:jc w:val="both"/>
+        <w:rPr>
+          <w:rFonts w:ascii="Arial" w:eastAsia="Arial" w:hAnsi="Arial" w:cs="Arial"/>
+          <w:lang w:val="en-US"/>
+        </w:rPr>
+      </w:pPr>
+      <w:r>
+        <w:rPr>
+          <w:rFonts w:ascii="Arial" w:eastAsia="Arial" w:hAnsi="Arial" w:cs="Arial"/>
+        </w:rPr>
+        <w:lastRenderedPageBreak/>
+        <w:t xml:space="preserve">GIL, </w:t>
+      </w:r>
+      <w:proofErr w:type="spellStart"/>
+      <w:r>
+        <w:rPr>
+          <w:rFonts w:ascii="Arial" w:eastAsia="Arial" w:hAnsi="Arial" w:cs="Arial"/>
+        </w:rPr>
+        <w:t>Antonio</w:t>
+      </w:r>
+      <w:proofErr w:type="spellEnd"/>
+      <w:r>
+        <w:rPr>
+          <w:rFonts w:ascii="Arial" w:eastAsia="Arial" w:hAnsi="Arial" w:cs="Arial"/>
+        </w:rPr>
+        <w:t xml:space="preserve"> Carlos</w:t>
+      </w:r>
+      <w:r>
+        <w:rPr>
+          <w:rFonts w:ascii="Arial" w:eastAsia="Arial" w:hAnsi="Arial" w:cs="Arial"/>
+          <w:i/>
+        </w:rPr>
+        <w:t xml:space="preserve">. </w:t>
+      </w:r>
+      <w:r>
+        <w:rPr>
+          <w:rFonts w:ascii="Arial" w:eastAsia="Arial" w:hAnsi="Arial" w:cs="Arial"/>
+          <w:b/>
+        </w:rPr>
+        <w:t>Como elaborar projetos de pesquisa.</w:t>
+      </w:r>
+      <w:r>
+        <w:rPr>
+          <w:rFonts w:ascii="Arial" w:eastAsia="Arial" w:hAnsi="Arial" w:cs="Arial"/>
+        </w:rPr>
+        <w:t xml:space="preserve"> </w:t>
+      </w:r>
+      <w:r>
+        <w:rPr>
+          <w:rFonts w:ascii="Arial" w:eastAsia="Arial" w:hAnsi="Arial" w:cs="Arial"/>
+          <w:lang w:val="en-US"/>
+        </w:rPr>
+        <w:t>2. ed. SP: Atlas, 1991.</w:t>
+      </w:r>
+    </w:p>
+    <w:p>
+      <w:pPr>
+        <w:spacing w:before="100" w:beforeAutospacing="1" w:line="360" w:lineRule="auto"/>
+        <w:jc w:val="both"/>
+        <w:rPr>
+          <w:rFonts w:ascii="Arial" w:eastAsia="Arial" w:hAnsi="Arial" w:cs="Arial"/>
+        </w:rPr>
+      </w:pPr>
+      <w:r>
+        <w:rPr>
+          <w:rFonts w:ascii="Arial" w:eastAsia="Arial" w:hAnsi="Arial" w:cs="Arial"/>
+          <w:lang w:val="en-US"/>
+        </w:rPr>
+        <w:t xml:space="preserve">ROSS, Alex. </w:t>
+      </w:r>
       <w:r>
         <w:rPr>
           <w:rFonts w:ascii="Arial" w:eastAsia="Arial" w:hAnsi="Arial" w:cs="Arial"/>
@@ -3807,373 +4208,16 @@
           <w:bCs/>
           <w:i/>
           <w:iCs/>
-        </w:rPr>
-        <w:t>qualitative</w:t>
-      </w:r>
-      <w:proofErr w:type="spellEnd"/>
+          <w:lang w:val="en-US"/>
+        </w:rPr>
+        <w:t>The rest is noise: listening to the twentieth century</w:t>
+      </w:r>
       <w:r>
         <w:rPr>
           <w:rFonts w:ascii="Arial" w:eastAsia="Arial" w:hAnsi="Arial" w:cs="Arial"/>
           <w:b/>
           <w:bCs/>
-          <w:i/>
-          <w:iCs/>
-        </w:rPr>
-        <w:t xml:space="preserve">, </w:t>
-      </w:r>
-      <w:proofErr w:type="spellStart"/>
-      <w:r>
-        <w:rPr>
-          <w:rFonts w:ascii="Arial" w:eastAsia="Arial" w:hAnsi="Arial" w:cs="Arial"/>
-          <w:b/>
-          <w:bCs/>
-          <w:i/>
-          <w:iCs/>
-        </w:rPr>
-        <w:t>quantitative</w:t>
-      </w:r>
-      <w:proofErr w:type="spellEnd"/>
-      <w:r>
-        <w:rPr>
-          <w:rFonts w:ascii="Arial" w:eastAsia="Arial" w:hAnsi="Arial" w:cs="Arial"/>
-          <w:b/>
-          <w:bCs/>
-          <w:i/>
-          <w:iCs/>
-        </w:rPr>
-        <w:t xml:space="preserve">, </w:t>
-      </w:r>
-      <w:proofErr w:type="spellStart"/>
-      <w:r>
-        <w:rPr>
-          <w:rFonts w:ascii="Arial" w:eastAsia="Arial" w:hAnsi="Arial" w:cs="Arial"/>
-          <w:b/>
-          <w:bCs/>
-          <w:i/>
-          <w:iCs/>
-        </w:rPr>
-        <w:t>and</w:t>
-      </w:r>
-      <w:proofErr w:type="spellEnd"/>
-      <w:r>
-        <w:rPr>
-          <w:rFonts w:ascii="Arial" w:eastAsia="Arial" w:hAnsi="Arial" w:cs="Arial"/>
-          <w:b/>
-          <w:bCs/>
-          <w:i/>
-          <w:iCs/>
-        </w:rPr>
-        <w:t xml:space="preserve"> </w:t>
-      </w:r>
-      <w:proofErr w:type="spellStart"/>
-      <w:r>
-        <w:rPr>
-          <w:rFonts w:ascii="Arial" w:eastAsia="Arial" w:hAnsi="Arial" w:cs="Arial"/>
-          <w:b/>
-          <w:bCs/>
-          <w:i/>
-          <w:iCs/>
-        </w:rPr>
-        <w:t>mixed</w:t>
-      </w:r>
-      <w:proofErr w:type="spellEnd"/>
-      <w:r>
-        <w:rPr>
-          <w:rFonts w:ascii="Arial" w:eastAsia="Arial" w:hAnsi="Arial" w:cs="Arial"/>
-          <w:b/>
-          <w:bCs/>
-          <w:i/>
-          <w:iCs/>
-        </w:rPr>
-        <w:t xml:space="preserve"> </w:t>
-      </w:r>
-      <w:proofErr w:type="spellStart"/>
-      <w:r>
-        <w:rPr>
-          <w:rFonts w:ascii="Arial" w:eastAsia="Arial" w:hAnsi="Arial" w:cs="Arial"/>
-          <w:b/>
-          <w:bCs/>
-          <w:i/>
-          <w:iCs/>
-        </w:rPr>
-        <w:t>methods</w:t>
-      </w:r>
-      <w:proofErr w:type="spellEnd"/>
-      <w:r>
-        <w:rPr>
-          <w:rFonts w:ascii="Arial" w:eastAsia="Arial" w:hAnsi="Arial" w:cs="Arial"/>
-          <w:b/>
-          <w:bCs/>
-          <w:i/>
-          <w:iCs/>
-        </w:rPr>
-        <w:t xml:space="preserve"> approaches</w:t>
-      </w:r>
-      <w:r>
-        <w:rPr>
-          <w:rFonts w:ascii="Arial" w:eastAsia="Arial" w:hAnsi="Arial" w:cs="Arial"/>
-        </w:rPr>
-        <w:t xml:space="preserve">. 4th ed. Thousand Oaks: SAGE </w:t>
-      </w:r>
-      <w:proofErr w:type="spellStart"/>
-      <w:r>
-        <w:rPr>
-          <w:rFonts w:ascii="Arial" w:eastAsia="Arial" w:hAnsi="Arial" w:cs="Arial"/>
-        </w:rPr>
-        <w:t>Publications</w:t>
-      </w:r>
-      <w:proofErr w:type="spellEnd"/>
-      <w:r>
-        <w:rPr>
-          <w:rFonts w:ascii="Arial" w:eastAsia="Arial" w:hAnsi="Arial" w:cs="Arial"/>
-        </w:rPr>
-        <w:t>, 2014.</w:t>
-      </w:r>
-    </w:p>
-    <w:p>
-      <w:pPr>
-        <w:spacing w:before="100" w:beforeAutospacing="1" w:line="360" w:lineRule="auto"/>
-        <w:jc w:val="both"/>
-        <w:rPr>
-          <w:rFonts w:ascii="Arial" w:eastAsia="Arial" w:hAnsi="Arial" w:cs="Arial"/>
-        </w:rPr>
-      </w:pPr>
-      <w:r>
-        <w:rPr>
-          <w:rFonts w:ascii="Arial" w:eastAsia="Arial" w:hAnsi="Arial" w:cs="Arial"/>
-        </w:rPr>
-        <w:t xml:space="preserve">GIL, </w:t>
-      </w:r>
-      <w:proofErr w:type="spellStart"/>
-      <w:r>
-        <w:rPr>
-          <w:rFonts w:ascii="Arial" w:eastAsia="Arial" w:hAnsi="Arial" w:cs="Arial"/>
-        </w:rPr>
-        <w:t>Antonio</w:t>
-      </w:r>
-      <w:proofErr w:type="spellEnd"/>
-      <w:r>
-        <w:rPr>
-          <w:rFonts w:ascii="Arial" w:eastAsia="Arial" w:hAnsi="Arial" w:cs="Arial"/>
-        </w:rPr>
-        <w:t xml:space="preserve"> Carlos</w:t>
-      </w:r>
-      <w:r>
-        <w:rPr>
-          <w:rFonts w:ascii="Arial" w:eastAsia="Arial" w:hAnsi="Arial" w:cs="Arial"/>
-          <w:i/>
-        </w:rPr>
-        <w:t xml:space="preserve">. </w:t>
-      </w:r>
-      <w:r>
-        <w:rPr>
-          <w:rFonts w:ascii="Arial" w:eastAsia="Arial" w:hAnsi="Arial" w:cs="Arial"/>
-          <w:b/>
-        </w:rPr>
-        <w:t>Como elaborar projetos de pesquisa.</w:t>
-      </w:r>
-      <w:r>
-        <w:rPr>
-          <w:rFonts w:ascii="Arial" w:eastAsia="Arial" w:hAnsi="Arial" w:cs="Arial"/>
-        </w:rPr>
-        <w:t xml:space="preserve"> 2. ed. SP: Atlas, 1991.</w:t>
-      </w:r>
-    </w:p>
-    <w:p>
-      <w:pPr>
-        <w:spacing w:before="100" w:beforeAutospacing="1" w:line="360" w:lineRule="auto"/>
-        <w:jc w:val="both"/>
-        <w:rPr>
-          <w:rFonts w:ascii="Arial" w:eastAsia="Arial" w:hAnsi="Arial" w:cs="Arial"/>
-        </w:rPr>
-      </w:pPr>
-      <w:r>
-        <w:rPr>
-          <w:rFonts w:ascii="Arial" w:eastAsia="Arial" w:hAnsi="Arial" w:cs="Arial"/>
-        </w:rPr>
-        <w:t xml:space="preserve">ROSS, Alex. </w:t>
-      </w:r>
-      <w:r>
-        <w:rPr>
-          <w:rFonts w:ascii="Arial" w:eastAsia="Arial" w:hAnsi="Arial" w:cs="Arial"/>
-          <w:b/>
-          <w:bCs/>
-          <w:i/>
-          <w:iCs/>
-        </w:rPr>
-        <w:t xml:space="preserve">The </w:t>
-      </w:r>
-      <w:proofErr w:type="spellStart"/>
-      <w:r>
-        <w:rPr>
-          <w:rFonts w:ascii="Arial" w:eastAsia="Arial" w:hAnsi="Arial" w:cs="Arial"/>
-          <w:b/>
-          <w:bCs/>
-          <w:i/>
-          <w:iCs/>
-        </w:rPr>
-        <w:t>rest</w:t>
-      </w:r>
-      <w:proofErr w:type="spellEnd"/>
-      <w:r>
-        <w:rPr>
-          <w:rFonts w:ascii="Arial" w:eastAsia="Arial" w:hAnsi="Arial" w:cs="Arial"/>
-          <w:b/>
-          <w:bCs/>
-          <w:i/>
-          <w:iCs/>
-        </w:rPr>
-        <w:t xml:space="preserve"> </w:t>
-      </w:r>
-      <w:proofErr w:type="spellStart"/>
-      <w:r>
-        <w:rPr>
-          <w:rFonts w:ascii="Arial" w:eastAsia="Arial" w:hAnsi="Arial" w:cs="Arial"/>
-          <w:b/>
-          <w:bCs/>
-          <w:i/>
-          <w:iCs/>
-        </w:rPr>
-        <w:t>is</w:t>
-      </w:r>
-      <w:proofErr w:type="spellEnd"/>
-      <w:r>
-        <w:rPr>
-          <w:rFonts w:ascii="Arial" w:eastAsia="Arial" w:hAnsi="Arial" w:cs="Arial"/>
-          <w:b/>
-          <w:bCs/>
-          <w:i/>
-          <w:iCs/>
-        </w:rPr>
-        <w:t xml:space="preserve"> </w:t>
-      </w:r>
-      <w:proofErr w:type="spellStart"/>
-      <w:r>
-        <w:rPr>
-          <w:rFonts w:ascii="Arial" w:eastAsia="Arial" w:hAnsi="Arial" w:cs="Arial"/>
-          <w:b/>
-          <w:bCs/>
-          <w:i/>
-          <w:iCs/>
-        </w:rPr>
-        <w:t>noise</w:t>
-      </w:r>
-      <w:proofErr w:type="spellEnd"/>
-      <w:r>
-        <w:rPr>
-          <w:rFonts w:ascii="Arial" w:eastAsia="Arial" w:hAnsi="Arial" w:cs="Arial"/>
-          <w:b/>
-          <w:bCs/>
-          <w:i/>
-          <w:iCs/>
-        </w:rPr>
-        <w:t xml:space="preserve">: </w:t>
-      </w:r>
-      <w:proofErr w:type="spellStart"/>
-      <w:r>
-        <w:rPr>
-          <w:rFonts w:ascii="Arial" w:eastAsia="Arial" w:hAnsi="Arial" w:cs="Arial"/>
-          <w:b/>
-          <w:bCs/>
-          <w:i/>
-          <w:iCs/>
-        </w:rPr>
-        <w:t>listening</w:t>
-      </w:r>
-      <w:proofErr w:type="spellEnd"/>
-      <w:r>
-        <w:rPr>
-          <w:rFonts w:ascii="Arial" w:eastAsia="Arial" w:hAnsi="Arial" w:cs="Arial"/>
-          <w:b/>
-          <w:bCs/>
-          <w:i/>
-          <w:iCs/>
-        </w:rPr>
-        <w:t xml:space="preserve"> </w:t>
-      </w:r>
-      <w:proofErr w:type="spellStart"/>
-      <w:r>
-        <w:rPr>
-          <w:rFonts w:ascii="Arial" w:eastAsia="Arial" w:hAnsi="Arial" w:cs="Arial"/>
-          <w:b/>
-          <w:bCs/>
-          <w:i/>
-          <w:iCs/>
-        </w:rPr>
-        <w:t>to</w:t>
-      </w:r>
-      <w:proofErr w:type="spellEnd"/>
-      <w:r>
-        <w:rPr>
-          <w:rFonts w:ascii="Arial" w:eastAsia="Arial" w:hAnsi="Arial" w:cs="Arial"/>
-          <w:b/>
-          <w:bCs/>
-          <w:i/>
-          <w:iCs/>
-        </w:rPr>
-        <w:t xml:space="preserve"> </w:t>
-      </w:r>
-      <w:proofErr w:type="spellStart"/>
-      <w:r>
-        <w:rPr>
-          <w:rFonts w:ascii="Arial" w:eastAsia="Arial" w:hAnsi="Arial" w:cs="Arial"/>
-          <w:b/>
-          <w:bCs/>
-          <w:i/>
-          <w:iCs/>
-        </w:rPr>
-        <w:t>the</w:t>
-      </w:r>
-      <w:proofErr w:type="spellEnd"/>
-      <w:r>
-        <w:rPr>
-          <w:rFonts w:ascii="Arial" w:eastAsia="Arial" w:hAnsi="Arial" w:cs="Arial"/>
-          <w:b/>
-          <w:bCs/>
-          <w:i/>
-          <w:iCs/>
-        </w:rPr>
-        <w:t xml:space="preserve"> </w:t>
-      </w:r>
-      <w:proofErr w:type="spellStart"/>
-      <w:r>
-        <w:rPr>
-          <w:rFonts w:ascii="Arial" w:eastAsia="Arial" w:hAnsi="Arial" w:cs="Arial"/>
-          <w:b/>
-          <w:bCs/>
-          <w:i/>
-          <w:iCs/>
-        </w:rPr>
-        <w:t>twentieth</w:t>
-      </w:r>
-      <w:proofErr w:type="spellEnd"/>
-      <w:r>
-        <w:rPr>
-          <w:rFonts w:ascii="Arial" w:eastAsia="Arial" w:hAnsi="Arial" w:cs="Arial"/>
-          <w:b/>
-          <w:bCs/>
-          <w:i/>
-          <w:iCs/>
-        </w:rPr>
-        <w:t xml:space="preserve"> </w:t>
-      </w:r>
-      <w:proofErr w:type="spellStart"/>
-      <w:r>
-        <w:rPr>
-          <w:rFonts w:ascii="Arial" w:eastAsia="Arial" w:hAnsi="Arial" w:cs="Arial"/>
-          <w:b/>
-          <w:bCs/>
-          <w:i/>
-          <w:iCs/>
-        </w:rPr>
-        <w:t>century</w:t>
-      </w:r>
-      <w:proofErr w:type="spellEnd"/>
-      <w:r>
-        <w:rPr>
-          <w:rFonts w:ascii="Arial" w:eastAsia="Arial" w:hAnsi="Arial" w:cs="Arial"/>
-          <w:b/>
-          <w:bCs/>
+          <w:lang w:val="en-US"/>
         </w:rPr>
         <w:t xml:space="preserve">. </w:t>
       </w:r>
@@ -5951,6 +5995,95 @@
     </w:lvl>
   </w:abstractNum>
   <w:abstractNum w:abstractNumId="12" w15:restartNumberingAfterBreak="0">
+    <w:nsid w:val="40523D86"/>
+    <w:multiLevelType w:val="hybridMultilevel"/>
+    <w:tmpl w:val="F2E4C17A"/>
+    <w:lvl w:ilvl="0" w:tplc="7D5A85C8">
+      <w:start w:val="1"/>
+      <w:numFmt w:val="lowerRoman"/>
+      <w:lvlText w:val="(%1)"/>
+      <w:lvlJc w:val="left"/>
+      <w:pPr>
+        <w:ind w:left="1440" w:hanging="720"/>
+      </w:pPr>
+      <w:rPr>
+        <w:rFonts w:hint="default"/>
+      </w:rPr>
+    </w:lvl>
+    <w:lvl w:ilvl="1" w:tplc="04160019" w:tentative="1">
+      <w:start w:val="1"/>
+      <w:numFmt w:val="lowerLetter"/>
+      <w:lvlText w:val="%2."/>
+      <w:lvlJc w:val="left"/>
+      <w:pPr>
+        <w:ind w:left="1800" w:hanging="360"/>
+      </w:pPr>
+    </w:lvl>
+    <w:lvl w:ilvl="2" w:tplc="0416001B" w:tentative="1">
+      <w:start w:val="1"/>
+      <w:numFmt w:val="lowerRoman"/>
+      <w:lvlText w:val="%3."/>
+      <w:lvlJc w:val="right"/>
+      <w:pPr>
+        <w:ind w:left="2520" w:hanging="180"/>
+      </w:pPr>
+    </w:lvl>
+    <w:lvl w:ilvl="3" w:tplc="0416000F" w:tentative="1">
+      <w:start w:val="1"/>
+      <w:numFmt w:val="decimal"/>
+      <w:lvlText w:val="%4."/>
+      <w:lvlJc w:val="left"/>
+      <w:pPr>
+        <w:ind w:left="3240" w:hanging="360"/>
+      </w:pPr>
+    </w:lvl>
+    <w:lvl w:ilvl="4" w:tplc="04160019" w:tentative="1">
+      <w:start w:val="1"/>
+      <w:numFmt w:val="lowerLetter"/>
+      <w:lvlText w:val="%5."/>
+      <w:lvlJc w:val="left"/>
+      <w:pPr>
+        <w:ind w:left="3960" w:hanging="360"/>
+      </w:pPr>
+    </w:lvl>
+    <w:lvl w:ilvl="5" w:tplc="0416001B" w:tentative="1">
+      <w:start w:val="1"/>
+      <w:numFmt w:val="lowerRoman"/>
+      <w:lvlText w:val="%6."/>
+      <w:lvlJc w:val="right"/>
+      <w:pPr>
+        <w:ind w:left="4680" w:hanging="180"/>
+      </w:pPr>
+    </w:lvl>
+    <w:lvl w:ilvl="6" w:tplc="0416000F" w:tentative="1">
+      <w:start w:val="1"/>
+      <w:numFmt w:val="decimal"/>
+      <w:lvlText w:val="%7."/>
+      <w:lvlJc w:val="left"/>
+      <w:pPr>
+        <w:ind w:left="5400" w:hanging="360"/>
+      </w:pPr>
+    </w:lvl>
+    <w:lvl w:ilvl="7" w:tplc="04160019" w:tentative="1">
+      <w:start w:val="1"/>
+      <w:numFmt w:val="lowerLetter"/>
+      <w:lvlText w:val="%8."/>
+      <w:lvlJc w:val="left"/>
+      <w:pPr>
+        <w:ind w:left="6120" w:hanging="360"/>
+      </w:pPr>
+    </w:lvl>
+    <w:lvl w:ilvl="8" w:tplc="0416001B" w:tentative="1">
+      <w:start w:val="1"/>
+      <w:numFmt w:val="lowerRoman"/>
+      <w:lvlText w:val="%9."/>
+      <w:lvlJc w:val="right"/>
+      <w:pPr>
+        <w:ind w:left="6840" w:hanging="180"/>
+      </w:pPr>
+    </w:lvl>
+  </w:abstractNum>
+  <w:abstractNum w:abstractNumId="13" w15:restartNumberingAfterBreak="0">
     <w:nsid w:val="48163CC9"/>
     <w:multiLevelType w:val="multilevel"/>
     <w:tmpl w:val="4A4A5054"/>
@@ -6063,7 +6196,7 @@
       </w:rPr>
     </w:lvl>
   </w:abstractNum>
-  <w:abstractNum w:abstractNumId="13" w15:restartNumberingAfterBreak="0">
+  <w:abstractNum w:abstractNumId="14" w15:restartNumberingAfterBreak="0">
     <w:nsid w:val="4E6A79F5"/>
     <w:multiLevelType w:val="hybridMultilevel"/>
     <w:tmpl w:val="DF66EBA6"/>
@@ -6176,7 +6309,7 @@
       </w:rPr>
     </w:lvl>
   </w:abstractNum>
-  <w:abstractNum w:abstractNumId="14" w15:restartNumberingAfterBreak="0">
+  <w:abstractNum w:abstractNumId="15" w15:restartNumberingAfterBreak="0">
     <w:nsid w:val="55F154FF"/>
     <w:multiLevelType w:val="multilevel"/>
     <w:tmpl w:val="F0A2FD32"/>
@@ -6298,7 +6431,7 @@
       </w:rPr>
     </w:lvl>
   </w:abstractNum>
-  <w:abstractNum w:abstractNumId="15" w15:restartNumberingAfterBreak="0">
+  <w:abstractNum w:abstractNumId="16" w15:restartNumberingAfterBreak="0">
     <w:nsid w:val="563D3039"/>
     <w:multiLevelType w:val="hybridMultilevel"/>
     <w:tmpl w:val="D6FAD3B0"/>
@@ -6411,7 +6544,7 @@
       </w:rPr>
     </w:lvl>
   </w:abstractNum>
-  <w:abstractNum w:abstractNumId="16" w15:restartNumberingAfterBreak="0">
+  <w:abstractNum w:abstractNumId="17" w15:restartNumberingAfterBreak="0">
     <w:nsid w:val="56717210"/>
     <w:multiLevelType w:val="multilevel"/>
     <w:tmpl w:val="1EC4C46A"/>
@@ -6501,7 +6634,7 @@
       </w:pPr>
     </w:lvl>
   </w:abstractNum>
-  <w:abstractNum w:abstractNumId="17" w15:restartNumberingAfterBreak="0">
+  <w:abstractNum w:abstractNumId="18" w15:restartNumberingAfterBreak="0">
     <w:nsid w:val="6658784E"/>
     <w:multiLevelType w:val="multilevel"/>
     <w:tmpl w:val="542A6052"/>
@@ -6623,7 +6756,7 @@
       </w:rPr>
     </w:lvl>
   </w:abstractNum>
-  <w:abstractNum w:abstractNumId="18" w15:restartNumberingAfterBreak="0">
+  <w:abstractNum w:abstractNumId="19" w15:restartNumberingAfterBreak="0">
     <w:nsid w:val="6F5D04EC"/>
     <w:multiLevelType w:val="hybridMultilevel"/>
     <w:tmpl w:val="E2C8A680"/>
@@ -6736,7 +6869,7 @@
       </w:rPr>
     </w:lvl>
   </w:abstractNum>
-  <w:abstractNum w:abstractNumId="19" w15:restartNumberingAfterBreak="0">
+  <w:abstractNum w:abstractNumId="20" w15:restartNumberingAfterBreak="0">
     <w:nsid w:val="70D73545"/>
     <w:multiLevelType w:val="multilevel"/>
     <w:tmpl w:val="A11A019E"/>
@@ -6885,7 +7018,7 @@
       </w:rPr>
     </w:lvl>
   </w:abstractNum>
-  <w:abstractNum w:abstractNumId="20" w15:restartNumberingAfterBreak="0">
+  <w:abstractNum w:abstractNumId="21" w15:restartNumberingAfterBreak="0">
     <w:nsid w:val="71551C0C"/>
     <w:multiLevelType w:val="hybridMultilevel"/>
     <w:tmpl w:val="6C6C0180"/>
@@ -6998,7 +7131,7 @@
       </w:rPr>
     </w:lvl>
   </w:abstractNum>
-  <w:abstractNum w:abstractNumId="21" w15:restartNumberingAfterBreak="0">
+  <w:abstractNum w:abstractNumId="22" w15:restartNumberingAfterBreak="0">
     <w:nsid w:val="78C328B4"/>
     <w:multiLevelType w:val="hybridMultilevel"/>
     <w:tmpl w:val="629C8768"/>
@@ -7111,14 +7244,163 @@
       </w:rPr>
     </w:lvl>
   </w:abstractNum>
+  <w:abstractNum w:abstractNumId="23" w15:restartNumberingAfterBreak="0">
+    <w:nsid w:val="7BB94DE5"/>
+    <w:multiLevelType w:val="multilevel"/>
+    <w:tmpl w:val="188AB08A"/>
+    <w:lvl w:ilvl="0">
+      <w:start w:val="1"/>
+      <w:numFmt w:val="bullet"/>
+      <w:lvlText w:val=""/>
+      <w:lvlJc w:val="left"/>
+      <w:pPr>
+        <w:tabs>
+          <w:tab w:val="num" w:pos="720"/>
+        </w:tabs>
+        <w:ind w:left="720" w:hanging="360"/>
+      </w:pPr>
+      <w:rPr>
+        <w:rFonts w:ascii="Symbol" w:hAnsi="Symbol" w:hint="default"/>
+        <w:sz w:val="20"/>
+      </w:rPr>
+    </w:lvl>
+    <w:lvl w:ilvl="1" w:tentative="1">
+      <w:start w:val="1"/>
+      <w:numFmt w:val="bullet"/>
+      <w:lvlText w:val="o"/>
+      <w:lvlJc w:val="left"/>
+      <w:pPr>
+        <w:tabs>
+          <w:tab w:val="num" w:pos="1440"/>
+        </w:tabs>
+        <w:ind w:left="1440" w:hanging="360"/>
+      </w:pPr>
+      <w:rPr>
+        <w:rFonts w:ascii="Courier New" w:hAnsi="Courier New" w:hint="default"/>
+        <w:sz w:val="20"/>
+      </w:rPr>
+    </w:lvl>
+    <w:lvl w:ilvl="2" w:tentative="1">
+      <w:start w:val="1"/>
+      <w:numFmt w:val="bullet"/>
+      <w:lvlText w:val=""/>
+      <w:lvlJc w:val="left"/>
+      <w:pPr>
+        <w:tabs>
+          <w:tab w:val="num" w:pos="2160"/>
+        </w:tabs>
+        <w:ind w:left="2160" w:hanging="360"/>
+      </w:pPr>
+      <w:rPr>
+        <w:rFonts w:ascii="Wingdings" w:hAnsi="Wingdings" w:hint="default"/>
+        <w:sz w:val="20"/>
+      </w:rPr>
+    </w:lvl>
+    <w:lvl w:ilvl="3" w:tentative="1">
+      <w:start w:val="1"/>
+      <w:numFmt w:val="bullet"/>
+      <w:lvlText w:val=""/>
+      <w:lvlJc w:val="left"/>
+      <w:pPr>
+        <w:tabs>
+          <w:tab w:val="num" w:pos="2880"/>
+        </w:tabs>
+        <w:ind w:left="2880" w:hanging="360"/>
+      </w:pPr>
+      <w:rPr>
+        <w:rFonts w:ascii="Wingdings" w:hAnsi="Wingdings" w:hint="default"/>
+        <w:sz w:val="20"/>
+      </w:rPr>
+    </w:lvl>
+    <w:lvl w:ilvl="4" w:tentative="1">
+      <w:start w:val="1"/>
+      <w:numFmt w:val="bullet"/>
+      <w:lvlText w:val=""/>
+      <w:lvlJc w:val="left"/>
+      <w:pPr>
+        <w:tabs>
+          <w:tab w:val="num" w:pos="3600"/>
+        </w:tabs>
+        <w:ind w:left="3600" w:hanging="360"/>
+      </w:pPr>
+      <w:rPr>
+        <w:rFonts w:ascii="Wingdings" w:hAnsi="Wingdings" w:hint="default"/>
+        <w:sz w:val="20"/>
+      </w:rPr>
+    </w:lvl>
+    <w:lvl w:ilvl="5" w:tentative="1">
+      <w:start w:val="1"/>
+      <w:numFmt w:val="bullet"/>
+      <w:lvlText w:val=""/>
+      <w:lvlJc w:val="left"/>
+      <w:pPr>
+        <w:tabs>
+          <w:tab w:val="num" w:pos="4320"/>
+        </w:tabs>
+        <w:ind w:left="4320" w:hanging="360"/>
+      </w:pPr>
+      <w:rPr>
+        <w:rFonts w:ascii="Wingdings" w:hAnsi="Wingdings" w:hint="default"/>
+        <w:sz w:val="20"/>
+      </w:rPr>
+    </w:lvl>
+    <w:lvl w:ilvl="6" w:tentative="1">
+      <w:start w:val="1"/>
+      <w:numFmt w:val="bullet"/>
+      <w:lvlText w:val=""/>
+      <w:lvlJc w:val="left"/>
+      <w:pPr>
+        <w:tabs>
+          <w:tab w:val="num" w:pos="5040"/>
+        </w:tabs>
+        <w:ind w:left="5040" w:hanging="360"/>
+      </w:pPr>
+      <w:rPr>
+        <w:rFonts w:ascii="Wingdings" w:hAnsi="Wingdings" w:hint="default"/>
+        <w:sz w:val="20"/>
+      </w:rPr>
+    </w:lvl>
+    <w:lvl w:ilvl="7" w:tentative="1">
+      <w:start w:val="1"/>
+      <w:numFmt w:val="bullet"/>
+      <w:lvlText w:val=""/>
+      <w:lvlJc w:val="left"/>
+      <w:pPr>
+        <w:tabs>
+          <w:tab w:val="num" w:pos="5760"/>
+        </w:tabs>
+        <w:ind w:left="5760" w:hanging="360"/>
+      </w:pPr>
+      <w:rPr>
+        <w:rFonts w:ascii="Wingdings" w:hAnsi="Wingdings" w:hint="default"/>
+        <w:sz w:val="20"/>
+      </w:rPr>
+    </w:lvl>
+    <w:lvl w:ilvl="8" w:tentative="1">
+      <w:start w:val="1"/>
+      <w:numFmt w:val="bullet"/>
+      <w:lvlText w:val=""/>
+      <w:lvlJc w:val="left"/>
+      <w:pPr>
+        <w:tabs>
+          <w:tab w:val="num" w:pos="6480"/>
+        </w:tabs>
+        <w:ind w:left="6480" w:hanging="360"/>
+      </w:pPr>
+      <w:rPr>
+        <w:rFonts w:ascii="Wingdings" w:hAnsi="Wingdings" w:hint="default"/>
+        <w:sz w:val="20"/>
+      </w:rPr>
+    </w:lvl>
+  </w:abstractNum>
   <w:num w:numId="1" w16cid:durableId="1974288719">
-    <w:abstractNumId w:val="12"/>
+    <w:abstractNumId w:val="13"/>
   </w:num>
   <w:num w:numId="2" w16cid:durableId="509101378">
-    <w:abstractNumId w:val="16"/>
+    <w:abstractNumId w:val="17"/>
   </w:num>
   <w:num w:numId="3" w16cid:durableId="1053500717">
-    <w:abstractNumId w:val="14"/>
+    <w:abstractNumId w:val="15"/>
   </w:num>
   <w:num w:numId="4" w16cid:durableId="520511790">
     <w:abstractNumId w:val="2"/>
@@ -7130,10 +7412,10 @@
     <w:abstractNumId w:val="11"/>
   </w:num>
   <w:num w:numId="7" w16cid:durableId="1803814535">
-    <w:abstractNumId w:val="17"/>
+    <w:abstractNumId w:val="18"/>
   </w:num>
   <w:num w:numId="8" w16cid:durableId="1136990806">
-    <w:abstractNumId w:val="21"/>
+    <w:abstractNumId w:val="22"/>
   </w:num>
   <w:num w:numId="9" w16cid:durableId="329648185">
     <w:abstractNumId w:val="3"/>
@@ -7142,7 +7424,7 @@
     <w:abstractNumId w:val="6"/>
   </w:num>
   <w:num w:numId="11" w16cid:durableId="1103840041">
-    <w:abstractNumId w:val="19"/>
+    <w:abstractNumId w:val="20"/>
   </w:num>
   <w:num w:numId="12" w16cid:durableId="2068646685">
     <w:abstractNumId w:val="7"/>
@@ -7157,7 +7439,7 @@
     <w:abstractNumId w:val="8"/>
   </w:num>
   <w:num w:numId="16" w16cid:durableId="149248295">
-    <w:abstractNumId w:val="20"/>
+    <w:abstractNumId w:val="21"/>
   </w:num>
   <w:num w:numId="17" w16cid:durableId="760103820">
     <w:abstractNumId w:val="1"/>
@@ -7166,16 +7448,22 @@
     <w:abstractNumId w:val="9"/>
   </w:num>
   <w:num w:numId="19" w16cid:durableId="1785343297">
-    <w:abstractNumId w:val="13"/>
+    <w:abstractNumId w:val="14"/>
   </w:num>
   <w:num w:numId="20" w16cid:durableId="1143890883">
-    <w:abstractNumId w:val="15"/>
+    <w:abstractNumId w:val="16"/>
   </w:num>
   <w:num w:numId="21" w16cid:durableId="1768576944">
     <w:abstractNumId w:val="10"/>
   </w:num>
   <w:num w:numId="22" w16cid:durableId="1850172175">
-    <w:abstractNumId w:val="18"/>
+    <w:abstractNumId w:val="19"/>
+  </w:num>
+  <w:num w:numId="23" w16cid:durableId="428817009">
+    <w:abstractNumId w:val="23"/>
+  </w:num>
+  <w:num w:numId="24" w16cid:durableId="1757362501">
+    <w:abstractNumId w:val="12"/>
   </w:num>
 </w:numbering>
 </file>
@@ -7793,6 +8081,22 @@
       <w:spacing w:before="100" w:beforeAutospacing="1" w:after="100" w:afterAutospacing="1"/>
     </w:pPr>
   </w:style>
+  <w:style w:type="table" w:styleId="Tabelacomgrade">
+    <w:name w:val="Table Grid"/>
+    <w:basedOn w:val="Tabelanormal"/>
+    <w:uiPriority w:val="39"/>
+    <w:rsid w:val="00D302C9"/>
+    <w:tblPr>
+      <w:tblBorders>
+        <w:top w:val="single" w:sz="4" w:space="0" w:color="auto"/>
+        <w:left w:val="single" w:sz="4" w:space="0" w:color="auto"/>
+        <w:bottom w:val="single" w:sz="4" w:space="0" w:color="auto"/>
+        <w:right w:val="single" w:sz="4" w:space="0" w:color="auto"/>
+        <w:insideH w:val="single" w:sz="4" w:space="0" w:color="auto"/>
+        <w:insideV w:val="single" w:sz="4" w:space="0" w:color="auto"/>
+      </w:tblBorders>
+    </w:tblPr>
+  </w:style>
 </w:styles>
 </file>
 

</xml_diff>

<commit_message>
att docs e readme
</commit_message>
<xml_diff>
--- a/docs/TCC/doc_tcc1.docx
+++ b/docs/TCC/doc_tcc1.docx
@@ -9,26 +9,6 @@
           <w:rFonts w:ascii="Arial" w:eastAsia="Arial" w:hAnsi="Arial" w:cs="Arial"/>
         </w:rPr>
       </w:pPr>
-    </w:p>
-    <w:p>
-      <w:pPr>
-        <w:jc w:val="center"/>
-        <w:rPr>
-          <w:rFonts w:ascii="Arial" w:eastAsia="Arial" w:hAnsi="Arial" w:cs="Arial"/>
-          <w:sz w:val="28"/>
-          <w:szCs w:val="28"/>
-        </w:rPr>
-      </w:pPr>
-    </w:p>
-    <w:p>
-      <w:pPr>
-        <w:jc w:val="center"/>
-        <w:rPr>
-          <w:rFonts w:ascii="Arial" w:eastAsia="Arial" w:hAnsi="Arial" w:cs="Arial"/>
-          <w:sz w:val="28"/>
-          <w:szCs w:val="28"/>
-        </w:rPr>
-      </w:pPr>
       <w:r>
         <w:rPr>
           <w:rFonts w:ascii="Arial" w:eastAsia="Arial" w:hAnsi="Arial" w:cs="Arial"/>
@@ -42,8 +22,6 @@
         <w:rPr>
           <w:rFonts w:ascii="Arial" w:eastAsia="Arial" w:hAnsi="Arial" w:cs="Arial"/>
           <w:b/>
-          <w:sz w:val="28"/>
-          <w:szCs w:val="28"/>
         </w:rPr>
         <w:t>UNIVERSIDADE FEDERAL DE UBERLÂNDIA</w:t>
       </w:r>
@@ -53,16 +31,12 @@
         <w:jc w:val="center"/>
         <w:rPr>
           <w:rFonts w:ascii="Arial" w:eastAsia="Arial" w:hAnsi="Arial" w:cs="Arial"/>
-          <w:sz w:val="28"/>
-          <w:szCs w:val="28"/>
         </w:rPr>
       </w:pPr>
       <w:r>
         <w:rPr>
           <w:rFonts w:ascii="Arial" w:eastAsia="Arial" w:hAnsi="Arial" w:cs="Arial"/>
           <w:b/>
-          <w:sz w:val="28"/>
-          <w:szCs w:val="28"/>
         </w:rPr>
         <w:t>FACULDADE</w:t>
       </w:r>
@@ -70,8 +44,6 @@
         <w:rPr>
           <w:rFonts w:ascii="Arial" w:eastAsia="Arial" w:hAnsi="Arial" w:cs="Arial"/>
           <w:b/>
-          <w:sz w:val="28"/>
-          <w:szCs w:val="28"/>
         </w:rPr>
         <w:t xml:space="preserve"> DE GESTÃO E NEGÓCIOS</w:t>
       </w:r>
@@ -87,8 +59,6 @@
         <w:rPr>
           <w:rFonts w:ascii="Arial" w:eastAsia="Arial" w:hAnsi="Arial" w:cs="Arial"/>
           <w:b/>
-          <w:sz w:val="28"/>
-          <w:szCs w:val="28"/>
         </w:rPr>
         <w:t xml:space="preserve">CURSO DE </w:t>
       </w:r>
@@ -96,8 +66,6 @@
         <w:rPr>
           <w:rFonts w:ascii="Arial" w:eastAsia="Arial" w:hAnsi="Arial" w:cs="Arial"/>
           <w:b/>
-          <w:sz w:val="28"/>
-          <w:szCs w:val="28"/>
         </w:rPr>
         <w:t>GESTÃO DA INFORMAÇÃO</w:t>
       </w:r>
@@ -165,6 +133,45 @@
     </w:p>
     <w:p>
       <w:pPr>
+        <w:jc w:val="center"/>
+        <w:rPr>
+          <w:rFonts w:ascii="Arial" w:eastAsia="Arial" w:hAnsi="Arial" w:cs="Arial"/>
+          <w:b/>
+          <w:bCs/>
+        </w:rPr>
+      </w:pPr>
+      <w:r>
+        <w:rPr>
+          <w:rFonts w:ascii="Arial" w:eastAsia="Arial" w:hAnsi="Arial" w:cs="Arial"/>
+          <w:b/>
+          <w:bCs/>
+        </w:rPr>
+        <w:t>MARCOS RODRIGUES DE OLIVEIRA JÚNIOR</w:t>
+      </w:r>
+    </w:p>
+    <w:p>
+      <w:pPr>
+        <w:rPr>
+          <w:rFonts w:ascii="Arial" w:eastAsia="Arial" w:hAnsi="Arial" w:cs="Arial"/>
+        </w:rPr>
+      </w:pPr>
+    </w:p>
+    <w:p>
+      <w:pPr>
+        <w:rPr>
+          <w:rFonts w:ascii="Arial" w:eastAsia="Arial" w:hAnsi="Arial" w:cs="Arial"/>
+        </w:rPr>
+      </w:pPr>
+    </w:p>
+    <w:p>
+      <w:pPr>
+        <w:rPr>
+          <w:rFonts w:ascii="Arial" w:eastAsia="Arial" w:hAnsi="Arial" w:cs="Arial"/>
+        </w:rPr>
+      </w:pPr>
+    </w:p>
+    <w:p>
+      <w:pPr>
         <w:rPr>
           <w:rFonts w:ascii="Arial" w:eastAsia="Arial" w:hAnsi="Arial" w:cs="Arial"/>
         </w:rPr>
@@ -198,45 +205,6 @@
     </w:p>
     <w:p>
       <w:pPr>
-        <w:rPr>
-          <w:rFonts w:ascii="Arial" w:eastAsia="Arial" w:hAnsi="Arial" w:cs="Arial"/>
-        </w:rPr>
-      </w:pPr>
-    </w:p>
-    <w:p>
-      <w:pPr>
-        <w:jc w:val="center"/>
-        <w:rPr>
-          <w:rFonts w:ascii="Arial" w:eastAsia="Arial" w:hAnsi="Arial" w:cs="Arial"/>
-        </w:rPr>
-      </w:pPr>
-      <w:r>
-        <w:rPr>
-          <w:rFonts w:ascii="Arial" w:eastAsia="Arial" w:hAnsi="Arial" w:cs="Arial"/>
-          <w:b/>
-          <w:color w:val="000000"/>
-          <w:sz w:val="28"/>
-          <w:szCs w:val="28"/>
-        </w:rPr>
-        <w:t>Auditoria de Sistemas de Inteligência Artificial em Plataformas de Streaming: Um Estudo Experimental sobre Vieses e Recomendação Musical no Spotify</w:t>
-      </w:r>
-    </w:p>
-    <w:p>
-      <w:pPr>
-        <w:rPr>
-          <w:rFonts w:ascii="Arial" w:eastAsia="Arial" w:hAnsi="Arial" w:cs="Arial"/>
-        </w:rPr>
-      </w:pPr>
-    </w:p>
-    <w:p>
-      <w:pPr>
-        <w:rPr>
-          <w:rFonts w:ascii="Arial" w:eastAsia="Arial" w:hAnsi="Arial" w:cs="Arial"/>
-        </w:rPr>
-      </w:pPr>
-    </w:p>
-    <w:p>
-      <w:pPr>
         <w:pBdr>
           <w:top w:val="nil"/>
           <w:left w:val="nil"/>
@@ -256,20 +224,6 @@
     </w:p>
     <w:p>
       <w:pPr>
-        <w:rPr>
-          <w:rFonts w:ascii="Arial" w:eastAsia="Arial" w:hAnsi="Arial" w:cs="Arial"/>
-        </w:rPr>
-      </w:pPr>
-    </w:p>
-    <w:p>
-      <w:pPr>
-        <w:rPr>
-          <w:rFonts w:ascii="Arial" w:eastAsia="Arial" w:hAnsi="Arial" w:cs="Arial"/>
-        </w:rPr>
-      </w:pPr>
-    </w:p>
-    <w:p>
-      <w:pPr>
         <w:pBdr>
           <w:top w:val="nil"/>
           <w:left w:val="nil"/>
@@ -289,227 +243,6 @@
     </w:p>
     <w:p>
       <w:pPr>
-        <w:keepNext/>
-        <w:pBdr>
-          <w:top w:val="nil"/>
-          <w:left w:val="nil"/>
-          <w:bottom w:val="nil"/>
-          <w:right w:val="nil"/>
-          <w:between w:val="nil"/>
-        </w:pBdr>
-        <w:jc w:val="center"/>
-        <w:rPr>
-          <w:rFonts w:ascii="Arial" w:eastAsia="Arial" w:hAnsi="Arial" w:cs="Arial"/>
-          <w:color w:val="000000"/>
-        </w:rPr>
-      </w:pPr>
-    </w:p>
-    <w:p>
-      <w:pPr>
-        <w:keepNext/>
-        <w:pBdr>
-          <w:top w:val="nil"/>
-          <w:left w:val="nil"/>
-          <w:bottom w:val="nil"/>
-          <w:right w:val="nil"/>
-          <w:between w:val="nil"/>
-        </w:pBdr>
-        <w:jc w:val="center"/>
-        <w:rPr>
-          <w:rFonts w:ascii="Arial" w:eastAsia="Arial" w:hAnsi="Arial" w:cs="Arial"/>
-          <w:color w:val="000000"/>
-        </w:rPr>
-      </w:pPr>
-    </w:p>
-    <w:p>
-      <w:pPr>
-        <w:rPr>
-          <w:rFonts w:ascii="Arial" w:eastAsia="Arial" w:hAnsi="Arial" w:cs="Arial"/>
-        </w:rPr>
-      </w:pPr>
-    </w:p>
-    <w:p>
-      <w:pPr>
-        <w:rPr>
-          <w:rFonts w:ascii="Arial" w:eastAsia="Arial" w:hAnsi="Arial" w:cs="Arial"/>
-        </w:rPr>
-      </w:pPr>
-    </w:p>
-    <w:p>
-      <w:pPr>
-        <w:rPr>
-          <w:rFonts w:ascii="Arial" w:eastAsia="Arial" w:hAnsi="Arial" w:cs="Arial"/>
-        </w:rPr>
-      </w:pPr>
-      <w:r>
-        <w:rPr>
-          <w:rFonts w:ascii="Arial" w:eastAsia="Arial" w:hAnsi="Arial" w:cs="Arial"/>
-        </w:rPr>
-        <w:tab/>
-      </w:r>
-      <w:r>
-        <w:rPr>
-          <w:rFonts w:ascii="Arial" w:eastAsia="Arial" w:hAnsi="Arial" w:cs="Arial"/>
-        </w:rPr>
-        <w:tab/>
-      </w:r>
-      <w:r>
-        <w:rPr>
-          <w:rFonts w:ascii="Arial" w:eastAsia="Arial" w:hAnsi="Arial" w:cs="Arial"/>
-        </w:rPr>
-        <w:tab/>
-      </w:r>
-      <w:r>
-        <w:rPr>
-          <w:rFonts w:ascii="Arial" w:eastAsia="Arial" w:hAnsi="Arial" w:cs="Arial"/>
-        </w:rPr>
-        <w:tab/>
-      </w:r>
-      <w:r>
-        <w:rPr>
-          <w:rFonts w:ascii="Arial" w:eastAsia="Arial" w:hAnsi="Arial" w:cs="Arial"/>
-        </w:rPr>
-        <w:tab/>
-      </w:r>
-      <w:r>
-        <w:rPr>
-          <w:rFonts w:ascii="Arial" w:eastAsia="Arial" w:hAnsi="Arial" w:cs="Arial"/>
-        </w:rPr>
-        <w:t>MARCOS RODRIGUES DE OLIVEIRA JÚNIOR</w:t>
-      </w:r>
-      <w:r>
-        <w:rPr>
-          <w:rFonts w:ascii="Arial" w:eastAsia="Arial" w:hAnsi="Arial" w:cs="Arial"/>
-        </w:rPr>
-        <w:t xml:space="preserve"> </w:t>
-      </w:r>
-    </w:p>
-    <w:p>
-      <w:pPr>
-        <w:rPr>
-          <w:rFonts w:ascii="Arial" w:eastAsia="Arial" w:hAnsi="Arial" w:cs="Arial"/>
-        </w:rPr>
-      </w:pPr>
-    </w:p>
-    <w:p>
-      <w:pPr>
-        <w:keepNext/>
-        <w:pBdr>
-          <w:top w:val="nil"/>
-          <w:left w:val="nil"/>
-          <w:bottom w:val="nil"/>
-          <w:right w:val="nil"/>
-          <w:between w:val="nil"/>
-        </w:pBdr>
-        <w:jc w:val="center"/>
-        <w:rPr>
-          <w:rFonts w:ascii="Arial" w:eastAsia="Arial" w:hAnsi="Arial" w:cs="Arial"/>
-          <w:color w:val="000000"/>
-        </w:rPr>
-      </w:pPr>
-    </w:p>
-    <w:p>
-      <w:pPr>
-        <w:keepNext/>
-        <w:pBdr>
-          <w:top w:val="nil"/>
-          <w:left w:val="nil"/>
-          <w:bottom w:val="nil"/>
-          <w:right w:val="nil"/>
-          <w:between w:val="nil"/>
-        </w:pBdr>
-        <w:jc w:val="center"/>
-        <w:rPr>
-          <w:rFonts w:ascii="Arial" w:eastAsia="Arial" w:hAnsi="Arial" w:cs="Arial"/>
-          <w:color w:val="000000"/>
-        </w:rPr>
-      </w:pPr>
-      <w:r>
-        <w:rPr>
-          <w:rFonts w:ascii="Arial" w:eastAsia="Arial" w:hAnsi="Arial" w:cs="Arial"/>
-          <w:color w:val="000000"/>
-        </w:rPr>
-        <w:t>UBERLÃNDIA</w:t>
-      </w:r>
-    </w:p>
-    <w:p>
-      <w:pPr>
-        <w:keepNext/>
-        <w:pBdr>
-          <w:top w:val="nil"/>
-          <w:left w:val="nil"/>
-          <w:bottom w:val="nil"/>
-          <w:right w:val="nil"/>
-          <w:between w:val="nil"/>
-        </w:pBdr>
-        <w:jc w:val="center"/>
-        <w:rPr>
-          <w:rFonts w:ascii="Arial" w:eastAsia="Arial" w:hAnsi="Arial" w:cs="Arial"/>
-          <w:color w:val="000000"/>
-        </w:rPr>
-      </w:pPr>
-      <w:r>
-        <w:rPr>
-          <w:rFonts w:ascii="Arial" w:eastAsia="Arial" w:hAnsi="Arial" w:cs="Arial"/>
-          <w:color w:val="000000"/>
-        </w:rPr>
-        <w:t xml:space="preserve">MAIO /2025 </w:t>
-      </w:r>
-    </w:p>
-    <w:p>
-      <w:pPr>
-        <w:keepNext/>
-        <w:pBdr>
-          <w:top w:val="nil"/>
-          <w:left w:val="nil"/>
-          <w:bottom w:val="nil"/>
-          <w:right w:val="nil"/>
-          <w:between w:val="nil"/>
-        </w:pBdr>
-        <w:jc w:val="center"/>
-        <w:rPr>
-          <w:rFonts w:ascii="Arial" w:eastAsia="Arial" w:hAnsi="Arial" w:cs="Arial"/>
-          <w:color w:val="000000"/>
-        </w:rPr>
-      </w:pPr>
-    </w:p>
-    <w:p>
-      <w:pPr>
-        <w:rPr>
-          <w:rFonts w:ascii="Arial" w:eastAsia="Arial" w:hAnsi="Arial" w:cs="Arial"/>
-        </w:rPr>
-      </w:pPr>
-    </w:p>
-    <w:p>
-      <w:pPr>
-        <w:rPr>
-          <w:rFonts w:ascii="Arial" w:eastAsia="Arial" w:hAnsi="Arial" w:cs="Arial"/>
-        </w:rPr>
-      </w:pPr>
-    </w:p>
-    <w:p>
-      <w:pPr>
-        <w:rPr>
-          <w:rFonts w:ascii="Arial" w:eastAsia="Arial" w:hAnsi="Arial" w:cs="Arial"/>
-        </w:rPr>
-      </w:pPr>
-    </w:p>
-    <w:p>
-      <w:pPr>
-        <w:rPr>
-          <w:rFonts w:ascii="Arial" w:eastAsia="Arial" w:hAnsi="Arial" w:cs="Arial"/>
-        </w:rPr>
-      </w:pPr>
-    </w:p>
-    <w:p>
-      <w:pPr>
-        <w:rPr>
-          <w:rFonts w:ascii="Arial" w:eastAsia="Arial" w:hAnsi="Arial" w:cs="Arial"/>
-        </w:rPr>
-      </w:pPr>
-    </w:p>
-    <w:p>
-      <w:pPr>
         <w:pBdr>
           <w:top w:val="nil"/>
           <w:left w:val="nil"/>
@@ -529,55 +262,6 @@
     </w:p>
     <w:p>
       <w:pPr>
-        <w:rPr>
-          <w:rFonts w:ascii="Arial" w:eastAsia="Arial" w:hAnsi="Arial" w:cs="Arial"/>
-        </w:rPr>
-      </w:pPr>
-    </w:p>
-    <w:p>
-      <w:pPr>
-        <w:rPr>
-          <w:rFonts w:ascii="Arial" w:eastAsia="Arial" w:hAnsi="Arial" w:cs="Arial"/>
-        </w:rPr>
-      </w:pPr>
-    </w:p>
-    <w:p>
-      <w:pPr>
-        <w:rPr>
-          <w:rFonts w:ascii="Arial" w:eastAsia="Arial" w:hAnsi="Arial" w:cs="Arial"/>
-        </w:rPr>
-      </w:pPr>
-    </w:p>
-    <w:p>
-      <w:pPr>
-        <w:rPr>
-          <w:rFonts w:ascii="Arial" w:eastAsia="Arial" w:hAnsi="Arial" w:cs="Arial"/>
-        </w:rPr>
-      </w:pPr>
-    </w:p>
-    <w:p>
-      <w:pPr>
-        <w:rPr>
-          <w:rFonts w:ascii="Arial" w:eastAsia="Arial" w:hAnsi="Arial" w:cs="Arial"/>
-        </w:rPr>
-      </w:pPr>
-    </w:p>
-    <w:p>
-      <w:pPr>
-        <w:rPr>
-          <w:rFonts w:ascii="Arial" w:eastAsia="Arial" w:hAnsi="Arial" w:cs="Arial"/>
-        </w:rPr>
-      </w:pPr>
-    </w:p>
-    <w:p>
-      <w:pPr>
-        <w:rPr>
-          <w:rFonts w:ascii="Arial" w:eastAsia="Arial" w:hAnsi="Arial" w:cs="Arial"/>
-        </w:rPr>
-      </w:pPr>
-    </w:p>
-    <w:p>
-      <w:pPr>
         <w:pBdr>
           <w:top w:val="nil"/>
           <w:left w:val="nil"/>
@@ -597,26 +281,391 @@
     </w:p>
     <w:p>
       <w:pPr>
+        <w:pBdr>
+          <w:top w:val="nil"/>
+          <w:left w:val="nil"/>
+          <w:bottom w:val="nil"/>
+          <w:right w:val="nil"/>
+          <w:between w:val="nil"/>
+        </w:pBdr>
+        <w:tabs>
+          <w:tab w:val="center" w:pos="4419"/>
+          <w:tab w:val="right" w:pos="8838"/>
+        </w:tabs>
+        <w:rPr>
+          <w:rFonts w:ascii="Arial" w:eastAsia="Arial" w:hAnsi="Arial" w:cs="Arial"/>
+          <w:color w:val="000000"/>
+        </w:rPr>
+      </w:pPr>
+    </w:p>
+    <w:p>
+      <w:pPr>
+        <w:rPr>
+          <w:rFonts w:ascii="Arial" w:eastAsia="Arial" w:hAnsi="Arial" w:cs="Arial"/>
+        </w:rPr>
+      </w:pPr>
+    </w:p>
+    <w:p>
+      <w:pPr>
         <w:jc w:val="center"/>
         <w:rPr>
           <w:rFonts w:ascii="Arial" w:eastAsia="Arial" w:hAnsi="Arial" w:cs="Arial"/>
-        </w:rPr>
-      </w:pPr>
-    </w:p>
-    <w:p>
-      <w:pPr>
+          <w:caps/>
+        </w:rPr>
+      </w:pPr>
+      <w:r>
+        <w:rPr>
+          <w:rFonts w:ascii="Arial" w:eastAsia="Arial" w:hAnsi="Arial" w:cs="Arial"/>
+          <w:b/>
+          <w:caps/>
+          <w:color w:val="000000"/>
+        </w:rPr>
+        <w:t>Auditoria de Sistemas de Inteligência Artificial em Plataformas de Streaming: Um Estudo Experimental sobre Vieses e Recomendação Musical no Spotify</w:t>
+      </w:r>
+    </w:p>
+    <w:p>
+      <w:pPr>
+        <w:rPr>
+          <w:rFonts w:ascii="Arial" w:eastAsia="Arial" w:hAnsi="Arial" w:cs="Arial"/>
+        </w:rPr>
+      </w:pPr>
+    </w:p>
+    <w:p>
+      <w:pPr>
+        <w:rPr>
+          <w:rFonts w:ascii="Arial" w:eastAsia="Arial" w:hAnsi="Arial" w:cs="Arial"/>
+        </w:rPr>
+      </w:pPr>
+    </w:p>
+    <w:p>
+      <w:pPr>
+        <w:keepNext/>
+        <w:pBdr>
+          <w:top w:val="nil"/>
+          <w:left w:val="nil"/>
+          <w:bottom w:val="nil"/>
+          <w:right w:val="nil"/>
+          <w:between w:val="nil"/>
+        </w:pBdr>
         <w:jc w:val="center"/>
         <w:rPr>
           <w:rFonts w:ascii="Arial" w:eastAsia="Arial" w:hAnsi="Arial" w:cs="Arial"/>
-        </w:rPr>
-      </w:pPr>
-    </w:p>
-    <w:p>
-      <w:pPr>
-        <w:rPr>
-          <w:rFonts w:ascii="Arial" w:eastAsia="Arial" w:hAnsi="Arial" w:cs="Arial"/>
-          <w:sz w:val="28"/>
-          <w:szCs w:val="28"/>
+          <w:color w:val="000000"/>
+        </w:rPr>
+      </w:pPr>
+    </w:p>
+    <w:p>
+      <w:pPr>
+        <w:keepNext/>
+        <w:pBdr>
+          <w:top w:val="nil"/>
+          <w:left w:val="nil"/>
+          <w:bottom w:val="nil"/>
+          <w:right w:val="nil"/>
+          <w:between w:val="nil"/>
+        </w:pBdr>
+        <w:jc w:val="center"/>
+        <w:rPr>
+          <w:rFonts w:ascii="Arial" w:eastAsia="Arial" w:hAnsi="Arial" w:cs="Arial"/>
+          <w:color w:val="000000"/>
+        </w:rPr>
+      </w:pPr>
+    </w:p>
+    <w:p>
+      <w:pPr>
+        <w:keepNext/>
+        <w:pBdr>
+          <w:top w:val="nil"/>
+          <w:left w:val="nil"/>
+          <w:bottom w:val="nil"/>
+          <w:right w:val="nil"/>
+          <w:between w:val="nil"/>
+        </w:pBdr>
+        <w:jc w:val="center"/>
+        <w:rPr>
+          <w:rFonts w:ascii="Arial" w:eastAsia="Arial" w:hAnsi="Arial" w:cs="Arial"/>
+          <w:color w:val="000000"/>
+        </w:rPr>
+      </w:pPr>
+    </w:p>
+    <w:p>
+      <w:pPr>
+        <w:keepNext/>
+        <w:pBdr>
+          <w:top w:val="nil"/>
+          <w:left w:val="nil"/>
+          <w:bottom w:val="nil"/>
+          <w:right w:val="nil"/>
+          <w:between w:val="nil"/>
+        </w:pBdr>
+        <w:rPr>
+          <w:rFonts w:ascii="Arial" w:eastAsia="Arial" w:hAnsi="Arial" w:cs="Arial"/>
+          <w:color w:val="000000"/>
+        </w:rPr>
+      </w:pPr>
+    </w:p>
+    <w:p>
+      <w:pPr>
+        <w:keepNext/>
+        <w:pBdr>
+          <w:top w:val="nil"/>
+          <w:left w:val="nil"/>
+          <w:bottom w:val="nil"/>
+          <w:right w:val="nil"/>
+          <w:between w:val="nil"/>
+        </w:pBdr>
+        <w:rPr>
+          <w:rFonts w:ascii="Arial" w:eastAsia="Arial" w:hAnsi="Arial" w:cs="Arial"/>
+          <w:color w:val="000000"/>
+        </w:rPr>
+      </w:pPr>
+    </w:p>
+    <w:p>
+      <w:pPr>
+        <w:keepNext/>
+        <w:pBdr>
+          <w:top w:val="nil"/>
+          <w:left w:val="nil"/>
+          <w:bottom w:val="nil"/>
+          <w:right w:val="nil"/>
+          <w:between w:val="nil"/>
+        </w:pBdr>
+        <w:rPr>
+          <w:rFonts w:ascii="Arial" w:eastAsia="Arial" w:hAnsi="Arial" w:cs="Arial"/>
+          <w:color w:val="000000"/>
+        </w:rPr>
+      </w:pPr>
+    </w:p>
+    <w:p>
+      <w:pPr>
+        <w:keepNext/>
+        <w:pBdr>
+          <w:top w:val="nil"/>
+          <w:left w:val="nil"/>
+          <w:bottom w:val="nil"/>
+          <w:right w:val="nil"/>
+          <w:between w:val="nil"/>
+        </w:pBdr>
+        <w:rPr>
+          <w:rFonts w:ascii="Arial" w:eastAsia="Arial" w:hAnsi="Arial" w:cs="Arial"/>
+          <w:color w:val="000000"/>
+        </w:rPr>
+      </w:pPr>
+    </w:p>
+    <w:p>
+      <w:pPr>
+        <w:keepNext/>
+        <w:pBdr>
+          <w:top w:val="nil"/>
+          <w:left w:val="nil"/>
+          <w:bottom w:val="nil"/>
+          <w:right w:val="nil"/>
+          <w:between w:val="nil"/>
+        </w:pBdr>
+        <w:rPr>
+          <w:rFonts w:ascii="Arial" w:eastAsia="Arial" w:hAnsi="Arial" w:cs="Arial"/>
+          <w:color w:val="000000"/>
+        </w:rPr>
+      </w:pPr>
+    </w:p>
+    <w:p>
+      <w:pPr>
+        <w:keepNext/>
+        <w:pBdr>
+          <w:top w:val="nil"/>
+          <w:left w:val="nil"/>
+          <w:bottom w:val="nil"/>
+          <w:right w:val="nil"/>
+          <w:between w:val="nil"/>
+        </w:pBdr>
+        <w:rPr>
+          <w:rFonts w:ascii="Arial" w:eastAsia="Arial" w:hAnsi="Arial" w:cs="Arial"/>
+          <w:color w:val="000000"/>
+        </w:rPr>
+      </w:pPr>
+    </w:p>
+    <w:p>
+      <w:pPr>
+        <w:keepNext/>
+        <w:pBdr>
+          <w:top w:val="nil"/>
+          <w:left w:val="nil"/>
+          <w:bottom w:val="nil"/>
+          <w:right w:val="nil"/>
+          <w:between w:val="nil"/>
+        </w:pBdr>
+        <w:rPr>
+          <w:rFonts w:ascii="Arial" w:eastAsia="Arial" w:hAnsi="Arial" w:cs="Arial"/>
+          <w:color w:val="000000"/>
+        </w:rPr>
+      </w:pPr>
+    </w:p>
+    <w:p>
+      <w:pPr>
+        <w:keepNext/>
+        <w:pBdr>
+          <w:top w:val="nil"/>
+          <w:left w:val="nil"/>
+          <w:bottom w:val="nil"/>
+          <w:right w:val="nil"/>
+          <w:between w:val="nil"/>
+        </w:pBdr>
+        <w:rPr>
+          <w:rFonts w:ascii="Arial" w:eastAsia="Arial" w:hAnsi="Arial" w:cs="Arial"/>
+          <w:color w:val="000000"/>
+        </w:rPr>
+      </w:pPr>
+    </w:p>
+    <w:p>
+      <w:pPr>
+        <w:keepNext/>
+        <w:pBdr>
+          <w:top w:val="nil"/>
+          <w:left w:val="nil"/>
+          <w:bottom w:val="nil"/>
+          <w:right w:val="nil"/>
+          <w:between w:val="nil"/>
+        </w:pBdr>
+        <w:rPr>
+          <w:rFonts w:ascii="Arial" w:eastAsia="Arial" w:hAnsi="Arial" w:cs="Arial"/>
+          <w:color w:val="000000"/>
+        </w:rPr>
+      </w:pPr>
+    </w:p>
+    <w:p>
+      <w:pPr>
+        <w:keepNext/>
+        <w:pBdr>
+          <w:top w:val="nil"/>
+          <w:left w:val="nil"/>
+          <w:bottom w:val="nil"/>
+          <w:right w:val="nil"/>
+          <w:between w:val="nil"/>
+        </w:pBdr>
+        <w:rPr>
+          <w:rFonts w:ascii="Arial" w:eastAsia="Arial" w:hAnsi="Arial" w:cs="Arial"/>
+          <w:color w:val="000000"/>
+        </w:rPr>
+      </w:pPr>
+    </w:p>
+    <w:p>
+      <w:pPr>
+        <w:keepNext/>
+        <w:pBdr>
+          <w:top w:val="nil"/>
+          <w:left w:val="nil"/>
+          <w:bottom w:val="nil"/>
+          <w:right w:val="nil"/>
+          <w:between w:val="nil"/>
+        </w:pBdr>
+        <w:rPr>
+          <w:rFonts w:ascii="Arial" w:eastAsia="Arial" w:hAnsi="Arial" w:cs="Arial"/>
+          <w:color w:val="000000"/>
+        </w:rPr>
+      </w:pPr>
+    </w:p>
+    <w:p>
+      <w:pPr>
+        <w:keepNext/>
+        <w:pBdr>
+          <w:top w:val="nil"/>
+          <w:left w:val="nil"/>
+          <w:bottom w:val="nil"/>
+          <w:right w:val="nil"/>
+          <w:between w:val="nil"/>
+        </w:pBdr>
+        <w:rPr>
+          <w:rFonts w:ascii="Arial" w:eastAsia="Arial" w:hAnsi="Arial" w:cs="Arial"/>
+          <w:color w:val="000000"/>
+        </w:rPr>
+      </w:pPr>
+    </w:p>
+    <w:p>
+      <w:pPr>
+        <w:keepNext/>
+        <w:pBdr>
+          <w:top w:val="nil"/>
+          <w:left w:val="nil"/>
+          <w:bottom w:val="nil"/>
+          <w:right w:val="nil"/>
+          <w:between w:val="nil"/>
+        </w:pBdr>
+        <w:rPr>
+          <w:rFonts w:ascii="Arial" w:eastAsia="Arial" w:hAnsi="Arial" w:cs="Arial"/>
+          <w:color w:val="000000"/>
+        </w:rPr>
+      </w:pPr>
+    </w:p>
+    <w:p>
+      <w:pPr>
+        <w:keepNext/>
+        <w:pBdr>
+          <w:top w:val="nil"/>
+          <w:left w:val="nil"/>
+          <w:bottom w:val="nil"/>
+          <w:right w:val="nil"/>
+          <w:between w:val="nil"/>
+        </w:pBdr>
+        <w:rPr>
+          <w:rFonts w:ascii="Arial" w:eastAsia="Arial" w:hAnsi="Arial" w:cs="Arial"/>
+          <w:color w:val="000000"/>
+        </w:rPr>
+      </w:pPr>
+    </w:p>
+    <w:p>
+      <w:pPr>
+        <w:keepNext/>
+        <w:pBdr>
+          <w:top w:val="nil"/>
+          <w:left w:val="nil"/>
+          <w:bottom w:val="nil"/>
+          <w:right w:val="nil"/>
+          <w:between w:val="nil"/>
+        </w:pBdr>
+        <w:jc w:val="center"/>
+        <w:rPr>
+          <w:rFonts w:ascii="Arial" w:eastAsia="Arial" w:hAnsi="Arial" w:cs="Arial"/>
+          <w:color w:val="000000"/>
+        </w:rPr>
+      </w:pPr>
+      <w:r>
+        <w:rPr>
+          <w:rFonts w:ascii="Arial" w:eastAsia="Arial" w:hAnsi="Arial" w:cs="Arial"/>
+          <w:color w:val="000000"/>
+        </w:rPr>
+        <w:t>UBERLÃNDIA</w:t>
+      </w:r>
+    </w:p>
+    <w:p>
+      <w:pPr>
+        <w:keepNext/>
+        <w:pBdr>
+          <w:top w:val="nil"/>
+          <w:left w:val="nil"/>
+          <w:bottom w:val="nil"/>
+          <w:right w:val="nil"/>
+          <w:between w:val="nil"/>
+        </w:pBdr>
+        <w:jc w:val="center"/>
+        <w:rPr>
+          <w:rFonts w:ascii="Arial" w:eastAsia="Arial" w:hAnsi="Arial" w:cs="Arial"/>
+          <w:color w:val="000000"/>
+        </w:rPr>
+      </w:pPr>
+      <w:r>
+        <w:rPr>
+          <w:rFonts w:ascii="Arial" w:eastAsia="Arial" w:hAnsi="Arial" w:cs="Arial"/>
+          <w:color w:val="000000"/>
+        </w:rPr>
+        <w:t xml:space="preserve">MAIO /2025 </w:t>
+      </w:r>
+    </w:p>
+    <w:p>
+      <w:pPr>
+        <w:jc w:val="center"/>
+        <w:rPr>
+          <w:rFonts w:ascii="Arial" w:eastAsia="Arial" w:hAnsi="Arial" w:cs="Arial"/>
+          <w:color w:val="000000"/>
         </w:rPr>
       </w:pPr>
       <w:r>
@@ -626,217 +675,7 @@
           <w:sz w:val="28"/>
           <w:szCs w:val="28"/>
         </w:rPr>
-        <w:t xml:space="preserve">       SUMÁRIO </w:t>
-      </w:r>
-    </w:p>
-    <w:p>
-      <w:pPr>
-        <w:rPr>
-          <w:rFonts w:ascii="Arial" w:eastAsia="Arial" w:hAnsi="Arial" w:cs="Arial"/>
-        </w:rPr>
-      </w:pPr>
-    </w:p>
-    <w:p>
-      <w:pPr>
-        <w:rPr>
-          <w:rFonts w:ascii="Arial" w:eastAsia="Arial" w:hAnsi="Arial" w:cs="Arial"/>
-        </w:rPr>
-      </w:pPr>
-    </w:p>
-    <w:p>
-      <w:pPr>
-        <w:rPr>
-          <w:rFonts w:ascii="Arial" w:eastAsia="Arial" w:hAnsi="Arial" w:cs="Arial"/>
-        </w:rPr>
-      </w:pPr>
-    </w:p>
-    <w:p>
-      <w:pPr>
-        <w:ind w:firstLine="540"/>
-        <w:rPr>
-          <w:rFonts w:ascii="Arial" w:eastAsia="Arial" w:hAnsi="Arial" w:cs="Arial"/>
-        </w:rPr>
-      </w:pPr>
-      <w:r>
-        <w:rPr>
-          <w:rFonts w:ascii="Arial" w:eastAsia="Arial" w:hAnsi="Arial" w:cs="Arial"/>
-        </w:rPr>
-        <w:t>1- INTRODUÇÃO.........................................................................</w:t>
-      </w:r>
-    </w:p>
-    <w:p>
-      <w:pPr>
-        <w:ind w:firstLine="540"/>
-        <w:rPr>
-          <w:rFonts w:ascii="Arial" w:eastAsia="Arial" w:hAnsi="Arial" w:cs="Arial"/>
-        </w:rPr>
-      </w:pPr>
-    </w:p>
-    <w:p>
-      <w:pPr>
-        <w:ind w:firstLine="540"/>
-        <w:rPr>
-          <w:rFonts w:ascii="Arial" w:eastAsia="Arial" w:hAnsi="Arial" w:cs="Arial"/>
-        </w:rPr>
-      </w:pPr>
-      <w:r>
-        <w:rPr>
-          <w:rFonts w:ascii="Arial" w:eastAsia="Arial" w:hAnsi="Arial" w:cs="Arial"/>
-        </w:rPr>
-        <w:t>2- OBJETIVOS.............................................................................</w:t>
-      </w:r>
-    </w:p>
-    <w:p>
-      <w:pPr>
-        <w:ind w:firstLine="540"/>
-        <w:rPr>
-          <w:rFonts w:ascii="Arial" w:eastAsia="Arial" w:hAnsi="Arial" w:cs="Arial"/>
-        </w:rPr>
-      </w:pPr>
-    </w:p>
-    <w:p>
-      <w:pPr>
-        <w:ind w:firstLine="540"/>
-        <w:rPr>
-          <w:rFonts w:ascii="Arial" w:eastAsia="Arial" w:hAnsi="Arial" w:cs="Arial"/>
-        </w:rPr>
-      </w:pPr>
-      <w:r>
-        <w:rPr>
-          <w:rFonts w:ascii="Arial" w:eastAsia="Arial" w:hAnsi="Arial" w:cs="Arial"/>
-        </w:rPr>
-        <w:t>3- REVISÃO TEÓRICA................................................................</w:t>
-      </w:r>
-    </w:p>
-    <w:p>
-      <w:pPr>
-        <w:ind w:firstLine="540"/>
-        <w:rPr>
-          <w:rFonts w:ascii="Arial" w:eastAsia="Arial" w:hAnsi="Arial" w:cs="Arial"/>
-        </w:rPr>
-      </w:pPr>
-    </w:p>
-    <w:p>
-      <w:pPr>
-        <w:ind w:firstLine="540"/>
-        <w:rPr>
-          <w:rFonts w:ascii="Arial" w:eastAsia="Arial" w:hAnsi="Arial" w:cs="Arial"/>
-        </w:rPr>
-      </w:pPr>
-      <w:r>
-        <w:rPr>
-          <w:rFonts w:ascii="Arial" w:eastAsia="Arial" w:hAnsi="Arial" w:cs="Arial"/>
-        </w:rPr>
-        <w:t>4- METODOLOGIA......................................................................</w:t>
-      </w:r>
-    </w:p>
-    <w:p>
-      <w:pPr>
-        <w:ind w:firstLine="540"/>
-        <w:rPr>
-          <w:rFonts w:ascii="Arial" w:eastAsia="Arial" w:hAnsi="Arial" w:cs="Arial"/>
-        </w:rPr>
-      </w:pPr>
-    </w:p>
-    <w:p>
-      <w:pPr>
-        <w:ind w:firstLine="540"/>
-        <w:rPr>
-          <w:rFonts w:ascii="Arial" w:eastAsia="Arial" w:hAnsi="Arial" w:cs="Arial"/>
-        </w:rPr>
-      </w:pPr>
-      <w:r>
-        <w:rPr>
-          <w:rFonts w:ascii="Arial" w:eastAsia="Arial" w:hAnsi="Arial" w:cs="Arial"/>
-        </w:rPr>
-        <w:t>5- REFERÊNCIAS........................................................................</w:t>
-      </w:r>
-    </w:p>
-    <w:p>
-      <w:pPr>
-        <w:rPr>
-          <w:rFonts w:ascii="Arial" w:eastAsia="Arial" w:hAnsi="Arial" w:cs="Arial"/>
-        </w:rPr>
-      </w:pPr>
-    </w:p>
-    <w:p>
-      <w:pPr>
-        <w:ind w:firstLine="540"/>
-        <w:rPr>
-          <w:rFonts w:ascii="Arial" w:eastAsia="Arial" w:hAnsi="Arial" w:cs="Arial"/>
-        </w:rPr>
-      </w:pPr>
-    </w:p>
-    <w:p>
-      <w:pPr>
-        <w:ind w:firstLine="540"/>
-        <w:rPr>
-          <w:rFonts w:ascii="Arial" w:eastAsia="Arial" w:hAnsi="Arial" w:cs="Arial"/>
-        </w:rPr>
-      </w:pPr>
-    </w:p>
-    <w:p>
-      <w:pPr>
-        <w:ind w:firstLine="540"/>
-        <w:rPr>
-          <w:rFonts w:ascii="Arial" w:eastAsia="Arial" w:hAnsi="Arial" w:cs="Arial"/>
-        </w:rPr>
-      </w:pPr>
-    </w:p>
-    <w:p>
-      <w:pPr>
-        <w:ind w:firstLine="540"/>
-        <w:rPr>
-          <w:rFonts w:ascii="Arial" w:eastAsia="Arial" w:hAnsi="Arial" w:cs="Arial"/>
-        </w:rPr>
-      </w:pPr>
-    </w:p>
-    <w:p>
-      <w:pPr>
-        <w:ind w:firstLine="540"/>
-        <w:rPr>
-          <w:rFonts w:ascii="Arial" w:eastAsia="Arial" w:hAnsi="Arial" w:cs="Arial"/>
-        </w:rPr>
-      </w:pPr>
-    </w:p>
-    <w:p>
-      <w:pPr>
-        <w:ind w:firstLine="540"/>
-        <w:rPr>
-          <w:rFonts w:ascii="Arial" w:eastAsia="Arial" w:hAnsi="Arial" w:cs="Arial"/>
-        </w:rPr>
-      </w:pPr>
-    </w:p>
-    <w:p>
-      <w:pPr>
-        <w:spacing w:line="480" w:lineRule="auto"/>
-        <w:ind w:left="360" w:firstLine="540"/>
-        <w:rPr>
-          <w:rFonts w:ascii="Arial" w:eastAsia="Arial" w:hAnsi="Arial" w:cs="Arial"/>
-        </w:rPr>
-      </w:pPr>
-      <w:r>
         <w:br w:type="page"/>
-      </w:r>
-    </w:p>
-    <w:p>
-      <w:pPr>
-        <w:spacing w:line="480" w:lineRule="auto"/>
-        <w:ind w:left="360"/>
-        <w:rPr>
-          <w:rFonts w:ascii="Arial" w:eastAsia="Arial" w:hAnsi="Arial" w:cs="Arial"/>
-          <w:sz w:val="28"/>
-          <w:szCs w:val="28"/>
-        </w:rPr>
-      </w:pPr>
-      <w:r>
-        <w:rPr>
-          <w:rFonts w:ascii="Arial" w:eastAsia="Arial" w:hAnsi="Arial" w:cs="Arial"/>
-          <w:sz w:val="28"/>
-          <w:szCs w:val="28"/>
-        </w:rPr>
-        <w:lastRenderedPageBreak/>
-        <w:t xml:space="preserve"> </w:t>
       </w:r>
       <w:r>
         <w:rPr>
@@ -845,16 +684,121 @@
           <w:sz w:val="28"/>
           <w:szCs w:val="28"/>
         </w:rPr>
-        <w:t xml:space="preserve">1 - </w:t>
-      </w:r>
-      <w:r>
-        <w:rPr>
-          <w:rFonts w:ascii="Arial" w:eastAsia="Arial" w:hAnsi="Arial" w:cs="Arial"/>
-          <w:b/>
-          <w:sz w:val="28"/>
-          <w:szCs w:val="28"/>
-        </w:rPr>
-        <w:t xml:space="preserve">INTRODUÇÃO               </w:t>
+        <w:lastRenderedPageBreak/>
+        <w:t>SUMÁRIO</w:t>
+      </w:r>
+    </w:p>
+    <w:p>
+      <w:pPr>
+        <w:rPr>
+          <w:rFonts w:ascii="Arial" w:eastAsia="Arial" w:hAnsi="Arial" w:cs="Arial"/>
+        </w:rPr>
+      </w:pPr>
+    </w:p>
+    <w:p>
+      <w:pPr>
+        <w:rPr>
+          <w:rFonts w:ascii="Arial" w:eastAsia="Arial" w:hAnsi="Arial" w:cs="Arial"/>
+        </w:rPr>
+      </w:pPr>
+    </w:p>
+    <w:p>
+      <w:pPr>
+        <w:ind w:firstLine="540"/>
+        <w:rPr>
+          <w:rFonts w:ascii="Arial" w:eastAsia="Arial" w:hAnsi="Arial" w:cs="Arial"/>
+        </w:rPr>
+      </w:pPr>
+    </w:p>
+    <w:p>
+      <w:pPr>
+        <w:ind w:firstLine="540"/>
+        <w:rPr>
+          <w:rFonts w:ascii="Arial" w:eastAsia="Arial" w:hAnsi="Arial" w:cs="Arial"/>
+        </w:rPr>
+      </w:pPr>
+    </w:p>
+    <w:p>
+      <w:pPr>
+        <w:ind w:firstLine="540"/>
+        <w:rPr>
+          <w:rFonts w:ascii="Arial" w:eastAsia="Arial" w:hAnsi="Arial" w:cs="Arial"/>
+        </w:rPr>
+      </w:pPr>
+    </w:p>
+    <w:p>
+      <w:pPr>
+        <w:ind w:firstLine="540"/>
+        <w:rPr>
+          <w:rFonts w:ascii="Arial" w:eastAsia="Arial" w:hAnsi="Arial" w:cs="Arial"/>
+        </w:rPr>
+      </w:pPr>
+    </w:p>
+    <w:p>
+      <w:pPr>
+        <w:ind w:firstLine="540"/>
+        <w:rPr>
+          <w:rFonts w:ascii="Arial" w:eastAsia="Arial" w:hAnsi="Arial" w:cs="Arial"/>
+        </w:rPr>
+      </w:pPr>
+    </w:p>
+    <w:p>
+      <w:pPr>
+        <w:ind w:firstLine="540"/>
+        <w:rPr>
+          <w:rFonts w:ascii="Arial" w:eastAsia="Arial" w:hAnsi="Arial" w:cs="Arial"/>
+        </w:rPr>
+      </w:pPr>
+    </w:p>
+    <w:p>
+      <w:pPr>
+        <w:spacing w:line="480" w:lineRule="auto"/>
+        <w:ind w:left="360" w:firstLine="540"/>
+        <w:rPr>
+          <w:rFonts w:ascii="Arial" w:eastAsia="Arial" w:hAnsi="Arial" w:cs="Arial"/>
+        </w:rPr>
+      </w:pPr>
+      <w:r>
+        <w:br w:type="page"/>
+      </w:r>
+    </w:p>
+    <w:p>
+      <w:pPr>
+        <w:pStyle w:val="Ttulo"/>
+        <w:rPr>
+          <w:rFonts w:eastAsia="Arial"/>
+        </w:rPr>
+      </w:pPr>
+      <w:r>
+        <w:rPr>
+          <w:rFonts w:eastAsia="Arial"/>
+        </w:rPr>
+        <w:lastRenderedPageBreak/>
+        <w:t xml:space="preserve"> </w:t>
+      </w:r>
+      <w:r>
+        <w:rPr>
+          <w:rFonts w:eastAsia="Arial"/>
+        </w:rPr>
+        <w:t xml:space="preserve">1 </w:t>
+      </w:r>
+      <w:r>
+        <w:rPr>
+          <w:rFonts w:eastAsia="Arial"/>
+        </w:rPr>
+        <w:t>–</w:t>
+      </w:r>
+      <w:r>
+        <w:rPr>
+          <w:rFonts w:eastAsia="Arial"/>
+        </w:rPr>
+        <w:t xml:space="preserve"> </w:t>
+      </w:r>
+      <w:r>
+        <w:rPr>
+          <w:rFonts w:eastAsia="Arial"/>
+        </w:rPr>
+        <w:t>INTRODUÇÃO</w:t>
       </w:r>
     </w:p>
     <w:p>
@@ -1033,39 +977,17 @@
     </w:p>
     <w:p>
       <w:pPr>
-        <w:spacing w:line="480" w:lineRule="auto"/>
-        <w:rPr>
-          <w:rFonts w:ascii="Arial" w:eastAsia="Arial" w:hAnsi="Arial" w:cs="Arial"/>
-          <w:b/>
-        </w:rPr>
-      </w:pPr>
-      <w:r>
-        <w:rPr>
-          <w:rFonts w:ascii="Arial" w:eastAsia="Arial" w:hAnsi="Arial" w:cs="Arial"/>
-          <w:b/>
-          <w:sz w:val="28"/>
-          <w:szCs w:val="28"/>
-        </w:rPr>
+        <w:pStyle w:val="Ttulo"/>
+      </w:pPr>
+      <w:r>
         <w:lastRenderedPageBreak/>
         <w:t>2</w:t>
       </w:r>
       <w:r>
-        <w:rPr>
-          <w:rFonts w:ascii="Arial" w:eastAsia="Arial" w:hAnsi="Arial" w:cs="Arial"/>
-          <w:b/>
-          <w:sz w:val="28"/>
-          <w:szCs w:val="28"/>
-        </w:rPr>
         <w:t xml:space="preserve"> -</w:t>
       </w:r>
       <w:r>
-        <w:rPr>
-          <w:rFonts w:ascii="Arial" w:eastAsia="Arial" w:hAnsi="Arial" w:cs="Arial"/>
-          <w:b/>
-          <w:sz w:val="28"/>
-          <w:szCs w:val="28"/>
-        </w:rPr>
-        <w:t xml:space="preserve"> OBJETIVOS                  </w:t>
+        <w:t xml:space="preserve"> OBJETIVOS </w:t>
       </w:r>
     </w:p>
     <w:p>
@@ -1384,1366 +1306,13 @@
     </w:p>
     <w:p>
       <w:pPr>
-        <w:pStyle w:val="PargrafodaLista"/>
-        <w:spacing w:line="360" w:lineRule="auto"/>
-        <w:jc w:val="both"/>
-      </w:pPr>
-    </w:p>
-    <w:p>
-      <w:pPr>
-        <w:spacing w:line="480" w:lineRule="auto"/>
-        <w:jc w:val="both"/>
-      </w:pPr>
-    </w:p>
-    <w:p>
-      <w:pPr>
-        <w:spacing w:line="480" w:lineRule="auto"/>
-        <w:jc w:val="both"/>
-        <w:rPr>
-          <w:rFonts w:ascii="Arial" w:eastAsia="Arial" w:hAnsi="Arial" w:cs="Arial"/>
-          <w:b/>
-          <w:sz w:val="28"/>
-          <w:szCs w:val="28"/>
-        </w:rPr>
-      </w:pPr>
-      <w:r>
-        <w:rPr>
-          <w:rFonts w:ascii="Arial" w:eastAsia="Arial" w:hAnsi="Arial" w:cs="Arial"/>
-          <w:b/>
-          <w:sz w:val="28"/>
-          <w:szCs w:val="28"/>
-        </w:rPr>
-        <w:t xml:space="preserve">3 - REVISÃO TEÓRICA                  </w:t>
-      </w:r>
-    </w:p>
-    <w:p>
-      <w:pPr>
-        <w:spacing w:line="360" w:lineRule="auto"/>
-        <w:ind w:firstLine="709"/>
-        <w:jc w:val="both"/>
-        <w:rPr>
-          <w:rFonts w:eastAsia="Arial"/>
-          <w:bCs/>
-        </w:rPr>
-      </w:pPr>
-      <w:r>
-        <w:rPr>
-          <w:rFonts w:eastAsia="Arial"/>
-          <w:bCs/>
-        </w:rPr>
-        <w:t>Para embasar a discussão sobre o impacto da inteligência artificial na música, esta revisão teórica reúne autores que abordam desde a origem e evolução da música até as transformações recentes impulsionadas pela tecnologia. As referências selecionadas tratam de aspectos históricos, criativos, legais e técnicos, oferecendo suporte conceitual à pesquisa. A Tabela 1 apresenta um resumo dos principais autores, temas e definições relevantes.</w:t>
-      </w:r>
-    </w:p>
-    <w:p>
-      <w:pPr>
-        <w:spacing w:line="360" w:lineRule="auto"/>
-        <w:ind w:firstLine="709"/>
-        <w:jc w:val="both"/>
-        <w:rPr>
-          <w:rFonts w:eastAsia="Arial"/>
-          <w:bCs/>
-        </w:rPr>
-      </w:pPr>
-    </w:p>
-    <w:tbl>
-      <w:tblPr>
-        <w:tblW w:w="9340" w:type="dxa"/>
-        <w:tblCellMar>
-          <w:left w:w="70" w:type="dxa"/>
-          <w:right w:w="70" w:type="dxa"/>
-        </w:tblCellMar>
-        <w:tblLook w:val="04A0" w:firstRow="1" w:lastRow="0" w:firstColumn="1" w:lastColumn="0" w:noHBand="0" w:noVBand="1"/>
-      </w:tblPr>
-      <w:tblGrid>
-        <w:gridCol w:w="2180"/>
-        <w:gridCol w:w="2800"/>
-        <w:gridCol w:w="4360"/>
-      </w:tblGrid>
-      <w:tr>
-        <w:trPr>
-          <w:trHeight w:val="576"/>
-        </w:trPr>
-        <w:tc>
-          <w:tcPr>
-            <w:tcW w:w="2180" w:type="dxa"/>
-            <w:tcBorders>
-              <w:top w:val="single" w:sz="8" w:space="0" w:color="000000"/>
-              <w:left w:val="single" w:sz="8" w:space="0" w:color="000000"/>
-              <w:bottom w:val="single" w:sz="4" w:space="0" w:color="000000"/>
-              <w:right w:val="single" w:sz="4" w:space="0" w:color="000000"/>
-            </w:tcBorders>
-            <w:hideMark/>
-          </w:tcPr>
-          <w:p>
-            <w:pPr>
-              <w:rPr>
-                <w:rFonts w:ascii="Calibri" w:hAnsi="Calibri" w:cs="Calibri"/>
-                <w:b/>
-                <w:bCs/>
-                <w:color w:val="000000"/>
-                <w:sz w:val="22"/>
-                <w:szCs w:val="22"/>
-              </w:rPr>
-            </w:pPr>
-            <w:r>
-              <w:rPr>
-                <w:rFonts w:ascii="Calibri" w:hAnsi="Calibri" w:cs="Calibri"/>
-                <w:b/>
-                <w:bCs/>
-                <w:color w:val="000000"/>
-                <w:sz w:val="22"/>
-                <w:szCs w:val="22"/>
-              </w:rPr>
-              <w:t>Autor(es):</w:t>
-            </w:r>
-          </w:p>
-        </w:tc>
-        <w:tc>
-          <w:tcPr>
-            <w:tcW w:w="2800" w:type="dxa"/>
-            <w:tcBorders>
-              <w:top w:val="single" w:sz="8" w:space="0" w:color="000000"/>
-              <w:left w:val="nil"/>
-              <w:bottom w:val="single" w:sz="4" w:space="0" w:color="000000"/>
-              <w:right w:val="single" w:sz="4" w:space="0" w:color="000000"/>
-            </w:tcBorders>
-            <w:hideMark/>
-          </w:tcPr>
-          <w:p>
-            <w:pPr>
-              <w:rPr>
-                <w:rFonts w:ascii="Calibri" w:hAnsi="Calibri" w:cs="Calibri"/>
-                <w:b/>
-                <w:bCs/>
-                <w:color w:val="000000"/>
-                <w:sz w:val="22"/>
-                <w:szCs w:val="22"/>
-              </w:rPr>
-            </w:pPr>
-            <w:r>
-              <w:rPr>
-                <w:rFonts w:ascii="Calibri" w:hAnsi="Calibri" w:cs="Calibri"/>
-                <w:b/>
-                <w:bCs/>
-                <w:color w:val="000000"/>
-                <w:sz w:val="22"/>
-                <w:szCs w:val="22"/>
-              </w:rPr>
-              <w:t>Tema:</w:t>
-            </w:r>
-          </w:p>
-        </w:tc>
-        <w:tc>
-          <w:tcPr>
-            <w:tcW w:w="4360" w:type="dxa"/>
-            <w:tcBorders>
-              <w:top w:val="single" w:sz="8" w:space="0" w:color="000000"/>
-              <w:left w:val="nil"/>
-              <w:bottom w:val="single" w:sz="4" w:space="0" w:color="000000"/>
-              <w:right w:val="single" w:sz="8" w:space="0" w:color="000000"/>
-            </w:tcBorders>
-            <w:hideMark/>
-          </w:tcPr>
-          <w:p>
-            <w:pPr>
-              <w:rPr>
-                <w:rFonts w:ascii="Calibri" w:hAnsi="Calibri" w:cs="Calibri"/>
-                <w:b/>
-                <w:bCs/>
-                <w:color w:val="000000"/>
-                <w:sz w:val="22"/>
-                <w:szCs w:val="22"/>
-              </w:rPr>
-            </w:pPr>
-            <w:r>
-              <w:rPr>
-                <w:rFonts w:ascii="Calibri" w:hAnsi="Calibri" w:cs="Calibri"/>
-                <w:b/>
-                <w:bCs/>
-                <w:color w:val="000000"/>
-                <w:sz w:val="22"/>
-                <w:szCs w:val="22"/>
-              </w:rPr>
-              <w:t>Definições:</w:t>
-            </w:r>
-          </w:p>
-        </w:tc>
-      </w:tr>
-      <w:tr>
-        <w:trPr>
-          <w:trHeight w:val="1728"/>
-        </w:trPr>
-        <w:tc>
-          <w:tcPr>
-            <w:tcW w:w="2180" w:type="dxa"/>
-            <w:tcBorders>
-              <w:top w:val="nil"/>
-              <w:left w:val="single" w:sz="8" w:space="0" w:color="000000"/>
-              <w:bottom w:val="single" w:sz="4" w:space="0" w:color="000000"/>
-              <w:right w:val="single" w:sz="4" w:space="0" w:color="000000"/>
-            </w:tcBorders>
-            <w:hideMark/>
-          </w:tcPr>
-          <w:p>
-            <w:pPr>
-              <w:rPr>
-                <w:rFonts w:ascii="Calibri" w:hAnsi="Calibri" w:cs="Calibri"/>
-                <w:color w:val="000000"/>
-                <w:sz w:val="22"/>
-                <w:szCs w:val="22"/>
-              </w:rPr>
-            </w:pPr>
-            <w:r>
-              <w:rPr>
-                <w:rFonts w:ascii="Calibri" w:hAnsi="Calibri" w:cs="Calibri"/>
-                <w:color w:val="000000"/>
-                <w:sz w:val="22"/>
-                <w:szCs w:val="22"/>
-              </w:rPr>
-              <w:t>(CONARD et al., 2009)</w:t>
-            </w:r>
-          </w:p>
-        </w:tc>
-        <w:tc>
-          <w:tcPr>
-            <w:tcW w:w="2800" w:type="dxa"/>
-            <w:tcBorders>
-              <w:top w:val="nil"/>
-              <w:left w:val="nil"/>
-              <w:bottom w:val="single" w:sz="4" w:space="0" w:color="000000"/>
-              <w:right w:val="single" w:sz="4" w:space="0" w:color="000000"/>
-            </w:tcBorders>
-            <w:hideMark/>
-          </w:tcPr>
-          <w:p>
-            <w:pPr>
-              <w:rPr>
-                <w:rFonts w:ascii="Calibri" w:hAnsi="Calibri" w:cs="Calibri"/>
-                <w:color w:val="000000"/>
-                <w:sz w:val="22"/>
-                <w:szCs w:val="22"/>
-              </w:rPr>
-            </w:pPr>
-            <w:r>
-              <w:rPr>
-                <w:rFonts w:ascii="Calibri" w:hAnsi="Calibri" w:cs="Calibri"/>
-                <w:color w:val="000000"/>
-                <w:sz w:val="22"/>
-                <w:szCs w:val="22"/>
-              </w:rPr>
-              <w:t>Origem da Música</w:t>
-            </w:r>
-          </w:p>
-        </w:tc>
-        <w:tc>
-          <w:tcPr>
-            <w:tcW w:w="4360" w:type="dxa"/>
-            <w:tcBorders>
-              <w:top w:val="nil"/>
-              <w:left w:val="nil"/>
-              <w:bottom w:val="single" w:sz="4" w:space="0" w:color="000000"/>
-              <w:right w:val="single" w:sz="8" w:space="0" w:color="000000"/>
-            </w:tcBorders>
-            <w:hideMark/>
-          </w:tcPr>
-          <w:p>
-            <w:pPr>
-              <w:rPr>
-                <w:rFonts w:ascii="Calibri" w:hAnsi="Calibri" w:cs="Calibri"/>
-                <w:color w:val="000000"/>
-                <w:sz w:val="22"/>
-                <w:szCs w:val="22"/>
-              </w:rPr>
-            </w:pPr>
-            <w:r>
-              <w:rPr>
-                <w:rFonts w:ascii="Calibri" w:hAnsi="Calibri" w:cs="Calibri"/>
-                <w:color w:val="000000"/>
-                <w:sz w:val="22"/>
-                <w:szCs w:val="22"/>
-              </w:rPr>
-              <w:t>Descobertas arqueológicas revelam que os primeiros instrumentos musicais conhecidos, como flautas, datam de cerca de 40 mil anos atrás, indicando uma tradição musical desenvolvida no Paleolítico Superior na Europa.</w:t>
-            </w:r>
-          </w:p>
-        </w:tc>
-      </w:tr>
-      <w:tr>
-        <w:trPr>
-          <w:trHeight w:val="2016"/>
-        </w:trPr>
-        <w:tc>
-          <w:tcPr>
-            <w:tcW w:w="2180" w:type="dxa"/>
-            <w:tcBorders>
-              <w:top w:val="nil"/>
-              <w:left w:val="single" w:sz="8" w:space="0" w:color="000000"/>
-              <w:bottom w:val="single" w:sz="4" w:space="0" w:color="000000"/>
-              <w:right w:val="single" w:sz="4" w:space="0" w:color="000000"/>
-            </w:tcBorders>
-            <w:hideMark/>
-          </w:tcPr>
-          <w:p>
-            <w:pPr>
-              <w:rPr>
-                <w:rFonts w:ascii="Calibri" w:hAnsi="Calibri" w:cs="Calibri"/>
-                <w:color w:val="000000"/>
-                <w:sz w:val="22"/>
-                <w:szCs w:val="22"/>
-              </w:rPr>
-            </w:pPr>
-            <w:r>
-              <w:rPr>
-                <w:rFonts w:ascii="Calibri" w:hAnsi="Calibri" w:cs="Calibri"/>
-                <w:color w:val="000000"/>
-                <w:sz w:val="22"/>
-                <w:szCs w:val="22"/>
-              </w:rPr>
-              <w:t>(BARKER, 1989)</w:t>
-            </w:r>
-          </w:p>
-        </w:tc>
-        <w:tc>
-          <w:tcPr>
-            <w:tcW w:w="2800" w:type="dxa"/>
-            <w:tcBorders>
-              <w:top w:val="nil"/>
-              <w:left w:val="nil"/>
-              <w:bottom w:val="single" w:sz="4" w:space="0" w:color="000000"/>
-              <w:right w:val="single" w:sz="4" w:space="0" w:color="000000"/>
-            </w:tcBorders>
-            <w:hideMark/>
-          </w:tcPr>
-          <w:p>
-            <w:pPr>
-              <w:rPr>
-                <w:rFonts w:ascii="Calibri" w:hAnsi="Calibri" w:cs="Calibri"/>
-                <w:color w:val="000000"/>
-                <w:sz w:val="22"/>
-                <w:szCs w:val="22"/>
-              </w:rPr>
-            </w:pPr>
-            <w:r>
-              <w:rPr>
-                <w:rFonts w:ascii="Calibri" w:hAnsi="Calibri" w:cs="Calibri"/>
-                <w:color w:val="000000"/>
-                <w:sz w:val="22"/>
-                <w:szCs w:val="22"/>
-              </w:rPr>
-              <w:t>Teoria Musical Grega</w:t>
-            </w:r>
-          </w:p>
-        </w:tc>
-        <w:tc>
-          <w:tcPr>
-            <w:tcW w:w="4360" w:type="dxa"/>
-            <w:tcBorders>
-              <w:top w:val="nil"/>
-              <w:left w:val="nil"/>
-              <w:bottom w:val="single" w:sz="4" w:space="0" w:color="000000"/>
-              <w:right w:val="single" w:sz="8" w:space="0" w:color="000000"/>
-            </w:tcBorders>
-            <w:hideMark/>
-          </w:tcPr>
-          <w:p>
-            <w:pPr>
-              <w:rPr>
-                <w:rFonts w:ascii="Calibri" w:hAnsi="Calibri" w:cs="Calibri"/>
-                <w:color w:val="000000"/>
-                <w:sz w:val="22"/>
-                <w:szCs w:val="22"/>
-              </w:rPr>
-            </w:pPr>
-            <w:r>
-              <w:rPr>
-                <w:rFonts w:ascii="Calibri" w:hAnsi="Calibri" w:cs="Calibri"/>
-                <w:color w:val="000000"/>
-                <w:sz w:val="22"/>
-                <w:szCs w:val="22"/>
-              </w:rPr>
-              <w:t>A teoria musical da Grécia Antiga abordava princípios harmônicos e acústicos, estabelecendo fundamentos para a compreensão da música ocidental através de escritos filosóficos e matemáticos.</w:t>
-            </w:r>
-          </w:p>
-        </w:tc>
-      </w:tr>
-      <w:tr>
-        <w:trPr>
-          <w:trHeight w:val="1452"/>
-        </w:trPr>
-        <w:tc>
-          <w:tcPr>
-            <w:tcW w:w="2180" w:type="dxa"/>
-            <w:tcBorders>
-              <w:top w:val="nil"/>
-              <w:left w:val="single" w:sz="8" w:space="0" w:color="000000"/>
-              <w:bottom w:val="single" w:sz="4" w:space="0" w:color="000000"/>
-              <w:right w:val="single" w:sz="4" w:space="0" w:color="000000"/>
-            </w:tcBorders>
-            <w:hideMark/>
-          </w:tcPr>
-          <w:p>
-            <w:pPr>
-              <w:rPr>
-                <w:rFonts w:ascii="Calibri" w:hAnsi="Calibri" w:cs="Calibri"/>
-                <w:color w:val="000000"/>
-                <w:sz w:val="22"/>
-                <w:szCs w:val="22"/>
-              </w:rPr>
-            </w:pPr>
-            <w:r>
-              <w:rPr>
-                <w:rFonts w:ascii="Calibri" w:hAnsi="Calibri" w:cs="Calibri"/>
-                <w:color w:val="000000"/>
-                <w:sz w:val="22"/>
-                <w:szCs w:val="22"/>
-              </w:rPr>
-              <w:t>(BURKHOLDER; GROUT; PALISCA, 2009)</w:t>
-            </w:r>
-          </w:p>
-        </w:tc>
-        <w:tc>
-          <w:tcPr>
-            <w:tcW w:w="2800" w:type="dxa"/>
-            <w:tcBorders>
-              <w:top w:val="nil"/>
-              <w:left w:val="nil"/>
-              <w:bottom w:val="single" w:sz="4" w:space="0" w:color="000000"/>
-              <w:right w:val="single" w:sz="4" w:space="0" w:color="000000"/>
-            </w:tcBorders>
-            <w:hideMark/>
-          </w:tcPr>
-          <w:p>
-            <w:pPr>
-              <w:rPr>
-                <w:rFonts w:ascii="Calibri" w:hAnsi="Calibri" w:cs="Calibri"/>
-                <w:color w:val="000000"/>
-                <w:sz w:val="22"/>
-                <w:szCs w:val="22"/>
-              </w:rPr>
-            </w:pPr>
-            <w:r>
-              <w:rPr>
-                <w:rFonts w:ascii="Calibri" w:hAnsi="Calibri" w:cs="Calibri"/>
-                <w:color w:val="000000"/>
-                <w:sz w:val="22"/>
-                <w:szCs w:val="22"/>
-              </w:rPr>
-              <w:t>História da Música Ocidental</w:t>
-            </w:r>
-          </w:p>
-        </w:tc>
-        <w:tc>
-          <w:tcPr>
-            <w:tcW w:w="4360" w:type="dxa"/>
-            <w:tcBorders>
-              <w:top w:val="nil"/>
-              <w:left w:val="nil"/>
-              <w:bottom w:val="single" w:sz="4" w:space="0" w:color="000000"/>
-              <w:right w:val="single" w:sz="8" w:space="0" w:color="000000"/>
-            </w:tcBorders>
-            <w:hideMark/>
-          </w:tcPr>
-          <w:p>
-            <w:pPr>
-              <w:rPr>
-                <w:rFonts w:ascii="Calibri" w:hAnsi="Calibri" w:cs="Calibri"/>
-                <w:color w:val="000000"/>
-                <w:sz w:val="22"/>
-                <w:szCs w:val="22"/>
-              </w:rPr>
-            </w:pPr>
-            <w:r>
-              <w:rPr>
-                <w:rFonts w:ascii="Calibri" w:hAnsi="Calibri" w:cs="Calibri"/>
-                <w:color w:val="000000"/>
-                <w:sz w:val="22"/>
-                <w:szCs w:val="22"/>
-              </w:rPr>
-              <w:t>A história da música ocidental traça o desenvolvimento da música erudita desde a Antiguidade até os tempos modernos, enfatizando estilos, gêneros e contextos culturais.</w:t>
-            </w:r>
-          </w:p>
-        </w:tc>
-      </w:tr>
-      <w:tr>
-        <w:trPr>
-          <w:trHeight w:val="1440"/>
-        </w:trPr>
-        <w:tc>
-          <w:tcPr>
-            <w:tcW w:w="2180" w:type="dxa"/>
-            <w:tcBorders>
-              <w:top w:val="nil"/>
-              <w:left w:val="single" w:sz="8" w:space="0" w:color="000000"/>
-              <w:bottom w:val="single" w:sz="4" w:space="0" w:color="000000"/>
-              <w:right w:val="single" w:sz="4" w:space="0" w:color="000000"/>
-            </w:tcBorders>
-            <w:hideMark/>
-          </w:tcPr>
-          <w:p>
-            <w:pPr>
-              <w:rPr>
-                <w:rFonts w:ascii="Calibri" w:hAnsi="Calibri" w:cs="Calibri"/>
-                <w:color w:val="000000"/>
-                <w:sz w:val="22"/>
-                <w:szCs w:val="22"/>
-              </w:rPr>
-            </w:pPr>
-            <w:r>
-              <w:rPr>
-                <w:rFonts w:ascii="Calibri" w:hAnsi="Calibri" w:cs="Calibri"/>
-                <w:color w:val="000000"/>
-                <w:sz w:val="22"/>
-                <w:szCs w:val="22"/>
-              </w:rPr>
-              <w:t>(ROSS, 2007)</w:t>
-            </w:r>
-          </w:p>
-        </w:tc>
-        <w:tc>
-          <w:tcPr>
-            <w:tcW w:w="2800" w:type="dxa"/>
-            <w:tcBorders>
-              <w:top w:val="nil"/>
-              <w:left w:val="nil"/>
-              <w:bottom w:val="single" w:sz="4" w:space="0" w:color="000000"/>
-              <w:right w:val="single" w:sz="4" w:space="0" w:color="000000"/>
-            </w:tcBorders>
-            <w:hideMark/>
-          </w:tcPr>
-          <w:p>
-            <w:pPr>
-              <w:rPr>
-                <w:rFonts w:ascii="Calibri" w:hAnsi="Calibri" w:cs="Calibri"/>
-                <w:color w:val="000000"/>
-                <w:sz w:val="22"/>
-                <w:szCs w:val="22"/>
-              </w:rPr>
-            </w:pPr>
-            <w:r>
-              <w:rPr>
-                <w:rFonts w:ascii="Calibri" w:hAnsi="Calibri" w:cs="Calibri"/>
-                <w:color w:val="000000"/>
-                <w:sz w:val="22"/>
-                <w:szCs w:val="22"/>
-              </w:rPr>
-              <w:t>Música no Século XX</w:t>
-            </w:r>
-          </w:p>
-        </w:tc>
-        <w:tc>
-          <w:tcPr>
-            <w:tcW w:w="4360" w:type="dxa"/>
-            <w:tcBorders>
-              <w:top w:val="nil"/>
-              <w:left w:val="nil"/>
-              <w:bottom w:val="single" w:sz="4" w:space="0" w:color="000000"/>
-              <w:right w:val="single" w:sz="8" w:space="0" w:color="000000"/>
-            </w:tcBorders>
-            <w:hideMark/>
-          </w:tcPr>
-          <w:p>
-            <w:pPr>
-              <w:rPr>
-                <w:rFonts w:ascii="Calibri" w:hAnsi="Calibri" w:cs="Calibri"/>
-                <w:color w:val="000000"/>
-                <w:sz w:val="22"/>
-                <w:szCs w:val="22"/>
-              </w:rPr>
-            </w:pPr>
-            <w:r>
-              <w:rPr>
-                <w:rFonts w:ascii="Calibri" w:hAnsi="Calibri" w:cs="Calibri"/>
-                <w:color w:val="000000"/>
-                <w:sz w:val="22"/>
-                <w:szCs w:val="22"/>
-              </w:rPr>
-              <w:t>O século XX foi marcado por intensa transformação na música, com rupturas estéticas, inovações tecnológicas e experimentações sonoras que refletiram os contextos sociais e políticos do período.</w:t>
-            </w:r>
-          </w:p>
-        </w:tc>
-      </w:tr>
-      <w:tr>
-        <w:trPr>
-          <w:trHeight w:val="2304"/>
-        </w:trPr>
-        <w:tc>
-          <w:tcPr>
-            <w:tcW w:w="2180" w:type="dxa"/>
-            <w:tcBorders>
-              <w:top w:val="nil"/>
-              <w:left w:val="single" w:sz="8" w:space="0" w:color="000000"/>
-              <w:bottom w:val="single" w:sz="4" w:space="0" w:color="000000"/>
-              <w:right w:val="single" w:sz="4" w:space="0" w:color="000000"/>
-            </w:tcBorders>
-            <w:hideMark/>
-          </w:tcPr>
-          <w:p>
-            <w:pPr>
-              <w:rPr>
-                <w:rFonts w:ascii="Calibri" w:hAnsi="Calibri" w:cs="Calibri"/>
-                <w:color w:val="000000"/>
-                <w:sz w:val="22"/>
-                <w:szCs w:val="22"/>
-              </w:rPr>
-            </w:pPr>
-            <w:r>
-              <w:rPr>
-                <w:rFonts w:ascii="Calibri" w:hAnsi="Calibri" w:cs="Calibri"/>
-                <w:color w:val="000000"/>
-                <w:sz w:val="22"/>
-                <w:szCs w:val="22"/>
-              </w:rPr>
-              <w:lastRenderedPageBreak/>
-              <w:t>(CASTRO et al., 2020)</w:t>
-            </w:r>
-          </w:p>
-        </w:tc>
-        <w:tc>
-          <w:tcPr>
-            <w:tcW w:w="2800" w:type="dxa"/>
-            <w:tcBorders>
-              <w:top w:val="nil"/>
-              <w:left w:val="nil"/>
-              <w:bottom w:val="single" w:sz="4" w:space="0" w:color="000000"/>
-              <w:right w:val="single" w:sz="4" w:space="0" w:color="000000"/>
-            </w:tcBorders>
-            <w:hideMark/>
-          </w:tcPr>
-          <w:p>
-            <w:pPr>
-              <w:rPr>
-                <w:rFonts w:ascii="Calibri" w:hAnsi="Calibri" w:cs="Calibri"/>
-                <w:color w:val="000000"/>
-                <w:sz w:val="22"/>
-                <w:szCs w:val="22"/>
-              </w:rPr>
-            </w:pPr>
-            <w:r>
-              <w:rPr>
-                <w:rFonts w:ascii="Calibri" w:hAnsi="Calibri" w:cs="Calibri"/>
-                <w:color w:val="000000"/>
-                <w:sz w:val="22"/>
-                <w:szCs w:val="22"/>
-              </w:rPr>
-              <w:t>Direito Autoral e Inteligência Artificial</w:t>
-            </w:r>
-          </w:p>
-        </w:tc>
-        <w:tc>
-          <w:tcPr>
-            <w:tcW w:w="4360" w:type="dxa"/>
-            <w:tcBorders>
-              <w:top w:val="nil"/>
-              <w:left w:val="nil"/>
-              <w:bottom w:val="single" w:sz="4" w:space="0" w:color="000000"/>
-              <w:right w:val="single" w:sz="8" w:space="0" w:color="000000"/>
-            </w:tcBorders>
-            <w:hideMark/>
-          </w:tcPr>
-          <w:p>
-            <w:pPr>
-              <w:rPr>
-                <w:rFonts w:ascii="Calibri" w:hAnsi="Calibri" w:cs="Calibri"/>
-                <w:color w:val="000000"/>
-                <w:sz w:val="22"/>
-                <w:szCs w:val="22"/>
-              </w:rPr>
-            </w:pPr>
-            <w:r>
-              <w:rPr>
-                <w:rFonts w:ascii="Calibri" w:hAnsi="Calibri" w:cs="Calibri"/>
-                <w:color w:val="000000"/>
-                <w:sz w:val="22"/>
-                <w:szCs w:val="22"/>
-              </w:rPr>
-              <w:t xml:space="preserve">O artigo discute a ausência de amparo legal no Brasil para a proteção de obras criadas por sistemas de </w:t>
-            </w:r>
-            <w:proofErr w:type="gramStart"/>
-            <w:r>
-              <w:rPr>
-                <w:rFonts w:ascii="Calibri" w:hAnsi="Calibri" w:cs="Calibri"/>
-                <w:color w:val="000000"/>
-                <w:sz w:val="22"/>
-                <w:szCs w:val="22"/>
-              </w:rPr>
-              <w:t>IA, destacando</w:t>
-            </w:r>
-            <w:proofErr w:type="gramEnd"/>
-            <w:r>
-              <w:rPr>
-                <w:rFonts w:ascii="Calibri" w:hAnsi="Calibri" w:cs="Calibri"/>
-                <w:color w:val="000000"/>
-                <w:sz w:val="22"/>
-                <w:szCs w:val="22"/>
-              </w:rPr>
-              <w:t xml:space="preserve"> que, embora tais criações possam possuir originalidade e fixação, carecem de autoria humana, requisito essencial para a proteção autoral vigente. Assim, qualquer proteção legal exigiria alteração na legislação atual.</w:t>
-            </w:r>
-          </w:p>
-        </w:tc>
-      </w:tr>
-      <w:tr>
-        <w:trPr>
-          <w:trHeight w:val="2592"/>
-        </w:trPr>
-        <w:tc>
-          <w:tcPr>
-            <w:tcW w:w="2180" w:type="dxa"/>
-            <w:tcBorders>
-              <w:top w:val="nil"/>
-              <w:left w:val="single" w:sz="8" w:space="0" w:color="000000"/>
-              <w:bottom w:val="single" w:sz="4" w:space="0" w:color="000000"/>
-              <w:right w:val="single" w:sz="4" w:space="0" w:color="000000"/>
-            </w:tcBorders>
-            <w:hideMark/>
-          </w:tcPr>
-          <w:p>
-            <w:pPr>
-              <w:rPr>
-                <w:rFonts w:ascii="Calibri" w:hAnsi="Calibri" w:cs="Calibri"/>
-                <w:color w:val="000000"/>
-                <w:sz w:val="22"/>
-                <w:szCs w:val="22"/>
-              </w:rPr>
-            </w:pPr>
-            <w:r>
-              <w:rPr>
-                <w:rFonts w:ascii="Calibri" w:hAnsi="Calibri" w:cs="Calibri"/>
-                <w:color w:val="000000"/>
-                <w:sz w:val="22"/>
-                <w:szCs w:val="22"/>
-              </w:rPr>
-              <w:t>(BRAVO FUENTES, 2023)</w:t>
-            </w:r>
-          </w:p>
-        </w:tc>
-        <w:tc>
-          <w:tcPr>
-            <w:tcW w:w="2800" w:type="dxa"/>
-            <w:tcBorders>
-              <w:top w:val="nil"/>
-              <w:left w:val="nil"/>
-              <w:bottom w:val="single" w:sz="4" w:space="0" w:color="000000"/>
-              <w:right w:val="single" w:sz="4" w:space="0" w:color="000000"/>
-            </w:tcBorders>
-            <w:hideMark/>
-          </w:tcPr>
-          <w:p>
-            <w:pPr>
-              <w:rPr>
-                <w:rFonts w:ascii="Calibri" w:hAnsi="Calibri" w:cs="Calibri"/>
-                <w:color w:val="000000"/>
-                <w:sz w:val="22"/>
-                <w:szCs w:val="22"/>
-              </w:rPr>
-            </w:pPr>
-            <w:r>
-              <w:rPr>
-                <w:rFonts w:ascii="Calibri" w:hAnsi="Calibri" w:cs="Calibri"/>
-                <w:color w:val="000000"/>
-                <w:sz w:val="22"/>
-                <w:szCs w:val="22"/>
-              </w:rPr>
-              <w:t xml:space="preserve">Inteligência Artificial </w:t>
-            </w:r>
-            <w:proofErr w:type="spellStart"/>
-            <w:r>
-              <w:rPr>
-                <w:rFonts w:ascii="Calibri" w:hAnsi="Calibri" w:cs="Calibri"/>
-                <w:color w:val="000000"/>
-                <w:sz w:val="22"/>
-                <w:szCs w:val="22"/>
-              </w:rPr>
-              <w:t>vs</w:t>
-            </w:r>
-            <w:proofErr w:type="spellEnd"/>
-            <w:r>
-              <w:rPr>
-                <w:rFonts w:ascii="Calibri" w:hAnsi="Calibri" w:cs="Calibri"/>
-                <w:color w:val="000000"/>
-                <w:sz w:val="22"/>
-                <w:szCs w:val="22"/>
-              </w:rPr>
-              <w:t xml:space="preserve"> Criatividade Musical</w:t>
-            </w:r>
-          </w:p>
-        </w:tc>
-        <w:tc>
-          <w:tcPr>
-            <w:tcW w:w="4360" w:type="dxa"/>
-            <w:tcBorders>
-              <w:top w:val="nil"/>
-              <w:left w:val="nil"/>
-              <w:bottom w:val="single" w:sz="4" w:space="0" w:color="000000"/>
-              <w:right w:val="single" w:sz="8" w:space="0" w:color="000000"/>
-            </w:tcBorders>
-            <w:hideMark/>
-          </w:tcPr>
-          <w:p>
-            <w:pPr>
-              <w:rPr>
-                <w:rFonts w:ascii="Calibri" w:hAnsi="Calibri" w:cs="Calibri"/>
-                <w:color w:val="000000"/>
-                <w:sz w:val="22"/>
-                <w:szCs w:val="22"/>
-              </w:rPr>
-            </w:pPr>
-            <w:r>
-              <w:rPr>
-                <w:rFonts w:ascii="Calibri" w:hAnsi="Calibri" w:cs="Calibri"/>
-                <w:color w:val="000000"/>
-                <w:sz w:val="22"/>
-                <w:szCs w:val="22"/>
-              </w:rPr>
-              <w:t>A pesquisa analisa se a IA substitui ou complementa a criatividade musical humana. Conclui que, apesar de a IA simular processos criativos e gerar obras musicais, sua atuação é limitada à replicação de padrões, exigindo sempre intervenção e julgamento humanos. Defende a IA como ferramenta colaborativa, ressaltando a importância de um marco ético para seu uso no campo artístico.</w:t>
-            </w:r>
-          </w:p>
-        </w:tc>
-      </w:tr>
-      <w:tr>
-        <w:trPr>
-          <w:trHeight w:val="2304"/>
-        </w:trPr>
-        <w:tc>
-          <w:tcPr>
-            <w:tcW w:w="2180" w:type="dxa"/>
-            <w:tcBorders>
-              <w:top w:val="nil"/>
-              <w:left w:val="single" w:sz="8" w:space="0" w:color="000000"/>
-              <w:bottom w:val="single" w:sz="4" w:space="0" w:color="000000"/>
-              <w:right w:val="single" w:sz="4" w:space="0" w:color="000000"/>
-            </w:tcBorders>
-            <w:hideMark/>
-          </w:tcPr>
-          <w:p>
-            <w:pPr>
-              <w:rPr>
-                <w:rFonts w:ascii="Calibri" w:hAnsi="Calibri" w:cs="Calibri"/>
-                <w:color w:val="000000"/>
-                <w:sz w:val="22"/>
-                <w:szCs w:val="22"/>
-              </w:rPr>
-            </w:pPr>
-            <w:r>
-              <w:rPr>
-                <w:rFonts w:ascii="Calibri" w:hAnsi="Calibri" w:cs="Calibri"/>
-                <w:color w:val="000000"/>
-                <w:sz w:val="22"/>
-                <w:szCs w:val="22"/>
-              </w:rPr>
-              <w:t xml:space="preserve">(APOLO VALDIVIA, 2022) </w:t>
-            </w:r>
-          </w:p>
-        </w:tc>
-        <w:tc>
-          <w:tcPr>
-            <w:tcW w:w="2800" w:type="dxa"/>
-            <w:tcBorders>
-              <w:top w:val="nil"/>
-              <w:left w:val="nil"/>
-              <w:bottom w:val="single" w:sz="4" w:space="0" w:color="000000"/>
-              <w:right w:val="single" w:sz="4" w:space="0" w:color="000000"/>
-            </w:tcBorders>
-            <w:hideMark/>
-          </w:tcPr>
-          <w:p>
-            <w:pPr>
-              <w:rPr>
-                <w:rFonts w:ascii="Calibri" w:hAnsi="Calibri" w:cs="Calibri"/>
-                <w:color w:val="000000"/>
-                <w:sz w:val="22"/>
-                <w:szCs w:val="22"/>
-              </w:rPr>
-            </w:pPr>
-            <w:r>
-              <w:rPr>
-                <w:rFonts w:ascii="Calibri" w:hAnsi="Calibri" w:cs="Calibri"/>
-                <w:color w:val="000000"/>
-                <w:sz w:val="22"/>
-                <w:szCs w:val="22"/>
-              </w:rPr>
-              <w:t>Futuro da Indústria Musical e Inteligência Artificial</w:t>
-            </w:r>
-          </w:p>
-        </w:tc>
-        <w:tc>
-          <w:tcPr>
-            <w:tcW w:w="4360" w:type="dxa"/>
-            <w:tcBorders>
-              <w:top w:val="nil"/>
-              <w:left w:val="nil"/>
-              <w:bottom w:val="single" w:sz="4" w:space="0" w:color="000000"/>
-              <w:right w:val="single" w:sz="8" w:space="0" w:color="000000"/>
-            </w:tcBorders>
-            <w:hideMark/>
-          </w:tcPr>
-          <w:p>
-            <w:pPr>
-              <w:rPr>
-                <w:rFonts w:ascii="Calibri" w:hAnsi="Calibri" w:cs="Calibri"/>
-                <w:color w:val="000000"/>
-                <w:sz w:val="22"/>
-                <w:szCs w:val="22"/>
-              </w:rPr>
-            </w:pPr>
-            <w:r>
-              <w:rPr>
-                <w:rFonts w:ascii="Calibri" w:hAnsi="Calibri" w:cs="Calibri"/>
-                <w:color w:val="000000"/>
-                <w:sz w:val="22"/>
-                <w:szCs w:val="22"/>
-              </w:rPr>
-              <w:t xml:space="preserve">O estudo traça a evolução da música assistida por </w:t>
-            </w:r>
-            <w:proofErr w:type="gramStart"/>
-            <w:r>
-              <w:rPr>
-                <w:rFonts w:ascii="Calibri" w:hAnsi="Calibri" w:cs="Calibri"/>
-                <w:color w:val="000000"/>
-                <w:sz w:val="22"/>
-                <w:szCs w:val="22"/>
-              </w:rPr>
-              <w:t>IA, explorando</w:t>
-            </w:r>
-            <w:proofErr w:type="gramEnd"/>
-            <w:r>
-              <w:rPr>
-                <w:rFonts w:ascii="Calibri" w:hAnsi="Calibri" w:cs="Calibri"/>
-                <w:color w:val="000000"/>
-                <w:sz w:val="22"/>
-                <w:szCs w:val="22"/>
-              </w:rPr>
-              <w:t xml:space="preserve"> conceitos como música generativa e procedural. Analisa exemplos como as produções de </w:t>
-            </w:r>
-            <w:proofErr w:type="spellStart"/>
-            <w:r>
-              <w:rPr>
-                <w:rFonts w:ascii="Calibri" w:hAnsi="Calibri" w:cs="Calibri"/>
-                <w:color w:val="000000"/>
-                <w:sz w:val="22"/>
-                <w:szCs w:val="22"/>
-              </w:rPr>
-              <w:t>Massive</w:t>
-            </w:r>
-            <w:proofErr w:type="spellEnd"/>
-            <w:r>
-              <w:rPr>
-                <w:rFonts w:ascii="Calibri" w:hAnsi="Calibri" w:cs="Calibri"/>
-                <w:color w:val="000000"/>
-                <w:sz w:val="22"/>
-                <w:szCs w:val="22"/>
-              </w:rPr>
-              <w:t xml:space="preserve"> </w:t>
-            </w:r>
-            <w:proofErr w:type="spellStart"/>
-            <w:r>
-              <w:rPr>
-                <w:rFonts w:ascii="Calibri" w:hAnsi="Calibri" w:cs="Calibri"/>
-                <w:color w:val="000000"/>
-                <w:sz w:val="22"/>
-                <w:szCs w:val="22"/>
-              </w:rPr>
-              <w:t>Attack</w:t>
-            </w:r>
-            <w:proofErr w:type="spellEnd"/>
-            <w:r>
-              <w:rPr>
-                <w:rFonts w:ascii="Calibri" w:hAnsi="Calibri" w:cs="Calibri"/>
-                <w:color w:val="000000"/>
-                <w:sz w:val="22"/>
-                <w:szCs w:val="22"/>
-              </w:rPr>
-              <w:t xml:space="preserve"> e </w:t>
-            </w:r>
-            <w:proofErr w:type="spellStart"/>
-            <w:r>
-              <w:rPr>
-                <w:rFonts w:ascii="Calibri" w:hAnsi="Calibri" w:cs="Calibri"/>
-                <w:color w:val="000000"/>
-                <w:sz w:val="22"/>
-                <w:szCs w:val="22"/>
-              </w:rPr>
-              <w:t>Björk</w:t>
-            </w:r>
-            <w:proofErr w:type="spellEnd"/>
-            <w:r>
-              <w:rPr>
-                <w:rFonts w:ascii="Calibri" w:hAnsi="Calibri" w:cs="Calibri"/>
-                <w:color w:val="000000"/>
-                <w:sz w:val="22"/>
-                <w:szCs w:val="22"/>
-              </w:rPr>
-              <w:t>, demonstrando como a IA está reformulando práticas de criação e consumo musical, transformando o papel do artista e do ouvinte na era digital.</w:t>
-            </w:r>
-          </w:p>
-        </w:tc>
-      </w:tr>
-      <w:tr>
-        <w:trPr>
-          <w:trHeight w:val="2304"/>
-        </w:trPr>
-        <w:tc>
-          <w:tcPr>
-            <w:tcW w:w="2180" w:type="dxa"/>
-            <w:tcBorders>
-              <w:top w:val="nil"/>
-              <w:left w:val="single" w:sz="8" w:space="0" w:color="000000"/>
-              <w:bottom w:val="single" w:sz="4" w:space="0" w:color="000000"/>
-              <w:right w:val="single" w:sz="4" w:space="0" w:color="000000"/>
-            </w:tcBorders>
-            <w:hideMark/>
-          </w:tcPr>
-          <w:p>
-            <w:pPr>
-              <w:rPr>
-                <w:rFonts w:ascii="Calibri" w:hAnsi="Calibri" w:cs="Calibri"/>
-                <w:color w:val="000000"/>
-                <w:sz w:val="22"/>
-                <w:szCs w:val="22"/>
-              </w:rPr>
-            </w:pPr>
-            <w:r>
-              <w:rPr>
-                <w:rFonts w:ascii="Calibri" w:hAnsi="Calibri" w:cs="Calibri"/>
-                <w:color w:val="000000"/>
-                <w:sz w:val="22"/>
-                <w:szCs w:val="22"/>
-              </w:rPr>
-              <w:t>(HERREMANS; CHUAN; CHEW, 2017)</w:t>
-            </w:r>
-          </w:p>
-        </w:tc>
-        <w:tc>
-          <w:tcPr>
-            <w:tcW w:w="2800" w:type="dxa"/>
-            <w:tcBorders>
-              <w:top w:val="nil"/>
-              <w:left w:val="nil"/>
-              <w:bottom w:val="single" w:sz="4" w:space="0" w:color="000000"/>
-              <w:right w:val="single" w:sz="4" w:space="0" w:color="000000"/>
-            </w:tcBorders>
-            <w:hideMark/>
-          </w:tcPr>
-          <w:p>
-            <w:pPr>
-              <w:rPr>
-                <w:rFonts w:ascii="Calibri" w:hAnsi="Calibri" w:cs="Calibri"/>
-                <w:color w:val="000000"/>
-                <w:sz w:val="22"/>
-                <w:szCs w:val="22"/>
-              </w:rPr>
-            </w:pPr>
-            <w:r>
-              <w:rPr>
-                <w:rFonts w:ascii="Calibri" w:hAnsi="Calibri" w:cs="Calibri"/>
-                <w:color w:val="000000"/>
-                <w:sz w:val="22"/>
-                <w:szCs w:val="22"/>
-              </w:rPr>
-              <w:t>Taxonomia Funcional de Sistemas de Geração Musical</w:t>
-            </w:r>
-          </w:p>
-        </w:tc>
-        <w:tc>
-          <w:tcPr>
-            <w:tcW w:w="4360" w:type="dxa"/>
-            <w:tcBorders>
-              <w:top w:val="nil"/>
-              <w:left w:val="nil"/>
-              <w:bottom w:val="single" w:sz="4" w:space="0" w:color="000000"/>
-              <w:right w:val="single" w:sz="8" w:space="0" w:color="000000"/>
-            </w:tcBorders>
-            <w:hideMark/>
-          </w:tcPr>
-          <w:p>
-            <w:pPr>
-              <w:rPr>
-                <w:rFonts w:ascii="Calibri" w:hAnsi="Calibri" w:cs="Calibri"/>
-                <w:color w:val="000000"/>
-                <w:sz w:val="22"/>
-                <w:szCs w:val="22"/>
-              </w:rPr>
-            </w:pPr>
-            <w:r>
-              <w:rPr>
-                <w:rFonts w:ascii="Calibri" w:hAnsi="Calibri" w:cs="Calibri"/>
-                <w:color w:val="000000"/>
-                <w:sz w:val="22"/>
-                <w:szCs w:val="22"/>
-              </w:rPr>
-              <w:t>O artigo propõe uma taxonomia funcional para sistemas de geração automática de música, organizando-os conforme suas finalidades — como melodia, harmonia, ritmo e timbre — e destaca os desafios de avaliar a criatividade e eficácia desses sistemas, além da necessidade de equilibrar similaridade estilística com originalidade.</w:t>
-            </w:r>
-          </w:p>
-        </w:tc>
-      </w:tr>
-      <w:tr>
-        <w:trPr>
-          <w:trHeight w:val="2016"/>
-        </w:trPr>
-        <w:tc>
-          <w:tcPr>
-            <w:tcW w:w="2180" w:type="dxa"/>
-            <w:tcBorders>
-              <w:top w:val="nil"/>
-              <w:left w:val="single" w:sz="8" w:space="0" w:color="000000"/>
-              <w:bottom w:val="single" w:sz="4" w:space="0" w:color="000000"/>
-              <w:right w:val="single" w:sz="4" w:space="0" w:color="000000"/>
-            </w:tcBorders>
-            <w:hideMark/>
-          </w:tcPr>
-          <w:p>
-            <w:pPr>
-              <w:rPr>
-                <w:rFonts w:ascii="Calibri" w:hAnsi="Calibri" w:cs="Calibri"/>
-                <w:color w:val="000000"/>
-                <w:sz w:val="22"/>
-                <w:szCs w:val="22"/>
-              </w:rPr>
-            </w:pPr>
-            <w:r>
-              <w:rPr>
-                <w:rFonts w:ascii="Calibri" w:hAnsi="Calibri" w:cs="Calibri"/>
-                <w:color w:val="000000"/>
-                <w:sz w:val="22"/>
-                <w:szCs w:val="22"/>
-              </w:rPr>
-              <w:t>(SANTOS, 2019)</w:t>
-            </w:r>
-          </w:p>
-        </w:tc>
-        <w:tc>
-          <w:tcPr>
-            <w:tcW w:w="2800" w:type="dxa"/>
-            <w:tcBorders>
-              <w:top w:val="nil"/>
-              <w:left w:val="nil"/>
-              <w:bottom w:val="single" w:sz="4" w:space="0" w:color="000000"/>
-              <w:right w:val="single" w:sz="4" w:space="0" w:color="000000"/>
-            </w:tcBorders>
-            <w:hideMark/>
-          </w:tcPr>
-          <w:p>
-            <w:pPr>
-              <w:rPr>
-                <w:rFonts w:ascii="Calibri" w:hAnsi="Calibri" w:cs="Calibri"/>
-                <w:color w:val="000000"/>
-                <w:sz w:val="22"/>
-                <w:szCs w:val="22"/>
-              </w:rPr>
-            </w:pPr>
-            <w:r>
-              <w:rPr>
-                <w:rFonts w:ascii="Calibri" w:hAnsi="Calibri" w:cs="Calibri"/>
-                <w:color w:val="000000"/>
-                <w:sz w:val="22"/>
-                <w:szCs w:val="22"/>
-              </w:rPr>
-              <w:t>Inteligência Artificial, Algoritmos e Mercado Musical</w:t>
-            </w:r>
-          </w:p>
-        </w:tc>
-        <w:tc>
-          <w:tcPr>
-            <w:tcW w:w="4360" w:type="dxa"/>
-            <w:tcBorders>
-              <w:top w:val="nil"/>
-              <w:left w:val="nil"/>
-              <w:bottom w:val="single" w:sz="4" w:space="0" w:color="000000"/>
-              <w:right w:val="single" w:sz="8" w:space="0" w:color="000000"/>
-            </w:tcBorders>
-            <w:hideMark/>
-          </w:tcPr>
-          <w:p>
-            <w:pPr>
-              <w:rPr>
-                <w:rFonts w:ascii="Calibri" w:hAnsi="Calibri" w:cs="Calibri"/>
-                <w:color w:val="000000"/>
-                <w:sz w:val="22"/>
-                <w:szCs w:val="22"/>
-              </w:rPr>
-            </w:pPr>
-            <w:r>
-              <w:rPr>
-                <w:rFonts w:ascii="Calibri" w:hAnsi="Calibri" w:cs="Calibri"/>
-                <w:color w:val="000000"/>
-                <w:sz w:val="22"/>
-                <w:szCs w:val="22"/>
-              </w:rPr>
-              <w:t>A dissertação explora como IA, machine learning e algoritmos estão moldando o mercado da música, desde a criação até a distribuição, destacando o impacto dessas tecnologias sobre a profissão de compositor, a previsão de hits e a redefinição da cadeia de valor da indústria fonográfica.</w:t>
-            </w:r>
-          </w:p>
-        </w:tc>
-      </w:tr>
-      <w:tr>
-        <w:trPr>
-          <w:trHeight w:val="2028"/>
-        </w:trPr>
-        <w:tc>
-          <w:tcPr>
-            <w:tcW w:w="2180" w:type="dxa"/>
-            <w:tcBorders>
-              <w:top w:val="nil"/>
-              <w:left w:val="single" w:sz="8" w:space="0" w:color="000000"/>
-              <w:bottom w:val="single" w:sz="8" w:space="0" w:color="auto"/>
-              <w:right w:val="single" w:sz="4" w:space="0" w:color="000000"/>
-            </w:tcBorders>
-            <w:hideMark/>
-          </w:tcPr>
-          <w:p>
-            <w:pPr>
-              <w:rPr>
-                <w:rFonts w:ascii="Calibri" w:hAnsi="Calibri" w:cs="Calibri"/>
-                <w:color w:val="000000"/>
-                <w:sz w:val="22"/>
-                <w:szCs w:val="22"/>
-              </w:rPr>
-            </w:pPr>
-            <w:r>
-              <w:rPr>
-                <w:rFonts w:ascii="Calibri" w:hAnsi="Calibri" w:cs="Calibri"/>
-                <w:color w:val="000000"/>
-                <w:sz w:val="22"/>
-                <w:szCs w:val="22"/>
-              </w:rPr>
-              <w:lastRenderedPageBreak/>
-              <w:t>(SILVA, 2023)</w:t>
-            </w:r>
-          </w:p>
-        </w:tc>
-        <w:tc>
-          <w:tcPr>
-            <w:tcW w:w="2800" w:type="dxa"/>
-            <w:tcBorders>
-              <w:top w:val="nil"/>
-              <w:left w:val="nil"/>
-              <w:bottom w:val="single" w:sz="8" w:space="0" w:color="auto"/>
-              <w:right w:val="single" w:sz="4" w:space="0" w:color="000000"/>
-            </w:tcBorders>
-            <w:hideMark/>
-          </w:tcPr>
-          <w:p>
-            <w:pPr>
-              <w:rPr>
-                <w:rFonts w:ascii="Calibri" w:hAnsi="Calibri" w:cs="Calibri"/>
-                <w:color w:val="000000"/>
-                <w:sz w:val="22"/>
-                <w:szCs w:val="22"/>
-              </w:rPr>
-            </w:pPr>
-            <w:r>
-              <w:rPr>
-                <w:rFonts w:ascii="Calibri" w:hAnsi="Calibri" w:cs="Calibri"/>
-                <w:color w:val="000000"/>
-                <w:sz w:val="22"/>
-                <w:szCs w:val="22"/>
-              </w:rPr>
-              <w:t>Composição Musical com IA</w:t>
-            </w:r>
-          </w:p>
-        </w:tc>
-        <w:tc>
-          <w:tcPr>
-            <w:tcW w:w="4360" w:type="dxa"/>
-            <w:tcBorders>
-              <w:top w:val="nil"/>
-              <w:left w:val="nil"/>
-              <w:bottom w:val="single" w:sz="8" w:space="0" w:color="auto"/>
-              <w:right w:val="single" w:sz="8" w:space="0" w:color="000000"/>
-            </w:tcBorders>
-            <w:hideMark/>
-          </w:tcPr>
-          <w:p>
-            <w:pPr>
-              <w:rPr>
-                <w:rFonts w:ascii="Calibri" w:hAnsi="Calibri" w:cs="Calibri"/>
-                <w:color w:val="000000"/>
-                <w:sz w:val="22"/>
-                <w:szCs w:val="22"/>
-              </w:rPr>
-            </w:pPr>
-            <w:r>
-              <w:rPr>
-                <w:rFonts w:ascii="Calibri" w:hAnsi="Calibri" w:cs="Calibri"/>
-                <w:color w:val="000000"/>
-                <w:sz w:val="22"/>
-                <w:szCs w:val="22"/>
-              </w:rPr>
-              <w:t>O trabalho analisa a capacidade de ferramentas de IA em compor música a partir dos mesmos parâmetros utilizados por humanos, refletindo sobre os limites atuais dessas tecnologias, os desafios de qualidade artística e suas aplicações na educação musical e nos debates sobre ética e direitos autorais.</w:t>
-            </w:r>
-          </w:p>
-        </w:tc>
-      </w:tr>
-    </w:tbl>
-    <w:p>
-      <w:pPr>
-        <w:spacing w:line="480" w:lineRule="auto"/>
-        <w:jc w:val="center"/>
-        <w:rPr>
-          <w:i/>
-          <w:iCs/>
-          <w:sz w:val="20"/>
-          <w:szCs w:val="20"/>
-        </w:rPr>
-      </w:pPr>
-      <w:r>
-        <w:rPr>
-          <w:i/>
-          <w:iCs/>
-          <w:sz w:val="20"/>
-          <w:szCs w:val="20"/>
-        </w:rPr>
-        <w:t>Tabela 1 – Referencial Teórico</w:t>
-      </w:r>
-    </w:p>
-    <w:p>
-      <w:pPr>
-        <w:spacing w:line="480" w:lineRule="auto"/>
-        <w:jc w:val="both"/>
-        <w:rPr>
-          <w:rFonts w:ascii="Arial" w:eastAsia="Arial" w:hAnsi="Arial" w:cs="Arial"/>
-          <w:b/>
-          <w:sz w:val="28"/>
-          <w:szCs w:val="28"/>
-        </w:rPr>
-      </w:pPr>
-    </w:p>
-    <w:p>
-      <w:pPr>
-        <w:spacing w:line="480" w:lineRule="auto"/>
-        <w:jc w:val="both"/>
-        <w:rPr>
-          <w:rFonts w:ascii="Arial" w:eastAsia="Arial" w:hAnsi="Arial" w:cs="Arial"/>
-          <w:b/>
-          <w:sz w:val="28"/>
-          <w:szCs w:val="28"/>
-        </w:rPr>
-      </w:pPr>
-    </w:p>
-    <w:p>
-      <w:pPr>
-        <w:spacing w:line="480" w:lineRule="auto"/>
-        <w:jc w:val="both"/>
-        <w:rPr>
-          <w:rFonts w:ascii="Arial" w:eastAsia="Arial" w:hAnsi="Arial" w:cs="Arial"/>
-          <w:sz w:val="28"/>
-          <w:szCs w:val="28"/>
-        </w:rPr>
-      </w:pPr>
-      <w:r>
-        <w:rPr>
-          <w:rFonts w:ascii="Arial" w:eastAsia="Arial" w:hAnsi="Arial" w:cs="Arial"/>
-          <w:b/>
-          <w:sz w:val="28"/>
-          <w:szCs w:val="28"/>
-        </w:rPr>
-        <w:t>4</w:t>
-      </w:r>
-      <w:r>
-        <w:rPr>
-          <w:rFonts w:ascii="Arial" w:eastAsia="Arial" w:hAnsi="Arial" w:cs="Arial"/>
-          <w:b/>
-          <w:sz w:val="28"/>
-          <w:szCs w:val="28"/>
-        </w:rPr>
-        <w:t xml:space="preserve"> - METODOLOGIA                  </w:t>
+        <w:pStyle w:val="Ttulo"/>
+      </w:pPr>
+      <w:r>
+        <w:t>3</w:t>
+      </w:r>
+      <w:r>
+        <w:t xml:space="preserve"> - METODOLOGIA</w:t>
       </w:r>
     </w:p>
     <w:p>
@@ -2813,7 +1382,7 @@
           <w:b/>
           <w:bCs/>
         </w:rPr>
-        <w:t>4</w:t>
+        <w:t>3</w:t>
       </w:r>
       <w:r>
         <w:rPr>
@@ -2848,35 +1417,35 @@
       </w:r>
       <w:proofErr w:type="spellEnd"/>
       <w:r>
-        <w:t xml:space="preserve"> para obtenção das credenciais de autenticação. O motor da pesquisa foi construído em linguagem </w:t>
+        <w:t xml:space="preserve"> para obtenção das credenciais de autenticação. O motor da pesquisa foi construído em linguagem Python, utilizando a biblioteca </w:t>
+      </w:r>
+      <w:proofErr w:type="spellStart"/>
+      <w:r>
+        <w:t>Spotipy</w:t>
+      </w:r>
+      <w:proofErr w:type="spellEnd"/>
+      <w:r>
+        <w:t xml:space="preserve"> como interface para as chamadas à API (</w:t>
+      </w:r>
+      <w:proofErr w:type="spellStart"/>
+      <w:r>
+        <w:t>Application</w:t>
+      </w:r>
+      <w:proofErr w:type="spellEnd"/>
+      <w:r>
+        <w:t xml:space="preserve"> </w:t>
+      </w:r>
+      <w:proofErr w:type="spellStart"/>
+      <w:r>
+        <w:t>Programming</w:t>
+      </w:r>
+      <w:proofErr w:type="spellEnd"/>
+      <w:r>
+        <w:t xml:space="preserve"> Interface) do serviço. Os códigos desenvolvidos foram responsáveis por automatizar a extração de metadados das faixas e a construção das bibliotecas personalizadas (playlists), </w:t>
       </w:r>
       <w:r>
         <w:lastRenderedPageBreak/>
-        <w:t xml:space="preserve">Python, utilizando a biblioteca </w:t>
-      </w:r>
-      <w:proofErr w:type="spellStart"/>
-      <w:r>
-        <w:t>Spotipy</w:t>
-      </w:r>
-      <w:proofErr w:type="spellEnd"/>
-      <w:r>
-        <w:t xml:space="preserve"> como interface para as chamadas à API (</w:t>
-      </w:r>
-      <w:proofErr w:type="spellStart"/>
-      <w:r>
-        <w:t>Application</w:t>
-      </w:r>
-      <w:proofErr w:type="spellEnd"/>
-      <w:r>
-        <w:t xml:space="preserve"> </w:t>
-      </w:r>
-      <w:proofErr w:type="spellStart"/>
-      <w:r>
-        <w:t>Programming</w:t>
-      </w:r>
-      <w:proofErr w:type="spellEnd"/>
-      <w:r>
-        <w:t xml:space="preserve"> Interface) do serviço. Os códigos desenvolvidos foram responsáveis por automatizar a extração de metadados das faixas e a construção das bibliotecas personalizadas (playlists), garantindo que a base de dados musical de cada persona fosse estruturada de forma isolada e sistemática.</w:t>
+        <w:t>garantindo que a base de dados musical de cada persona fosse estruturada de forma isolada e sistemática.</w:t>
       </w:r>
     </w:p>
     <w:p>
@@ -2931,7 +1500,7 @@
           <w:b/>
           <w:bCs/>
         </w:rPr>
-        <w:t>4</w:t>
+        <w:t>3</w:t>
       </w:r>
       <w:r>
         <w:rPr>
@@ -3020,8 +1589,14 @@
           <w:b/>
           <w:bCs/>
         </w:rPr>
-        <w:lastRenderedPageBreak/>
-        <w:t xml:space="preserve">4.2.1 Beatriz (A Consumidora </w:t>
+        <w:t>3</w:t>
+      </w:r>
+      <w:r>
+        <w:rPr>
+          <w:b/>
+          <w:bCs/>
+        </w:rPr>
+        <w:t xml:space="preserve">.2.1 Beatriz (A Consumidora </w:t>
       </w:r>
       <w:proofErr w:type="spellStart"/>
       <w:r>
@@ -3057,7 +1632,11 @@
         <w:t xml:space="preserve"> </w:t>
       </w:r>
       <w:r>
-        <w:t xml:space="preserve">Bia é uma verdadeira nativa digital; ela não se lembra de um mundo sem internet ou smartphones. Nascida em Uberlândia, sua infância foi marcada pelo YouTube, e sua adolescência, pelo auge do Instagram e a explosão do TikTok. A música, para ela, nunca veio do rádio, mas sim dos </w:t>
+        <w:t xml:space="preserve">Bia é uma verdadeira nativa digital; ela não se lembra de um mundo sem internet ou smartphones. Nascida em Uberlândia, sua infância foi marcada pelo YouTube, e </w:t>
+      </w:r>
+      <w:r>
+        <w:lastRenderedPageBreak/>
+        <w:t xml:space="preserve">sua adolescência, pelo auge do Instagram e a explosão do TikTok. A música, para ela, nunca veio do rádio, mas sim dos </w:t>
       </w:r>
       <w:proofErr w:type="spellStart"/>
       <w:r>
@@ -3134,10 +1713,6 @@
         <w:t>Validação Quantitativa do Input (Linha de Base):</w:t>
       </w:r>
       <w:r>
-        <w:rPr>
-          <w:b/>
-          <w:bCs/>
-        </w:rPr>
         <w:t xml:space="preserve"> </w:t>
       </w:r>
       <w:r>
@@ -3163,7 +1738,27 @@
         <w:jc w:val="both"/>
       </w:pPr>
       <w:r>
-        <w:t xml:space="preserve">O caráter de "validação social" desta persona é reforçado pelas métricas de alcance econômico. A Média de Seguidores dos artistas selecionados ultrapassa 8 milhões, acumulando um alcance total superior a 1.6 bilhão de seguidores somados. A diversidade aparente de gêneros (HHI 0.08) revela-se, na prática, uma concentração temática em estilos de apelo massivo no Brasil: o Sertanejo e suas vertentes (Universitário, </w:t>
+        <w:t xml:space="preserve">Em termos estruturais, a playlist reflete o formato radiofônico padrão, com uma Duração Média das Músicas de 3:20, alinhada com as produções comerciais otimizadas para </w:t>
+      </w:r>
+      <w:r>
+        <w:rPr>
+          <w:i/>
+          <w:iCs/>
+        </w:rPr>
+        <w:t>streaming</w:t>
+      </w:r>
+      <w:r>
+        <w:t xml:space="preserve"> e engajamento rápido. O caráter de "validação social" desta persona é reforçado pelas métricas de alcance econômico: a Média de Seguidores dos artistas selecionados ultrapassa 8 milhões, acumulando um alcance total superior a 1.6 bilhão de seguidores somados.</w:t>
+      </w:r>
+    </w:p>
+    <w:p>
+      <w:pPr>
+        <w:spacing w:line="360" w:lineRule="auto"/>
+        <w:ind w:firstLine="720"/>
+        <w:jc w:val="both"/>
+      </w:pPr>
+      <w:r>
+        <w:t xml:space="preserve">A diversidade aparente de gêneros (HHI 0.08) revela-se, na prática, uma concentração temática em estilos de apelo massivo no Brasil: o Sertanejo e suas vertentes (Universitário, </w:t>
       </w:r>
       <w:proofErr w:type="spellStart"/>
       <w:r>
@@ -3175,12 +1770,41 @@
       </w:r>
       <w:proofErr w:type="spellStart"/>
       <w:r>
+        <w:rPr>
+          <w:i/>
+          <w:iCs/>
+        </w:rPr>
         <w:t>charts</w:t>
       </w:r>
       <w:proofErr w:type="spellEnd"/>
       <w:r>
-        <w:t xml:space="preserve"> nacionais atuais.</w:t>
-      </w:r>
+        <w:t xml:space="preserve"> nacionais atuais. </w:t>
+      </w:r>
+      <w:r>
+        <w:lastRenderedPageBreak/>
+        <w:t xml:space="preserve">A dispersão de artistas (94 únicos, média de 2.13 músicas por artista) confirma um comportamento de escuta passiva, focado em </w:t>
+      </w:r>
+      <w:r>
+        <w:rPr>
+          <w:i/>
+          <w:iCs/>
+        </w:rPr>
+        <w:t>hits</w:t>
+      </w:r>
+      <w:r>
+        <w:t xml:space="preserve"> diversos em vez de discografias profundas.</w:t>
+      </w:r>
+    </w:p>
+    <w:p>
+      <w:pPr>
+        <w:spacing w:line="360" w:lineRule="auto"/>
+        <w:ind w:firstLine="720"/>
+        <w:jc w:val="both"/>
+        <w:rPr>
+          <w:b/>
+          <w:bCs/>
+        </w:rPr>
+      </w:pPr>
     </w:p>
     <w:tbl>
       <w:tblPr>
@@ -3212,7 +1836,6 @@
                 <w:b/>
                 <w:bCs/>
               </w:rPr>
-              <w:lastRenderedPageBreak/>
               <w:t>Indicador</w:t>
             </w:r>
           </w:p>
@@ -3555,6 +2178,160 @@
           </w:p>
         </w:tc>
       </w:tr>
+      <w:tr>
+        <w:tc>
+          <w:tcPr>
+            <w:tcW w:w="3131" w:type="dxa"/>
+          </w:tcPr>
+          <w:p>
+            <w:pPr>
+              <w:spacing w:line="360" w:lineRule="auto"/>
+              <w:jc w:val="both"/>
+            </w:pPr>
+            <w:r>
+              <w:t>Estrutura (Duração)</w:t>
+            </w:r>
+          </w:p>
+        </w:tc>
+        <w:tc>
+          <w:tcPr>
+            <w:tcW w:w="3132" w:type="dxa"/>
+          </w:tcPr>
+          <w:p>
+            <w:pPr>
+              <w:spacing w:line="360" w:lineRule="auto"/>
+              <w:jc w:val="both"/>
+            </w:pPr>
+            <w:r>
+              <w:t>Média 03:20</w:t>
+            </w:r>
+          </w:p>
+        </w:tc>
+        <w:tc>
+          <w:tcPr>
+            <w:tcW w:w="3132" w:type="dxa"/>
+          </w:tcPr>
+          <w:p>
+            <w:pPr>
+              <w:spacing w:line="360" w:lineRule="auto"/>
+              <w:jc w:val="both"/>
+            </w:pPr>
+            <w:r>
+              <w:t>Adesão ao Formato Radiofônico (</w:t>
+            </w:r>
+            <w:r>
+              <w:rPr>
+                <w:i/>
+                <w:iCs/>
+              </w:rPr>
+              <w:t xml:space="preserve">Radio </w:t>
+            </w:r>
+            <w:proofErr w:type="spellStart"/>
+            <w:r>
+              <w:rPr>
+                <w:i/>
+                <w:iCs/>
+              </w:rPr>
+              <w:t>Edit</w:t>
+            </w:r>
+            <w:proofErr w:type="spellEnd"/>
+            <w:r>
+              <w:t xml:space="preserve">); preferência por estruturas </w:t>
+            </w:r>
+            <w:r>
+              <w:lastRenderedPageBreak/>
+              <w:t xml:space="preserve">concisas otimizadas para retenção em </w:t>
+            </w:r>
+            <w:r>
+              <w:rPr>
+                <w:i/>
+                <w:iCs/>
+              </w:rPr>
+              <w:t>streaming</w:t>
+            </w:r>
+            <w:r>
+              <w:t>.</w:t>
+            </w:r>
+          </w:p>
+        </w:tc>
+      </w:tr>
+      <w:tr>
+        <w:tc>
+          <w:tcPr>
+            <w:tcW w:w="3131" w:type="dxa"/>
+          </w:tcPr>
+          <w:p>
+            <w:pPr>
+              <w:spacing w:line="360" w:lineRule="auto"/>
+              <w:jc w:val="both"/>
+            </w:pPr>
+            <w:r>
+              <w:t>Consistência Interna</w:t>
+            </w:r>
+          </w:p>
+        </w:tc>
+        <w:tc>
+          <w:tcPr>
+            <w:tcW w:w="3132" w:type="dxa"/>
+          </w:tcPr>
+          <w:p>
+            <w:pPr>
+              <w:spacing w:line="360" w:lineRule="auto"/>
+              <w:jc w:val="both"/>
+            </w:pPr>
+            <m:oMathPara>
+              <m:oMathParaPr>
+                <m:jc m:val="left"/>
+              </m:oMathParaPr>
+              <m:oMath>
+                <m:r>
+                  <w:rPr>
+                    <w:rFonts w:ascii="Cambria Math" w:hAnsi="Cambria Math"/>
+                  </w:rPr>
+                  <m:t>σ = ± 4.42</m:t>
+                </m:r>
+              </m:oMath>
+            </m:oMathPara>
+          </w:p>
+          <w:p>
+            <w:pPr>
+              <w:spacing w:line="360" w:lineRule="auto"/>
+            </w:pPr>
+          </w:p>
+        </w:tc>
+        <w:tc>
+          <w:tcPr>
+            <w:tcW w:w="3132" w:type="dxa"/>
+          </w:tcPr>
+          <w:p>
+            <w:pPr>
+              <w:spacing w:line="360" w:lineRule="auto"/>
+              <w:jc w:val="both"/>
+            </w:pPr>
+            <w:r>
+              <w:t xml:space="preserve">Baixa Entropia de Popularidade; indica uma seleção altamente homogênea, sem </w:t>
+            </w:r>
+            <w:r>
+              <w:rPr>
+                <w:i/>
+                <w:iCs/>
+              </w:rPr>
+              <w:t>outliers</w:t>
+            </w:r>
+            <w:r>
+              <w:t xml:space="preserve"> ou riscos estatísticos (padrão "</w:t>
+            </w:r>
+            <w:proofErr w:type="spellStart"/>
+            <w:r>
+              <w:t>Hitmaker</w:t>
+            </w:r>
+            <w:proofErr w:type="spellEnd"/>
+            <w:r>
+              <w:t>").</w:t>
+            </w:r>
+          </w:p>
+        </w:tc>
+      </w:tr>
     </w:tbl>
     <w:p>
       <w:pPr>
@@ -3568,6 +2345,191 @@
         <w:spacing w:line="360" w:lineRule="auto"/>
         <w:ind w:firstLine="720"/>
         <w:jc w:val="both"/>
+      </w:pPr>
+      <w:r>
+        <w:t>Imagem dos gráficos:</w:t>
+      </w:r>
+    </w:p>
+    <w:p>
+      <w:pPr>
+        <w:spacing w:line="360" w:lineRule="auto"/>
+      </w:pPr>
+    </w:p>
+    <w:p>
+      <w:pPr>
+        <w:spacing w:line="360" w:lineRule="auto"/>
+        <w:jc w:val="center"/>
+      </w:pPr>
+      <w:r>
+        <w:rPr>
+          <w:noProof/>
+        </w:rPr>
+        <w:drawing>
+          <wp:inline distT="0" distB="0" distL="0" distR="0" wp14:anchorId="3442A017" wp14:editId="46E6C689">
+            <wp:extent cx="5606882" cy="3744686"/>
+            <wp:effectExtent l="0" t="0" r="0" b="8255"/>
+            <wp:docPr id="1131661050" name="Imagem 5"/>
+            <wp:cNvGraphicFramePr>
+              <a:graphicFrameLocks xmlns:a="http://schemas.openxmlformats.org/drawingml/2006/main" noChangeAspect="1"/>
+            </wp:cNvGraphicFramePr>
+            <a:graphic xmlns:a="http://schemas.openxmlformats.org/drawingml/2006/main">
+              <a:graphicData uri="http://schemas.openxmlformats.org/drawingml/2006/picture">
+                <pic:pic xmlns:pic="http://schemas.openxmlformats.org/drawingml/2006/picture">
+                  <pic:nvPicPr>
+                    <pic:cNvPr id="0" name="Picture 5"/>
+                    <pic:cNvPicPr>
+                      <a:picLocks noChangeAspect="1" noChangeArrowheads="1"/>
+                    </pic:cNvPicPr>
+                  </pic:nvPicPr>
+                  <pic:blipFill>
+                    <a:blip r:embed="rId8">
+                      <a:extLst>
+                        <a:ext uri="{28A0092B-C50C-407E-A947-70E740481C1C}">
+                          <a14:useLocalDpi xmlns:a14="http://schemas.microsoft.com/office/drawing/2010/main" val="0"/>
+                        </a:ext>
+                      </a:extLst>
+                    </a:blip>
+                    <a:srcRect/>
+                    <a:stretch>
+                      <a:fillRect/>
+                    </a:stretch>
+                  </pic:blipFill>
+                  <pic:spPr bwMode="auto">
+                    <a:xfrm>
+                      <a:off x="0" y="0"/>
+                      <a:ext cx="5611657" cy="3747875"/>
+                    </a:xfrm>
+                    <a:prstGeom prst="rect">
+                      <a:avLst/>
+                    </a:prstGeom>
+                    <a:noFill/>
+                    <a:ln>
+                      <a:noFill/>
+                    </a:ln>
+                  </pic:spPr>
+                </pic:pic>
+              </a:graphicData>
+            </a:graphic>
+          </wp:inline>
+        </w:drawing>
+      </w:r>
+    </w:p>
+    <w:p>
+      <w:pPr>
+        <w:spacing w:line="360" w:lineRule="auto"/>
+      </w:pPr>
+      <w:r>
+        <w:rPr>
+          <w:noProof/>
+        </w:rPr>
+        <w:lastRenderedPageBreak/>
+        <w:drawing>
+          <wp:inline distT="0" distB="0" distL="0" distR="0" wp14:anchorId="22434B9E" wp14:editId="54093A65">
+            <wp:extent cx="5975985" cy="3581400"/>
+            <wp:effectExtent l="0" t="0" r="5715" b="0"/>
+            <wp:docPr id="1866927633" name="Imagem 6"/>
+            <wp:cNvGraphicFramePr>
+              <a:graphicFrameLocks xmlns:a="http://schemas.openxmlformats.org/drawingml/2006/main" noChangeAspect="1"/>
+            </wp:cNvGraphicFramePr>
+            <a:graphic xmlns:a="http://schemas.openxmlformats.org/drawingml/2006/main">
+              <a:graphicData uri="http://schemas.openxmlformats.org/drawingml/2006/picture">
+                <pic:pic xmlns:pic="http://schemas.openxmlformats.org/drawingml/2006/picture">
+                  <pic:nvPicPr>
+                    <pic:cNvPr id="0" name="Picture 6"/>
+                    <pic:cNvPicPr>
+                      <a:picLocks noChangeAspect="1" noChangeArrowheads="1"/>
+                    </pic:cNvPicPr>
+                  </pic:nvPicPr>
+                  <pic:blipFill>
+                    <a:blip r:embed="rId9">
+                      <a:extLst>
+                        <a:ext uri="{28A0092B-C50C-407E-A947-70E740481C1C}">
+                          <a14:useLocalDpi xmlns:a14="http://schemas.microsoft.com/office/drawing/2010/main" val="0"/>
+                        </a:ext>
+                      </a:extLst>
+                    </a:blip>
+                    <a:srcRect/>
+                    <a:stretch>
+                      <a:fillRect/>
+                    </a:stretch>
+                  </pic:blipFill>
+                  <pic:spPr bwMode="auto">
+                    <a:xfrm>
+                      <a:off x="0" y="0"/>
+                      <a:ext cx="5975985" cy="3581400"/>
+                    </a:xfrm>
+                    <a:prstGeom prst="rect">
+                      <a:avLst/>
+                    </a:prstGeom>
+                    <a:noFill/>
+                    <a:ln>
+                      <a:noFill/>
+                    </a:ln>
+                  </pic:spPr>
+                </pic:pic>
+              </a:graphicData>
+            </a:graphic>
+          </wp:inline>
+        </w:drawing>
+      </w:r>
+      <w:r>
+        <w:rPr>
+          <w:noProof/>
+        </w:rPr>
+        <w:drawing>
+          <wp:inline distT="0" distB="0" distL="0" distR="0" wp14:anchorId="6EC935D6" wp14:editId="23537B2E">
+            <wp:extent cx="5975985" cy="3581400"/>
+            <wp:effectExtent l="0" t="0" r="5715" b="0"/>
+            <wp:docPr id="738500994" name="Imagem 4"/>
+            <wp:cNvGraphicFramePr>
+              <a:graphicFrameLocks xmlns:a="http://schemas.openxmlformats.org/drawingml/2006/main" noChangeAspect="1"/>
+            </wp:cNvGraphicFramePr>
+            <a:graphic xmlns:a="http://schemas.openxmlformats.org/drawingml/2006/main">
+              <a:graphicData uri="http://schemas.openxmlformats.org/drawingml/2006/picture">
+                <pic:pic xmlns:pic="http://schemas.openxmlformats.org/drawingml/2006/picture">
+                  <pic:nvPicPr>
+                    <pic:cNvPr id="0" name="Picture 4"/>
+                    <pic:cNvPicPr>
+                      <a:picLocks noChangeAspect="1" noChangeArrowheads="1"/>
+                    </pic:cNvPicPr>
+                  </pic:nvPicPr>
+                  <pic:blipFill>
+                    <a:blip r:embed="rId10">
+                      <a:extLst>
+                        <a:ext uri="{28A0092B-C50C-407E-A947-70E740481C1C}">
+                          <a14:useLocalDpi xmlns:a14="http://schemas.microsoft.com/office/drawing/2010/main" val="0"/>
+                        </a:ext>
+                      </a:extLst>
+                    </a:blip>
+                    <a:srcRect/>
+                    <a:stretch>
+                      <a:fillRect/>
+                    </a:stretch>
+                  </pic:blipFill>
+                  <pic:spPr bwMode="auto">
+                    <a:xfrm>
+                      <a:off x="0" y="0"/>
+                      <a:ext cx="5975985" cy="3581400"/>
+                    </a:xfrm>
+                    <a:prstGeom prst="rect">
+                      <a:avLst/>
+                    </a:prstGeom>
+                    <a:noFill/>
+                    <a:ln>
+                      <a:noFill/>
+                    </a:ln>
+                  </pic:spPr>
+                </pic:pic>
+              </a:graphicData>
+            </a:graphic>
+          </wp:inline>
+        </w:drawing>
+      </w:r>
+    </w:p>
+    <w:p>
+      <w:pPr>
+        <w:spacing w:line="360" w:lineRule="auto"/>
+        <w:jc w:val="center"/>
       </w:pPr>
     </w:p>
     <w:p>
@@ -3578,6 +2540,167 @@
         <w:spacing w:line="360" w:lineRule="auto"/>
         <w:jc w:val="both"/>
       </w:pPr>
+      <w:r>
+        <w:rPr>
+          <w:noProof/>
+        </w:rPr>
+        <w:lastRenderedPageBreak/>
+        <w:drawing>
+          <wp:inline distT="0" distB="0" distL="0" distR="0" wp14:anchorId="2EC100C9" wp14:editId="02F78636">
+            <wp:extent cx="5975985" cy="3581400"/>
+            <wp:effectExtent l="0" t="0" r="5715" b="0"/>
+            <wp:docPr id="2069603963" name="Imagem 9"/>
+            <wp:cNvGraphicFramePr>
+              <a:graphicFrameLocks xmlns:a="http://schemas.openxmlformats.org/drawingml/2006/main" noChangeAspect="1"/>
+            </wp:cNvGraphicFramePr>
+            <a:graphic xmlns:a="http://schemas.openxmlformats.org/drawingml/2006/main">
+              <a:graphicData uri="http://schemas.openxmlformats.org/drawingml/2006/picture">
+                <pic:pic xmlns:pic="http://schemas.openxmlformats.org/drawingml/2006/picture">
+                  <pic:nvPicPr>
+                    <pic:cNvPr id="0" name="Picture 9"/>
+                    <pic:cNvPicPr>
+                      <a:picLocks noChangeAspect="1" noChangeArrowheads="1"/>
+                    </pic:cNvPicPr>
+                  </pic:nvPicPr>
+                  <pic:blipFill>
+                    <a:blip r:embed="rId11">
+                      <a:extLst>
+                        <a:ext uri="{28A0092B-C50C-407E-A947-70E740481C1C}">
+                          <a14:useLocalDpi xmlns:a14="http://schemas.microsoft.com/office/drawing/2010/main" val="0"/>
+                        </a:ext>
+                      </a:extLst>
+                    </a:blip>
+                    <a:srcRect/>
+                    <a:stretch>
+                      <a:fillRect/>
+                    </a:stretch>
+                  </pic:blipFill>
+                  <pic:spPr bwMode="auto">
+                    <a:xfrm>
+                      <a:off x="0" y="0"/>
+                      <a:ext cx="5975985" cy="3581400"/>
+                    </a:xfrm>
+                    <a:prstGeom prst="rect">
+                      <a:avLst/>
+                    </a:prstGeom>
+                    <a:noFill/>
+                    <a:ln>
+                      <a:noFill/>
+                    </a:ln>
+                  </pic:spPr>
+                </pic:pic>
+              </a:graphicData>
+            </a:graphic>
+          </wp:inline>
+        </w:drawing>
+      </w:r>
+      <w:r>
+        <w:rPr>
+          <w:noProof/>
+        </w:rPr>
+        <w:drawing>
+          <wp:inline distT="0" distB="0" distL="0" distR="0" wp14:anchorId="34DCCBAB" wp14:editId="7D8A64D6">
+            <wp:extent cx="5965190" cy="3983990"/>
+            <wp:effectExtent l="0" t="0" r="0" b="0"/>
+            <wp:docPr id="475411620" name="Imagem 8"/>
+            <wp:cNvGraphicFramePr>
+              <a:graphicFrameLocks xmlns:a="http://schemas.openxmlformats.org/drawingml/2006/main" noChangeAspect="1"/>
+            </wp:cNvGraphicFramePr>
+            <a:graphic xmlns:a="http://schemas.openxmlformats.org/drawingml/2006/main">
+              <a:graphicData uri="http://schemas.openxmlformats.org/drawingml/2006/picture">
+                <pic:pic xmlns:pic="http://schemas.openxmlformats.org/drawingml/2006/picture">
+                  <pic:nvPicPr>
+                    <pic:cNvPr id="0" name="Picture 8"/>
+                    <pic:cNvPicPr>
+                      <a:picLocks noChangeAspect="1" noChangeArrowheads="1"/>
+                    </pic:cNvPicPr>
+                  </pic:nvPicPr>
+                  <pic:blipFill>
+                    <a:blip r:embed="rId12">
+                      <a:extLst>
+                        <a:ext uri="{28A0092B-C50C-407E-A947-70E740481C1C}">
+                          <a14:useLocalDpi xmlns:a14="http://schemas.microsoft.com/office/drawing/2010/main" val="0"/>
+                        </a:ext>
+                      </a:extLst>
+                    </a:blip>
+                    <a:srcRect/>
+                    <a:stretch>
+                      <a:fillRect/>
+                    </a:stretch>
+                  </pic:blipFill>
+                  <pic:spPr bwMode="auto">
+                    <a:xfrm>
+                      <a:off x="0" y="0"/>
+                      <a:ext cx="5965190" cy="3983990"/>
+                    </a:xfrm>
+                    <a:prstGeom prst="rect">
+                      <a:avLst/>
+                    </a:prstGeom>
+                    <a:noFill/>
+                    <a:ln>
+                      <a:noFill/>
+                    </a:ln>
+                  </pic:spPr>
+                </pic:pic>
+              </a:graphicData>
+            </a:graphic>
+          </wp:inline>
+        </w:drawing>
+      </w:r>
+      <w:r>
+        <w:rPr>
+          <w:noProof/>
+        </w:rPr>
+        <w:lastRenderedPageBreak/>
+        <w:drawing>
+          <wp:inline distT="0" distB="0" distL="0" distR="0" wp14:anchorId="144A0F66" wp14:editId="5E3605CB">
+            <wp:extent cx="5965190" cy="3983990"/>
+            <wp:effectExtent l="0" t="0" r="0" b="0"/>
+            <wp:docPr id="1653041568" name="Imagem 7"/>
+            <wp:cNvGraphicFramePr>
+              <a:graphicFrameLocks xmlns:a="http://schemas.openxmlformats.org/drawingml/2006/main" noChangeAspect="1"/>
+            </wp:cNvGraphicFramePr>
+            <a:graphic xmlns:a="http://schemas.openxmlformats.org/drawingml/2006/main">
+              <a:graphicData uri="http://schemas.openxmlformats.org/drawingml/2006/picture">
+                <pic:pic xmlns:pic="http://schemas.openxmlformats.org/drawingml/2006/picture">
+                  <pic:nvPicPr>
+                    <pic:cNvPr id="0" name="Picture 7"/>
+                    <pic:cNvPicPr>
+                      <a:picLocks noChangeAspect="1" noChangeArrowheads="1"/>
+                    </pic:cNvPicPr>
+                  </pic:nvPicPr>
+                  <pic:blipFill>
+                    <a:blip r:embed="rId13">
+                      <a:extLst>
+                        <a:ext uri="{28A0092B-C50C-407E-A947-70E740481C1C}">
+                          <a14:useLocalDpi xmlns:a14="http://schemas.microsoft.com/office/drawing/2010/main" val="0"/>
+                        </a:ext>
+                      </a:extLst>
+                    </a:blip>
+                    <a:srcRect/>
+                    <a:stretch>
+                      <a:fillRect/>
+                    </a:stretch>
+                  </pic:blipFill>
+                  <pic:spPr bwMode="auto">
+                    <a:xfrm>
+                      <a:off x="0" y="0"/>
+                      <a:ext cx="5965190" cy="3983990"/>
+                    </a:xfrm>
+                    <a:prstGeom prst="rect">
+                      <a:avLst/>
+                    </a:prstGeom>
+                    <a:noFill/>
+                    <a:ln>
+                      <a:noFill/>
+                    </a:ln>
+                  </pic:spPr>
+                </pic:pic>
+              </a:graphicData>
+            </a:graphic>
+          </wp:inline>
+        </w:drawing>
+      </w:r>
     </w:p>
     <w:p>
       <w:pPr>
@@ -3592,7 +2715,14 @@
           <w:b/>
           <w:bCs/>
         </w:rPr>
-        <w:t>4.2.</w:t>
+        <w:t>3</w:t>
+      </w:r>
+      <w:r>
+        <w:rPr>
+          <w:b/>
+          <w:bCs/>
+        </w:rPr>
+        <w:t>.2.</w:t>
       </w:r>
       <w:r>
         <w:rPr>
@@ -3635,11 +2765,7 @@
         <w:t>“</w:t>
       </w:r>
       <w:r>
-        <w:t xml:space="preserve">Sempre pragmático e focado, Daniel nunca viu a música como uma parte central de sua identidade. Foi na faculdade de Ciência da Computação que ele descobriu o poder do som como uma ferramenta de produtividade. Ele percebeu que paisagens sonoras instrumentais o ajudavam a </w:t>
-      </w:r>
-      <w:r>
-        <w:lastRenderedPageBreak/>
-        <w:t>programar por horas a fio sem distração. Hoje, aos 2</w:t>
+        <w:t>Sempre pragmático e focado, Daniel nunca viu a música como uma parte central de sua identidade. Foi na faculdade de Ciência da Computação que ele descobriu o poder do som como uma ferramenta de produtividade. Ele percebeu que paisagens sonoras instrumentais o ajudavam a programar por horas a fio sem distração. Hoje, aos 2</w:t>
       </w:r>
       <w:r>
         <w:t>8</w:t>
@@ -3723,7 +2849,14 @@
           <w:b/>
           <w:bCs/>
         </w:rPr>
-        <w:t>4.2.</w:t>
+        <w:t>3</w:t>
+      </w:r>
+      <w:r>
+        <w:rPr>
+          <w:b/>
+          <w:bCs/>
+        </w:rPr>
+        <w:t>.2.</w:t>
       </w:r>
       <w:r>
         <w:rPr>
@@ -3747,6 +2880,7 @@
         <w:jc w:val="both"/>
       </w:pPr>
       <w:r>
+        <w:lastRenderedPageBreak/>
         <w:t>“</w:t>
       </w:r>
       <w:r>
@@ -3810,7 +2944,14 @@
           <w:b/>
           <w:bCs/>
         </w:rPr>
-        <w:t>4.2.</w:t>
+        <w:t>3</w:t>
+      </w:r>
+      <w:r>
+        <w:rPr>
+          <w:b/>
+          <w:bCs/>
+        </w:rPr>
+        <w:t>.2.</w:t>
       </w:r>
       <w:r>
         <w:rPr>
@@ -3834,11 +2975,7 @@
         <w:jc w:val="both"/>
       </w:pPr>
       <w:r>
-        <w:t xml:space="preserve">Sofia cresceu na fronteira entre o mundo físico e o digital. Seus irmãos mais velhos a apresentaram aos clássicos, mas foi na internet, em blogs e fóruns de meados dos anos 2010, que ela forjou sua identidade. Descobrir uma banda que ninguém conhecia se tornou sua paixão e uma forma de se diferenciar. Recém-formada em Design Gráfico, ela vê a música como uma extensão </w:t>
-      </w:r>
-      <w:r>
-        <w:lastRenderedPageBreak/>
-        <w:t>de sua estética pessoal. Sua biblioteca musical é meticulosamente organizada, refletindo seus humores e interesses. Ela valoriza a melancolia poética do indie e busca artistas que transmitam uma sensação de autenticidade e vulnerabilidade. Sofia tem uma relação de amor e receio com as ferramentas de descoberta musical: aprecia a capacidade de garimpar raridades, mas teme o dia em que elas se tornem previsíveis.</w:t>
+        <w:t>Sofia cresceu na fronteira entre o mundo físico e o digital. Seus irmãos mais velhos a apresentaram aos clássicos, mas foi na internet, em blogs e fóruns de meados dos anos 2010, que ela forjou sua identidade. Descobrir uma banda que ninguém conhecia se tornou sua paixão e uma forma de se diferenciar. Recém-formada em Design Gráfico, ela vê a música como uma extensão de sua estética pessoal. Sua biblioteca musical é meticulosamente organizada, refletindo seus humores e interesses. Ela valoriza a melancolia poética do indie e busca artistas que transmitam uma sensação de autenticidade e vulnerabilidade. Sofia tem uma relação de amor e receio com as ferramentas de descoberta musical: aprecia a capacidade de garimpar raridades, mas teme o dia em que elas se tornem previsíveis.</w:t>
       </w:r>
     </w:p>
     <w:p>
@@ -3911,7 +3048,21 @@
           <w:b/>
           <w:bCs/>
         </w:rPr>
-        <w:t>3.4 Recursos e Fontes de Pesquisa</w:t>
+        <w:t>3.</w:t>
+      </w:r>
+      <w:r>
+        <w:rPr>
+          <w:b/>
+          <w:bCs/>
+        </w:rPr>
+        <w:t>3</w:t>
+      </w:r>
+      <w:r>
+        <w:rPr>
+          <w:b/>
+          <w:bCs/>
+        </w:rPr>
+        <w:t xml:space="preserve"> Recursos e Fontes de Pesquisa</w:t>
       </w:r>
     </w:p>
     <w:p>
@@ -3921,6 +3072,7 @@
         <w:jc w:val="both"/>
       </w:pPr>
       <w:r>
+        <w:lastRenderedPageBreak/>
         <w:t>A pesquisa bibliográfica é conduzida de forma crítica e analítica, focando na interseção entre Ciência de Dados e Cultura Digital.</w:t>
       </w:r>
     </w:p>
@@ -4141,7 +3293,6 @@
         <w:rPr>
           <w:rFonts w:ascii="Arial" w:eastAsia="Arial" w:hAnsi="Arial" w:cs="Arial"/>
         </w:rPr>
-        <w:lastRenderedPageBreak/>
         <w:t xml:space="preserve">GIL, </w:t>
       </w:r>
       <w:proofErr w:type="spellStart"/>
@@ -4285,10 +3436,10 @@
       </w:r>
     </w:p>
     <w:sectPr>
-      <w:headerReference w:type="even" r:id="rId8"/>
-      <w:headerReference w:type="default" r:id="rId9"/>
-      <w:footerReference w:type="even" r:id="rId10"/>
-      <w:footerReference w:type="default" r:id="rId11"/>
+      <w:headerReference w:type="even" r:id="rId14"/>
+      <w:headerReference w:type="default" r:id="rId15"/>
+      <w:footerReference w:type="even" r:id="rId16"/>
+      <w:footerReference w:type="default" r:id="rId17"/>
       <w:pgSz w:w="12240" w:h="15840"/>
       <w:pgMar w:top="1701" w:right="1134" w:bottom="1134" w:left="1701" w:header="709" w:footer="709" w:gutter="0"/>
       <w:pgNumType w:start="1"/>
@@ -7889,15 +7040,16 @@
     <w:semiHidden/>
     <w:unhideWhenUsed/>
     <w:qFormat/>
+    <w:rsid w:val="003C1395"/>
     <w:pPr>
       <w:keepNext/>
       <w:keepLines/>
-      <w:spacing w:before="360" w:after="80"/>
+      <w:spacing w:before="80" w:after="360"/>
       <w:outlineLvl w:val="1"/>
     </w:pPr>
     <w:rPr>
+      <w:rFonts w:ascii="Arial" w:hAnsi="Arial"/>
       <w:b/>
-      <w:sz w:val="36"/>
       <w:szCs w:val="36"/>
     </w:rPr>
   </w:style>
@@ -7982,6 +7134,7 @@
   <w:style w:type="character" w:default="1" w:styleId="Fontepargpadro">
     <w:name w:val="Default Paragraph Font"/>
     <w:uiPriority w:val="1"/>
+    <w:semiHidden/>
     <w:unhideWhenUsed/>
   </w:style>
   <w:style w:type="table" w:default="1" w:styleId="Tabelanormal">
@@ -8022,14 +7175,16 @@
     <w:next w:val="Normal"/>
     <w:uiPriority w:val="10"/>
     <w:qFormat/>
+    <w:rsid w:val="003C1395"/>
     <w:pPr>
       <w:keepNext/>
       <w:keepLines/>
-      <w:spacing w:before="480" w:after="120"/>
+      <w:spacing w:before="480" w:after="480"/>
     </w:pPr>
     <w:rPr>
+      <w:rFonts w:ascii="Arial" w:hAnsi="Arial"/>
       <w:b/>
-      <w:sz w:val="72"/>
+      <w:sz w:val="28"/>
       <w:szCs w:val="72"/>
     </w:rPr>
   </w:style>

</xml_diff>